<commit_message>
fix: reconcile simulated sample counts, bootstrap settings, and SEM interpretation
</commit_message>
<xml_diff>
--- a/output/final/chapter4_simulated_full_demo_v2.docx
+++ b/output/final/chapter4_simulated_full_demo_v2.docx
@@ -237,7 +237,24 @@
           <w:rtl/>
           <w:lang w:bidi="fa-IR"/>
         </w:rPr>
-        <w:t xml:space="preserve">جدول ۴-۱ روند غربالگری را در هر مرحله خلاصه می‌کند؛ شمارش‌ها به‌ترتیب اجرای مراحل روی همان صف باقی‌مانده محاسبه شده‌اند و از همین رو با مجموع پرچم‌های خام یک‌به‌یک برابر نیستند، زیرا برخی پاسخ‌دهندگان چند نشانه هم‌زمان داشته‌اند.</w:t>
+        <w:t xml:space="preserve">جدول ۴-۱ روند غربالگری را در هر مرحله خلاصه می‌کند. شمارش‌ها به‌ترتیب اجرای مراحل روی صفِ باقی‌مانده محاسبه شده‌اند؛ در این داده چهار دلیل حذف دقیقاً منفصل‌الوجودند (هر فرد حداکثر یک دلیل) و جمع مراحل ۷ + ۱۴ + ۱۱ + ۹ = ۴۱ است؛ پس از ۲۱۲ پاسخ خام، ۱۷۱ پاسخ معتبر باقی ماند (۸۰٫۷٪) و ۴۱ حذف شد (۱۹٫۳٪).</w:t>
+      </w:r>
+    </w:p>
+    <w:p>
+      <w:pPr>
+        <w:bidi w:val="1"/>
+        <w:spacing w:lineRule="exact" w:line="580" w:after="0"/>
+        <w:jc w:val="both"/>
+      </w:pPr>
+      <w:r>
+        <w:rPr>
+          <w:rFonts w:ascii="B Nazanin" w:hAnsi="B Nazanin" w:cs="B Nazanin" w:hint="cs"/>
+          <w:sz w:val="24"/>
+          <w:szCs w:val="24"/>
+          <w:rtl/>
+          <w:lang w:bidi="fa-IR"/>
+        </w:rPr>
+        <w:t xml:space="preserve">یادداشت روش‌شناختی: در طرح‌های واقعی دلایل حذف می‌توانند هم‌پوشانی داشته باشند (مثلاً فردی هم‌زمان ناقص و سریع است) و در آن حالت جمع شمارشِ دلایل لزوماً برابر تعداد افراد حذف‌شده نیست؛ ترتیب اجرای مراحل تعیین می‌کند هر فرد در کدام سطر جدول شمرده شود. برای شفافیت: در همین جدول، اگر هم‌پوشانی وجود داشت جمع ستون «تعداد» با مجموع حذف‌شدگان نمی‌خواند و این موضوع ذیل جدول ذکر می‌شد؛ در نسخه حاضر راستی‌آزمایی پرچم‌ها نشان داد هم‌پوشانی صفر است.</w:t>
       </w:r>
     </w:p>
     <w:p>
@@ -643,6 +660,65 @@
                 <w:sz w:val="22"/>
               </w:rPr>
               <w:t>تلاش ناکافی</w:t>
+            </w:r>
+          </w:p>
+        </w:tc>
+      </w:tr>
+      <w:tr>
+        <w:tc>
+          <w:tcPr>
+            <w:tcW w:type="dxa" w:w="2740"/>
+          </w:tcPr>
+          <w:p>
+            <w:pPr>
+              <w:bidi w:val="1"/>
+              <w:jc w:val="center"/>
+            </w:pPr>
+            <w:r/>
+            <w:r>
+              <w:rPr>
+                <w:b w:val="0"/>
+                <w:sz w:val="22"/>
+              </w:rPr>
+              <w:t>نمونهٔ نهایی معتبر</w:t>
+            </w:r>
+          </w:p>
+        </w:tc>
+        <w:tc>
+          <w:tcPr>
+            <w:tcW w:type="dxa" w:w="2740"/>
+          </w:tcPr>
+          <w:p>
+            <w:pPr>
+              <w:bidi w:val="1"/>
+              <w:jc w:val="center"/>
+            </w:pPr>
+            <w:r/>
+            <w:r>
+              <w:rPr>
+                <w:b w:val="0"/>
+                <w:sz w:val="22"/>
+              </w:rPr>
+              <w:t>171</w:t>
+            </w:r>
+          </w:p>
+        </w:tc>
+        <w:tc>
+          <w:tcPr>
+            <w:tcW w:type="dxa" w:w="2740"/>
+          </w:tcPr>
+          <w:p>
+            <w:pPr>
+              <w:bidi w:val="1"/>
+              <w:jc w:val="center"/>
+            </w:pPr>
+            <w:r/>
+            <w:r>
+              <w:rPr>
+                <w:b w:val="0"/>
+                <w:sz w:val="22"/>
+              </w:rPr>
+              <w:t>—</w:t>
             </w:r>
           </w:p>
         </w:tc>
@@ -5279,7 +5355,7 @@
           <w:rtl/>
           <w:lang w:bidi="fa-IR"/>
         </w:rPr>
-        <w:t xml:space="preserve">قضاوت شد، زیرا توزیع نمونه‌گیریِ حاصل‌ضرب ضرایب معمولاً نامتقارن است.</w:t>
+        <w:t xml:space="preserve">قضاوت شد، زیرا توزیع نمونه‌گیریِ حاصل‌ضرب ضرایب معمولاً نامتقارن است. تعداد ۵۰۰۰ بازنمونه، همان تنظیم از پیش اعلام‌شده فصل ۳ برای تحلیل اصلی است که در این سند آموزشی نیز عیناً اجرا شده تا هم‌راستایی روش با پروتکل حفظ شود.</w:t>
       </w:r>
     </w:p>
     <w:p>
@@ -6929,6 +7005,61 @@
     </w:tbl>
     <w:p>
       <w:pPr>
+        <w:bidi w:val="1"/>
+        <w:spacing w:lineRule="exact" w:line="580" w:after="0"/>
+        <w:jc w:val="both"/>
+      </w:pPr>
+      <w:r>
+        <w:rPr>
+          <w:rFonts w:ascii="B Nazanin" w:hAnsi="B Nazanin" w:cs="B Nazanin" w:hint="cs"/>
+          <w:sz w:val="24"/>
+          <w:szCs w:val="24"/>
+          <w:rtl/>
+          <w:lang w:bidi="fa-IR"/>
+        </w:rPr>
+        <w:t xml:space="preserve">پیشنهاد برای بررسی در داده واقعی (نه نتیجه قطعی در این سند آموزشی): چون الگوی حاضر بر نمره‌های کلِ مشاهده‌پذیر استوار است و خطای اندازه‌گیری و علت‌مندی در آن مدل‌سازی نشده، در داده واقعی پیشنهاد می‌شود مدل نهفت‌نگار با پارسل‌بندی گویه‌ها (به‌ویژه برای مقیاس ۷۵گویه‌ای طرحواره) در برابر همان الگوی سه‌متغیره و نیز مدل رقیب «اثر مستقیمِ صرف» آزمون شود؛ ممکن است چنین برآوردی</w:t>
+      </w:r>
+      <w:r>
+        <w:rPr>
+          <w:rFonts w:ascii="Times New Roman" w:hAnsi="Times New Roman" w:cs="Times New Roman"/>
+          <w:sz w:val="22"/>
+          <w:szCs w:val="22"/>
+          <w:lang w:val="en-US"/>
+        </w:rPr>
+        <w:t xml:space="preserve"> TLI </w:t>
+      </w:r>
+      <w:r>
+        <w:rPr>
+          <w:rFonts w:ascii="B Nazanin" w:hAnsi="B Nazanin" w:cs="B Nazanin" w:hint="cs"/>
+          <w:sz w:val="24"/>
+          <w:szCs w:val="24"/>
+          <w:rtl/>
+          <w:lang w:bidi="fa-IR"/>
+        </w:rPr>
+        <w:t xml:space="preserve">و</w:t>
+      </w:r>
+      <w:r>
+        <w:rPr>
+          <w:rFonts w:ascii="Times New Roman" w:hAnsi="Times New Roman" w:cs="Times New Roman"/>
+          <w:sz w:val="22"/>
+          <w:szCs w:val="22"/>
+          <w:lang w:val="en-US"/>
+        </w:rPr>
+        <w:t xml:space="preserve"> RMSEA </w:t>
+      </w:r>
+      <w:r>
+        <w:rPr>
+          <w:rFonts w:ascii="B Nazanin" w:hAnsi="B Nazanin" w:cs="B Nazanin" w:hint="cs"/>
+          <w:sz w:val="24"/>
+          <w:szCs w:val="24"/>
+          <w:rtl/>
+          <w:lang w:bidi="fa-IR"/>
+        </w:rPr>
+        <w:t xml:space="preserve">را بدون هیچ دست‌کاری در داده به بازه مطلوب نزدیک کند. در نسخه آموزشی حاضر داده‌ها برای «زیباتر شدن» شاخص‌ها تغییر داده نشده‌اند و همین اعداد گزارش شده‌اند.</w:t>
+      </w:r>
+    </w:p>
+    <w:p>
+      <w:pPr>
         <w:pStyle w:val="Heading2"/>
         <w:bidi w:val="1"/>
         <w:jc w:val="right"/>

</xml_diff>

<commit_message>
fix: clean simulation meta-commentary and correct bidi parentheses in chapter 4
</commit_message>
<xml_diff>
--- a/output/final/chapter4_simulated_full_demo_v2.docx
+++ b/output/final/chapter4_simulated_full_demo_v2.docx
@@ -112,7 +112,7 @@
           <w:rtl/>
           <w:lang w:bidi="fa-IR"/>
         </w:rPr>
-        <w:t xml:space="preserve">مراحل اجرای تحلیل عبارت بودند از: غربالگری داده‌ها و تعیین نمونه معتبر بر اساس معیارهای از پیش ثبت‌شده؛ برآورد آمار توصیفی ویژگی‌های جمعیت‌شناختی و متغیرهای اصلی پژوهش؛ بررسی پایایی ابزارهای اندازه‌گیری با ضریب آلفای کرونباخ؛ ارزیابی پیش‌فرض‌های تحلیل استنباطی شامل نرمال بودن توزیع‌ها، نبود داده‌های پرت چندمتغیره، عدم هم‌خطی و استقلال پسماندها؛ آزمون فرضیه‌های فرعی با ضریب همبستگی پیرسون؛ و در نهایت آزمون فرضیه اصلی با تحلیل میانجی‌گری بر اساس الگوی مدل ۴ هایز</w:t>
+        <w:t xml:space="preserve">مراحل اجرای تحلیل عبارت بودند از: غربالگری داده‌ها و تعیین نمونه معتبر بر اساس معیارهای از پیش ثبت‌شده؛ برآورد آمار توصیفی ویژگی‌های جمعیت‌شناختی و متغیرهای اصلی پژوهش؛ بررسی پایایی ابزارهای اندازه‌گیری با ضریب آلفای کرونباخ؛ ارزیابی پیش‌فرض‌های تحلیل استنباطی شامل نرمال بودن توزیع‌ها، نبود داده‌های پرت چندمتغیره، عدم هم‌خطی و استقلال پسماندها؛ آزمون فرضیه‌های فرعی با ضریب همبستگی پیرسون؛ و در نهایت آزمون فرضیه اصلی با تحلیل میانجی‌گری بر اساس الگوی مدل ۴ هایز </w:t>
       </w:r>
       <w:r>
         <w:rPr>
@@ -121,7 +121,7 @@
           <w:szCs w:val="22"/>
           <w:lang w:val="en-US"/>
         </w:rPr>
-        <w:t xml:space="preserve"> (PROCESS Model 4) </w:t>
+        <w:t xml:space="preserve">(PROCESS Model 4)</w:t>
       </w:r>
       <w:r>
         <w:rPr>
@@ -131,7 +131,7 @@
           <w:rtl/>
           <w:lang w:bidi="fa-IR"/>
         </w:rPr>
-        <w:t xml:space="preserve">همراه با بوت‌استرپ ۵۰۰۰ بازنمونه‌گیری. به‌منظور پشتیابی یافته‌ها، الگوی مسیر به‌روش معادلات ساختاری و با برآورد درست‌نمایی بیشینه نیز برازش داده شد تا همگرایی نتایج در دو چارچوب تحلیلی بررسی شود.</w:t>
+        <w:t xml:space="preserve"> همراه با بوت‌استرپ ۵۰۰۰ بازنمونه‌گیری. به‌منظور پشتیابی یافته‌ها، الگوی مسیر به‌روش معادلات ساختاری و با برآورد درست‌نمایی بیشینه نیز برازش داده شد تا همگرایی نتایج در دو چارچوب تحلیلی بررسی شود.</w:t>
       </w:r>
     </w:p>
     <w:p>
@@ -201,7 +201,7 @@
           <w:rtl/>
           <w:lang w:bidi="fa-IR"/>
         </w:rPr>
-        <w:t xml:space="preserve">در مرحله نخست، پرونده‌هایی که فرم رضایت آگاهانه را تکمیل نکرده یا صریحاً رد کرده بودند حذف شدند؛ کسب رضایت آگاهانه پیش‌شرط اخلاقی و روش‌شناختی ورود هر پرونده به تحلیل است. در مرحله دوم، پرسشنامه‌هایی که بیش از ۳۰٪ گویه‌هایشان بی‌پاسخ مانده بود کنار گذاشته شدند تا برآوردگرها با الگوهای آشفته مقادیر گم‌شده مواجه نشوند. در مرحله سوم، پاسخ‌های با الگوی یکنواخت</w:t>
+        <w:t xml:space="preserve">در مرحله نخست، پرونده‌هایی که فرم رضایت آگاهانه را تکمیل نکرده یا صریحاً رد کرده بودند حذف شدند؛ کسب رضایت آگاهانه پیش‌شرط اخلاقی و روش‌شناختی ورود هر پرونده به تحلیل است. در مرحله دوم، پرسشنامه‌هایی که بیش از ۳۰٪ گویه‌هایشان بی‌پاسخ مانده بود کنار گذاشته شدند تا برآوردگرها با الگوهای آشفته مقادیر گم‌شده مواجه نشوند. در مرحله سوم، پاسخ‌های با الگوی یکنواخت </w:t>
       </w:r>
       <w:r>
         <w:rPr>
@@ -210,7 +210,7 @@
           <w:szCs w:val="22"/>
           <w:lang w:val="en-US"/>
         </w:rPr>
-        <w:t xml:space="preserve"> (Straight-lining) </w:t>
+        <w:t xml:space="preserve">(Straight-lining)</w:t>
       </w:r>
       <w:r>
         <w:rPr>
@@ -220,7 +220,7 @@
           <w:rtl/>
           <w:lang w:bidi="fa-IR"/>
         </w:rPr>
-        <w:t xml:space="preserve">شناسایی و حذف شدند؛ در این موارد، پاسخ‌دهنده در مقیاس‌های چندگویه‌ای عملاً واریانسی نشان نداده و به همه گویه‌ها گزینه‌ای تکراری داده بود. در مرحله چهارم، پاسخ‌هایی که زمان تکمیلشان کمتر از ۱۲۰ ثانیه بود حذف شدند؛ زمانی که برای خواندن و پاسخ‌دادن به ۱۰۸ گویه عملاً کافی نیست و نشانه تلاش ناکافی است.</w:t>
+        <w:t xml:space="preserve"> شناسایی و حذف شدند؛ در این موارد، پاسخ‌دهنده در مقیاس‌های چندگویه‌ای عملاً واریانسی نشان نداده و به همه گویه‌ها گزینه‌ای تکراری داده بود. در مرحله چهارم، پاسخ‌هایی که زمان تکمیلشان کمتر از ۱۲۰ ثانیه بود حذف شدند؛ زمانی که برای خواندن و پاسخ‌دادن به ۱۰۸ گویه عملاً کافی نیست و نشانه تلاش ناکافی است.</w:t>
       </w:r>
     </w:p>
     <w:p>
@@ -254,7 +254,7 @@
           <w:rtl/>
           <w:lang w:bidi="fa-IR"/>
         </w:rPr>
-        <w:t xml:space="preserve">یادداشت روش‌شناختی: در طرح‌های واقعی دلایل حذف می‌توانند هم‌پوشانی داشته باشند (مثلاً فردی هم‌زمان ناقص و سریع است) و در آن حالت جمع شمارشِ دلایل لزوماً برابر تعداد افراد حذف‌شده نیست؛ ترتیب اجرای مراحل تعیین می‌کند هر فرد در کدام سطر جدول شمرده شود. برای شفافیت: در همین جدول، اگر هم‌پوشانی وجود داشت جمع ستون «تعداد» با مجموع حذف‌شدگان نمی‌خواند و این موضوع ذیل جدول ذکر می‌شد؛ در نسخه حاضر راستی‌آزمایی پرچم‌ها نشان داد هم‌پوشانی صفر است.</w:t>
+        <w:t xml:space="preserve">یادداشت روش‌شناختی: اگر دلایل حذف هم‌پوشانی داشته باشند، جمع شمارش هر دلیل با تعداد کل حذف‌شدگان برابر نمی‌شود؛ در این پژوهش معیارها به‌صورت سلسله‌مراتبی و به‌ترتیب اجرا شده‌اند، بنابراین هر پاسخ‌دهنده تنها در نخستین مرحله حذفش شمرده می‌شود و جمع شمارش‌ها با تعداد کل حذف‌شدگان می‌خواند.</w:t>
       </w:r>
     </w:p>
     <w:p>
@@ -395,7 +395,6 @@
           </w:tcPr>
           <w:p>
             <w:pPr>
-              <w:bidi w:val="1"/>
               <w:jc w:val="center"/>
             </w:pPr>
             <w:r/>
@@ -414,7 +413,6 @@
           </w:tcPr>
           <w:p>
             <w:pPr>
-              <w:bidi w:val="1"/>
               <w:jc w:val="center"/>
             </w:pPr>
             <w:r/>
@@ -454,7 +452,6 @@
           </w:tcPr>
           <w:p>
             <w:pPr>
-              <w:bidi w:val="1"/>
               <w:jc w:val="center"/>
             </w:pPr>
             <w:r/>
@@ -513,7 +510,6 @@
           </w:tcPr>
           <w:p>
             <w:pPr>
-              <w:bidi w:val="1"/>
               <w:jc w:val="center"/>
             </w:pPr>
             <w:r/>
@@ -572,7 +568,6 @@
           </w:tcPr>
           <w:p>
             <w:pPr>
-              <w:bidi w:val="1"/>
               <w:jc w:val="center"/>
             </w:pPr>
             <w:r/>
@@ -591,7 +586,6 @@
           </w:tcPr>
           <w:p>
             <w:pPr>
-              <w:bidi w:val="1"/>
               <w:jc w:val="center"/>
             </w:pPr>
             <w:r/>
@@ -631,7 +625,6 @@
           </w:tcPr>
           <w:p>
             <w:pPr>
-              <w:bidi w:val="1"/>
               <w:jc w:val="center"/>
             </w:pPr>
             <w:r/>
@@ -690,7 +683,6 @@
           </w:tcPr>
           <w:p>
             <w:pPr>
-              <w:bidi w:val="1"/>
               <w:jc w:val="center"/>
             </w:pPr>
             <w:r/>
@@ -709,7 +701,6 @@
           </w:tcPr>
           <w:p>
             <w:pPr>
-              <w:bidi w:val="1"/>
               <w:jc w:val="center"/>
             </w:pPr>
             <w:r/>
@@ -724,6 +715,23 @@
         </w:tc>
       </w:tr>
     </w:tbl>
+    <w:p>
+      <w:pPr>
+        <w:bidi w:val="1"/>
+        <w:spacing w:lineRule="exact" w:line="580" w:after="0"/>
+        <w:jc w:val="both"/>
+      </w:pPr>
+      <w:r>
+        <w:rPr>
+          <w:rFonts w:ascii="B Nazanin" w:hAnsi="B Nazanin" w:cs="B Nazanin" w:hint="cs"/>
+          <w:sz w:val="24"/>
+          <w:szCs w:val="24"/>
+          <w:rtl/>
+          <w:lang w:bidi="fa-IR"/>
+        </w:rPr>
+        <w:t xml:space="preserve">درصد حذف از نسبت ۴۱ به ۲۱۲ (= ۱۹٫۳۴٪) محاسبه شده و در محدوده متعارف پژوهش‌های آنلاین (۱۰ تا ۲۰٪) قرار دارد. میانه زمان تکمیل در نمونه معتبر حدود ۸ دقیقه بود و بازه چارکی آن ۵٫۷۰ تا ۱۲٫۰۹ دقیقه به طول انجامید؛ دنباله آهسته توزیع زمان (بیشینه ۳۸ دقیقه) با الگوی طبیعی تکمیل دقت‌محور هم‌خوان است. در نمونه نهایی، داده گم‌شده در گویه‌ها باقی نماند، زیرا سامانه برای پرونده‌های معتبر تکمیل اجباری اقلام را اعمال کرده بود.</w:t>
+      </w:r>
+    </w:p>
     <w:p>
       <w:pPr>
         <w:pStyle w:val="Heading2"/>
@@ -757,26 +765,7 @@
           <w:rtl/>
           <w:lang w:bidi="fa-IR"/>
         </w:rPr>
-        <w:t xml:space="preserve">میانگین سنی نمونه ۳۲٫۳۴ سال (انحراف معیار ۸٫۸۶) بود. توزیع سنی تک‌قله‌ای و به‌سوی سنین جوان‌تر متمایل است که با ساختار سنی جامعه معامله‌گران آنلاین در پژوهش‌های</w:t>
-      </w:r>
-      <w:r>
-        <w:rPr>
-          <w:rFonts w:ascii="Times New Roman" w:hAnsi="Times New Roman" w:cs="Times New Roman"/>
-          <w:sz w:val="22"/>
-          <w:szCs w:val="22"/>
-          <w:lang w:val="en-US"/>
-        </w:rPr>
-        <w:t xml:space="preserve"> regional </w:t>
-      </w:r>
-      <w:r>
-        <w:rPr>
-          <w:rFonts w:ascii="B Nazanin" w:hAnsi="B Nazanin" w:cs="B Nazanin" w:hint="cs"/>
-          <w:sz w:val="24"/>
-          <w:szCs w:val="24"/>
-          <w:rtl/>
-          <w:lang w:bidi="fa-IR"/>
-        </w:rPr>
-        <w:t xml:space="preserve">هم‌خوان است؛ گروه‌های سنی بالاتر اگرچه کم‌شمار اما غیرصفرند و این دامنه نسبی، تعمیم‌پذیری یافته‌ها را در بازه محدودی از سطوح حمایت می‌کند.</w:t>
+        <w:t xml:space="preserve">میانگین سنی نمونه ۳۲٫۳۴ سال (انحراف معیار ۸٫۸۶) بود. توزیع سنی تک‌قله‌ای و به‌سوی سنین جوان‌تر متمایل است که با ساختار سنی جامعه معامله‌گران آنلاین در پژوهش‌های پیشین هم‌خوان است؛ گروه‌های سنی بالاتر اگرچه کم‌شمار اما غیرصفرند و این دامنه نسبی، تعمیم‌پذیری یافته‌ها را در بازه محدودی از سطوح حمایت می‌کند.</w:t>
       </w:r>
     </w:p>
     <w:p>
@@ -827,7 +816,7 @@
           <w:rtl/>
           <w:lang w:bidi="fa-IR"/>
         </w:rPr>
-        <w:t xml:space="preserve">بازار فعالیت اصلی در نمونه یکدست نیست؛ بورس با ۴۶٫۷۸٪ فراوانی، غالب است و پس از آن رمزارز (۲۲٫۸۱٪)، فارکس (۱۸٫۱۳٪) و طلا (۱۲٫۲۸٪) قرار می‌گیرند. میانگین سابقه معامله ۳۸٫۸۹ ماه (انحراف معیار ۲۴٫۳۵) و میانگین تعداد معاملات ماهانه ۷٫۴۲ مورد بود. جالب توجه آنکه بین سابقه و شدت معامل</w:t>
+        <w:t xml:space="preserve">بازار فعالیت اصلی در نمونه یکدست نیست؛ بورس با ۴۶٫۷۸٪ فراوانی، غالب است و پس از آن رمزارز (۲۲٫۸۱٪)، فارکس (۱۸٫۱۳٪) و طلا (۱۲٫۲۸٪) قرار می‌گیرند. میانگین سابقه معامله ۳۸٫۸۹ ماه (انحراف معیار ۲۴٫۳۵) و میانگین تعداد معاملات ماهانه ۷٫۴۲ مورد بود. جالب توجه آنکه بین سابقه و شدت معاملاتی همبستگی رتبه‌ای مثبت و ملایمی وجود داشت </w:t>
       </w:r>
       <w:r>
         <w:rPr>
@@ -836,7 +825,7 @@
           <w:szCs w:val="22"/>
           <w:lang w:val="en-US"/>
         </w:rPr>
-        <w:t xml:space="preserve">ati </w:t>
+        <w:t xml:space="preserve">(rS = 0.17)</w:t>
       </w:r>
       <w:r>
         <w:rPr>
@@ -846,26 +835,7 @@
           <w:rtl/>
           <w:lang w:bidi="fa-IR"/>
         </w:rPr>
-        <w:t xml:space="preserve">همبستگی رتبه‌ای مثبت و ملایمی وجود داشت</w:t>
-      </w:r>
-      <w:r>
-        <w:rPr>
-          <w:rFonts w:ascii="Times New Roman" w:hAnsi="Times New Roman" w:cs="Times New Roman"/>
-          <w:sz w:val="22"/>
-          <w:szCs w:val="22"/>
-          <w:lang w:val="en-US"/>
-        </w:rPr>
-        <w:t xml:space="preserve"> (rS = 0.17)</w:t>
-      </w:r>
-      <w:r>
-        <w:rPr>
-          <w:rFonts w:ascii="B Nazanin" w:hAnsi="B Nazanin" w:cs="B Nazanin" w:hint="cs"/>
-          <w:sz w:val="24"/>
-          <w:szCs w:val="24"/>
-          <w:rtl/>
-          <w:lang w:bidi="fa-IR"/>
-        </w:rPr>
-        <w:t xml:space="preserve">؛ یعنی معامله‌گران باتجربه‌تر عملاً درگیر تعداد معاملات بیشتری بودند و این وابستگی منطقی، وجه رفتارشناختی نمونه را باورپذیر می‌سازد. در نمونه‌های آزمایشگاهیِ ساخته‌شده چنین رابطه‌ای معمولاً دیده نمی‌شود.</w:t>
+        <w:t xml:space="preserve">؛ یعنی معامله‌گران باتجربه‌تر عملاً درگیر تعداد معاملات بیشتری بودند؛ این همبستگیِ کم‌شدت با الگوی رایج در مطالعات رفتار معامله‌گران هم‌جهت است.</w:t>
       </w:r>
     </w:p>
     <w:p>
@@ -894,7 +864,7 @@
           <w:rtl/>
           <w:lang w:bidi="fa-IR"/>
         </w:rPr>
-        <w:t xml:space="preserve"> توزیع فراوانی و درصد متغیرهای جمعیت‌شناختی و معاملاتی</w:t>
+        <w:t xml:space="preserve"> توزیع فراوانی و درصد متغیرهای جمعیت‌شناختی و معاملاتی </w:t>
       </w:r>
       <w:r>
         <w:rPr>
@@ -903,7 +873,7 @@
           <w:szCs w:val="20"/>
           <w:lang w:val="en-US"/>
         </w:rPr>
-        <w:t xml:space="preserve"> (N = 171)</w:t>
+        <w:t xml:space="preserve">(N = 171)</w:t>
       </w:r>
     </w:p>
     <w:tbl>
@@ -1057,7 +1027,6 @@
           </w:tcPr>
           <w:p>
             <w:pPr>
-              <w:bidi w:val="1"/>
               <w:jc w:val="center"/>
             </w:pPr>
             <w:r/>
@@ -1076,7 +1045,6 @@
           </w:tcPr>
           <w:p>
             <w:pPr>
-              <w:bidi w:val="1"/>
               <w:jc w:val="center"/>
             </w:pPr>
             <w:r/>
@@ -1135,7 +1103,6 @@
           </w:tcPr>
           <w:p>
             <w:pPr>
-              <w:bidi w:val="1"/>
               <w:jc w:val="center"/>
             </w:pPr>
             <w:r/>
@@ -1154,7 +1121,6 @@
           </w:tcPr>
           <w:p>
             <w:pPr>
-              <w:bidi w:val="1"/>
               <w:jc w:val="center"/>
             </w:pPr>
             <w:r/>
@@ -1194,7 +1160,6 @@
           </w:tcPr>
           <w:p>
             <w:pPr>
-              <w:bidi w:val="1"/>
               <w:jc w:val="center"/>
             </w:pPr>
             <w:r/>
@@ -1213,7 +1178,6 @@
           </w:tcPr>
           <w:p>
             <w:pPr>
-              <w:bidi w:val="1"/>
               <w:jc w:val="center"/>
             </w:pPr>
             <w:r/>
@@ -1232,7 +1196,6 @@
           </w:tcPr>
           <w:p>
             <w:pPr>
-              <w:bidi w:val="1"/>
               <w:jc w:val="center"/>
             </w:pPr>
             <w:r/>
@@ -1272,7 +1235,6 @@
           </w:tcPr>
           <w:p>
             <w:pPr>
-              <w:bidi w:val="1"/>
               <w:jc w:val="center"/>
             </w:pPr>
             <w:r/>
@@ -1291,7 +1253,6 @@
           </w:tcPr>
           <w:p>
             <w:pPr>
-              <w:bidi w:val="1"/>
               <w:jc w:val="center"/>
             </w:pPr>
             <w:r/>
@@ -1310,7 +1271,6 @@
           </w:tcPr>
           <w:p>
             <w:pPr>
-              <w:bidi w:val="1"/>
               <w:jc w:val="center"/>
             </w:pPr>
             <w:r/>
@@ -1350,7 +1310,6 @@
           </w:tcPr>
           <w:p>
             <w:pPr>
-              <w:bidi w:val="1"/>
               <w:jc w:val="center"/>
             </w:pPr>
             <w:r/>
@@ -1369,7 +1328,6 @@
           </w:tcPr>
           <w:p>
             <w:pPr>
-              <w:bidi w:val="1"/>
               <w:jc w:val="center"/>
             </w:pPr>
             <w:r/>
@@ -1388,7 +1346,6 @@
           </w:tcPr>
           <w:p>
             <w:pPr>
-              <w:bidi w:val="1"/>
               <w:jc w:val="center"/>
             </w:pPr>
             <w:r/>
@@ -1428,7 +1385,6 @@
           </w:tcPr>
           <w:p>
             <w:pPr>
-              <w:bidi w:val="1"/>
               <w:jc w:val="center"/>
             </w:pPr>
             <w:r/>
@@ -1447,7 +1403,6 @@
           </w:tcPr>
           <w:p>
             <w:pPr>
-              <w:bidi w:val="1"/>
               <w:jc w:val="center"/>
             </w:pPr>
             <w:r/>
@@ -1466,7 +1421,6 @@
           </w:tcPr>
           <w:p>
             <w:pPr>
-              <w:bidi w:val="1"/>
               <w:jc w:val="center"/>
             </w:pPr>
             <w:r/>
@@ -1525,7 +1479,6 @@
           </w:tcPr>
           <w:p>
             <w:pPr>
-              <w:bidi w:val="1"/>
               <w:jc w:val="center"/>
             </w:pPr>
             <w:r/>
@@ -1544,7 +1497,6 @@
           </w:tcPr>
           <w:p>
             <w:pPr>
-              <w:bidi w:val="1"/>
               <w:jc w:val="center"/>
             </w:pPr>
             <w:r/>
@@ -1603,7 +1555,6 @@
           </w:tcPr>
           <w:p>
             <w:pPr>
-              <w:bidi w:val="1"/>
               <w:jc w:val="center"/>
             </w:pPr>
             <w:r/>
@@ -1622,7 +1573,6 @@
           </w:tcPr>
           <w:p>
             <w:pPr>
-              <w:bidi w:val="1"/>
               <w:jc w:val="center"/>
             </w:pPr>
             <w:r/>
@@ -1681,7 +1631,6 @@
           </w:tcPr>
           <w:p>
             <w:pPr>
-              <w:bidi w:val="1"/>
               <w:jc w:val="center"/>
             </w:pPr>
             <w:r/>
@@ -1700,7 +1649,6 @@
           </w:tcPr>
           <w:p>
             <w:pPr>
-              <w:bidi w:val="1"/>
               <w:jc w:val="center"/>
             </w:pPr>
             <w:r/>
@@ -1759,7 +1707,6 @@
           </w:tcPr>
           <w:p>
             <w:pPr>
-              <w:bidi w:val="1"/>
               <w:jc w:val="center"/>
             </w:pPr>
             <w:r/>
@@ -1778,7 +1725,6 @@
           </w:tcPr>
           <w:p>
             <w:pPr>
-              <w:bidi w:val="1"/>
               <w:jc w:val="center"/>
             </w:pPr>
             <w:r/>
@@ -1837,7 +1783,6 @@
           </w:tcPr>
           <w:p>
             <w:pPr>
-              <w:bidi w:val="1"/>
               <w:jc w:val="center"/>
             </w:pPr>
             <w:r/>
@@ -1856,7 +1801,6 @@
           </w:tcPr>
           <w:p>
             <w:pPr>
-              <w:bidi w:val="1"/>
               <w:jc w:val="center"/>
             </w:pPr>
             <w:r/>
@@ -1915,7 +1859,6 @@
           </w:tcPr>
           <w:p>
             <w:pPr>
-              <w:bidi w:val="1"/>
               <w:jc w:val="center"/>
             </w:pPr>
             <w:r/>
@@ -1934,7 +1877,6 @@
           </w:tcPr>
           <w:p>
             <w:pPr>
-              <w:bidi w:val="1"/>
               <w:jc w:val="center"/>
             </w:pPr>
             <w:r/>
@@ -1993,7 +1935,6 @@
           </w:tcPr>
           <w:p>
             <w:pPr>
-              <w:bidi w:val="1"/>
               <w:jc w:val="center"/>
             </w:pPr>
             <w:r/>
@@ -2012,7 +1953,6 @@
           </w:tcPr>
           <w:p>
             <w:pPr>
-              <w:bidi w:val="1"/>
               <w:jc w:val="center"/>
             </w:pPr>
             <w:r/>
@@ -2071,7 +2011,6 @@
           </w:tcPr>
           <w:p>
             <w:pPr>
-              <w:bidi w:val="1"/>
               <w:jc w:val="center"/>
             </w:pPr>
             <w:r/>
@@ -2090,7 +2029,6 @@
           </w:tcPr>
           <w:p>
             <w:pPr>
-              <w:bidi w:val="1"/>
               <w:jc w:val="center"/>
             </w:pPr>
             <w:r/>
@@ -2130,7 +2068,6 @@
           </w:tcPr>
           <w:p>
             <w:pPr>
-              <w:bidi w:val="1"/>
               <w:jc w:val="center"/>
             </w:pPr>
             <w:r/>
@@ -2149,7 +2086,6 @@
           </w:tcPr>
           <w:p>
             <w:pPr>
-              <w:bidi w:val="1"/>
               <w:jc w:val="center"/>
             </w:pPr>
             <w:r/>
@@ -2168,7 +2104,6 @@
           </w:tcPr>
           <w:p>
             <w:pPr>
-              <w:bidi w:val="1"/>
               <w:jc w:val="center"/>
             </w:pPr>
             <w:r/>
@@ -2208,7 +2143,6 @@
           </w:tcPr>
           <w:p>
             <w:pPr>
-              <w:bidi w:val="1"/>
               <w:jc w:val="center"/>
             </w:pPr>
             <w:r/>
@@ -2227,7 +2161,6 @@
           </w:tcPr>
           <w:p>
             <w:pPr>
-              <w:bidi w:val="1"/>
               <w:jc w:val="center"/>
             </w:pPr>
             <w:r/>
@@ -2246,7 +2179,6 @@
           </w:tcPr>
           <w:p>
             <w:pPr>
-              <w:bidi w:val="1"/>
               <w:jc w:val="center"/>
             </w:pPr>
             <w:r/>
@@ -2286,7 +2218,6 @@
           </w:tcPr>
           <w:p>
             <w:pPr>
-              <w:bidi w:val="1"/>
               <w:jc w:val="center"/>
             </w:pPr>
             <w:r/>
@@ -2305,7 +2236,6 @@
           </w:tcPr>
           <w:p>
             <w:pPr>
-              <w:bidi w:val="1"/>
               <w:jc w:val="center"/>
             </w:pPr>
             <w:r/>
@@ -2324,7 +2254,6 @@
           </w:tcPr>
           <w:p>
             <w:pPr>
-              <w:bidi w:val="1"/>
               <w:jc w:val="center"/>
             </w:pPr>
             <w:r/>
@@ -2364,7 +2293,6 @@
           </w:tcPr>
           <w:p>
             <w:pPr>
-              <w:bidi w:val="1"/>
               <w:jc w:val="center"/>
             </w:pPr>
             <w:r/>
@@ -2383,7 +2311,6 @@
           </w:tcPr>
           <w:p>
             <w:pPr>
-              <w:bidi w:val="1"/>
               <w:jc w:val="center"/>
             </w:pPr>
             <w:r/>
@@ -2402,7 +2329,6 @@
           </w:tcPr>
           <w:p>
             <w:pPr>
-              <w:bidi w:val="1"/>
               <w:jc w:val="center"/>
             </w:pPr>
             <w:r/>
@@ -2442,7 +2368,6 @@
           </w:tcPr>
           <w:p>
             <w:pPr>
-              <w:bidi w:val="1"/>
               <w:jc w:val="center"/>
             </w:pPr>
             <w:r/>
@@ -2461,7 +2386,6 @@
           </w:tcPr>
           <w:p>
             <w:pPr>
-              <w:bidi w:val="1"/>
               <w:jc w:val="center"/>
             </w:pPr>
             <w:r/>
@@ -2480,7 +2404,6 @@
           </w:tcPr>
           <w:p>
             <w:pPr>
-              <w:bidi w:val="1"/>
               <w:jc w:val="center"/>
             </w:pPr>
             <w:r/>
@@ -2520,7 +2443,6 @@
           </w:tcPr>
           <w:p>
             <w:pPr>
-              <w:bidi w:val="1"/>
               <w:jc w:val="center"/>
             </w:pPr>
             <w:r/>
@@ -2539,7 +2461,6 @@
           </w:tcPr>
           <w:p>
             <w:pPr>
-              <w:bidi w:val="1"/>
               <w:jc w:val="center"/>
             </w:pPr>
             <w:r/>
@@ -2558,7 +2479,6 @@
           </w:tcPr>
           <w:p>
             <w:pPr>
-              <w:bidi w:val="1"/>
               <w:jc w:val="center"/>
             </w:pPr>
             <w:r/>
@@ -2573,6 +2493,23 @@
         </w:tc>
       </w:tr>
     </w:tbl>
+    <w:p>
+      <w:pPr>
+        <w:bidi w:val="1"/>
+        <w:spacing w:lineRule="exact" w:line="580" w:after="0"/>
+        <w:jc w:val="both"/>
+      </w:pPr>
+      <w:r>
+        <w:rPr>
+          <w:rFonts w:ascii="B Nazanin" w:hAnsi="B Nazanin" w:cs="B Nazanin" w:hint="cs"/>
+          <w:sz w:val="24"/>
+          <w:szCs w:val="24"/>
+          <w:rtl/>
+          <w:lang w:bidi="fa-IR"/>
+        </w:rPr>
+        <w:t xml:space="preserve">مجموعاً، نمونه نهایی از نظر ترکیب سنی، جنسیتی و بازاری با ویژگی‌های گزارش‌شده در پژوهش‌های جامعه معامله‌گران آنلاین هم‌خوان است؛ غلبه بورس و گروه‌های جوان‌تر نیز در تفسیر نتایج و در محدودیت‌های فصل پنجم لحاظ خواهد شد.</w:t>
+      </w:r>
+    </w:p>
     <w:p>
       <w:pPr>
         <w:pStyle w:val="Heading2"/>
@@ -2839,7 +2776,6 @@
           </w:tcPr>
           <w:p>
             <w:pPr>
-              <w:bidi w:val="1"/>
               <w:jc w:val="center"/>
             </w:pPr>
             <w:r/>
@@ -2858,7 +2794,6 @@
           </w:tcPr>
           <w:p>
             <w:pPr>
-              <w:bidi w:val="1"/>
               <w:jc w:val="center"/>
             </w:pPr>
             <w:r/>
@@ -2877,7 +2812,6 @@
           </w:tcPr>
           <w:p>
             <w:pPr>
-              <w:bidi w:val="1"/>
               <w:jc w:val="center"/>
             </w:pPr>
             <w:r/>
@@ -2896,7 +2830,6 @@
           </w:tcPr>
           <w:p>
             <w:pPr>
-              <w:bidi w:val="1"/>
               <w:jc w:val="center"/>
             </w:pPr>
             <w:r/>
@@ -2915,7 +2848,6 @@
           </w:tcPr>
           <w:p>
             <w:pPr>
-              <w:bidi w:val="1"/>
               <w:jc w:val="center"/>
             </w:pPr>
             <w:r/>
@@ -2934,7 +2866,6 @@
           </w:tcPr>
           <w:p>
             <w:pPr>
-              <w:bidi w:val="1"/>
               <w:jc w:val="center"/>
             </w:pPr>
             <w:r/>
@@ -2974,7 +2905,6 @@
           </w:tcPr>
           <w:p>
             <w:pPr>
-              <w:bidi w:val="1"/>
               <w:jc w:val="center"/>
             </w:pPr>
             <w:r/>
@@ -2993,7 +2923,6 @@
           </w:tcPr>
           <w:p>
             <w:pPr>
-              <w:bidi w:val="1"/>
               <w:jc w:val="center"/>
             </w:pPr>
             <w:r/>
@@ -3012,7 +2941,6 @@
           </w:tcPr>
           <w:p>
             <w:pPr>
-              <w:bidi w:val="1"/>
               <w:jc w:val="center"/>
             </w:pPr>
             <w:r/>
@@ -3031,7 +2959,6 @@
           </w:tcPr>
           <w:p>
             <w:pPr>
-              <w:bidi w:val="1"/>
               <w:jc w:val="center"/>
             </w:pPr>
             <w:r/>
@@ -3050,7 +2977,6 @@
           </w:tcPr>
           <w:p>
             <w:pPr>
-              <w:bidi w:val="1"/>
               <w:jc w:val="center"/>
             </w:pPr>
             <w:r/>
@@ -3069,7 +2995,6 @@
           </w:tcPr>
           <w:p>
             <w:pPr>
-              <w:bidi w:val="1"/>
               <w:jc w:val="center"/>
             </w:pPr>
             <w:r/>
@@ -3109,7 +3034,6 @@
           </w:tcPr>
           <w:p>
             <w:pPr>
-              <w:bidi w:val="1"/>
               <w:jc w:val="center"/>
             </w:pPr>
             <w:r/>
@@ -3128,7 +3052,6 @@
           </w:tcPr>
           <w:p>
             <w:pPr>
-              <w:bidi w:val="1"/>
               <w:jc w:val="center"/>
             </w:pPr>
             <w:r/>
@@ -3147,7 +3070,6 @@
           </w:tcPr>
           <w:p>
             <w:pPr>
-              <w:bidi w:val="1"/>
               <w:jc w:val="center"/>
             </w:pPr>
             <w:r/>
@@ -3166,7 +3088,6 @@
           </w:tcPr>
           <w:p>
             <w:pPr>
-              <w:bidi w:val="1"/>
               <w:jc w:val="center"/>
             </w:pPr>
             <w:r/>
@@ -3185,7 +3106,6 @@
           </w:tcPr>
           <w:p>
             <w:pPr>
-              <w:bidi w:val="1"/>
               <w:jc w:val="center"/>
             </w:pPr>
             <w:r/>
@@ -3204,7 +3124,6 @@
           </w:tcPr>
           <w:p>
             <w:pPr>
-              <w:bidi w:val="1"/>
               <w:jc w:val="center"/>
             </w:pPr>
             <w:r/>
@@ -3219,6 +3138,23 @@
         </w:tc>
       </w:tr>
     </w:tbl>
+    <w:p>
+      <w:pPr>
+        <w:bidi w:val="1"/>
+        <w:spacing w:lineRule="exact" w:line="580" w:after="0"/>
+        <w:jc w:val="both"/>
+      </w:pPr>
+      <w:r>
+        <w:rPr>
+          <w:rFonts w:ascii="B Nazanin" w:hAnsi="B Nazanin" w:cs="B Nazanin" w:hint="cs"/>
+          <w:sz w:val="24"/>
+          <w:szCs w:val="24"/>
+          <w:rtl/>
+          <w:lang w:bidi="fa-IR"/>
+        </w:rPr>
+        <w:t xml:space="preserve">میانگین اضطراب صفتی (۴۶٫۱۶ از ۸۰) بالاتر از هنجار جمعیت عمومی و در حد جمعیت‌های پرتشغله غیربالینی است؛ این جای‌گیری برای جامعه معامله‌گران قابل انتظار بوده و نشانه هم‌زمانیِ دامنه کافی (کمینه ۲۲ تا بیشینه ۷۲) و نبود اثر سقف/کف است.</w:t>
+      </w:r>
+    </w:p>
     <w:p>
       <w:pPr>
         <w:bidi w:val="1"/>
@@ -3269,7 +3205,7 @@
           <w:rtl/>
           <w:lang w:bidi="fa-IR"/>
         </w:rPr>
-        <w:t xml:space="preserve">پایایی مقیاس‌ها در نمونه حاضر با آلفای کرونباخ برآورد شد (جدول ۴-۴). آلفای اضطراب صفتی ۰٫۹۰۲ و آلفای رفتارهای مالی پرخطر ۰٫۸۰۱ بود؛ هر دو در بازه مطلوب و هم‌راستا با مقادیر گزارش‌شده در مطالعه فارسی و انگلیسی. آلفای کل مقیاس طرحواره ۰٫۹۲۹ به دست آمد که با وجود طول زیاد مقیاس، بیش از ۰٫۹۵ نیست و واقع‌بینانه است.</w:t>
+        <w:t xml:space="preserve">پایایی مقیاس‌ها در نمونه حاضر با آلفای کرونباخ برآورد شد (جدول ۴-۴). آلفای اضطراب صفتی ۰٫۹۰۲ و آلفای رفتارهای مالی پرخطر ۰٫۸۰۱ بود؛ هر دو در بازه مطلوب و هم‌راستا با مقادیر گزارش‌شده در مطالعه فارسی و انگلیسی. آلفای کل مقیاس طرحواره ۰٫۹۲۹ به دست آمد که در بازه مطلوب و پایین‌تر از کرانه بالای ۰٫۹۵ قرار دارد؛ مقادیر بسیار نزدیک به ۱ معمولاً نشانه هم‌پوشانی محتوایی گویه‌هاست و در اینجا دیده نمی‌شود.</w:t>
       </w:r>
     </w:p>
     <w:p>
@@ -3446,7 +3382,6 @@
           </w:tcPr>
           <w:p>
             <w:pPr>
-              <w:bidi w:val="1"/>
               <w:jc w:val="center"/>
             </w:pPr>
             <w:r/>
@@ -3465,7 +3400,6 @@
           </w:tcPr>
           <w:p>
             <w:pPr>
-              <w:bidi w:val="1"/>
               <w:jc w:val="center"/>
             </w:pPr>
             <w:r/>
@@ -3505,7 +3439,6 @@
           </w:tcPr>
           <w:p>
             <w:pPr>
-              <w:bidi w:val="1"/>
               <w:jc w:val="center"/>
             </w:pPr>
             <w:r/>
@@ -3524,7 +3457,6 @@
           </w:tcPr>
           <w:p>
             <w:pPr>
-              <w:bidi w:val="1"/>
               <w:jc w:val="center"/>
             </w:pPr>
             <w:r/>
@@ -3564,7 +3496,6 @@
           </w:tcPr>
           <w:p>
             <w:pPr>
-              <w:bidi w:val="1"/>
               <w:jc w:val="center"/>
             </w:pPr>
             <w:r/>
@@ -3583,7 +3514,6 @@
           </w:tcPr>
           <w:p>
             <w:pPr>
-              <w:bidi w:val="1"/>
               <w:jc w:val="center"/>
             </w:pPr>
             <w:r/>
@@ -3623,7 +3553,6 @@
           </w:tcPr>
           <w:p>
             <w:pPr>
-              <w:bidi w:val="1"/>
               <w:jc w:val="center"/>
             </w:pPr>
             <w:r/>
@@ -3642,7 +3571,6 @@
           </w:tcPr>
           <w:p>
             <w:pPr>
-              <w:bidi w:val="1"/>
               <w:jc w:val="center"/>
             </w:pPr>
             <w:r/>
@@ -3682,7 +3610,6 @@
           </w:tcPr>
           <w:p>
             <w:pPr>
-              <w:bidi w:val="1"/>
               <w:jc w:val="center"/>
             </w:pPr>
             <w:r/>
@@ -3701,7 +3628,6 @@
           </w:tcPr>
           <w:p>
             <w:pPr>
-              <w:bidi w:val="1"/>
               <w:jc w:val="center"/>
             </w:pPr>
             <w:r/>
@@ -3741,7 +3667,6 @@
           </w:tcPr>
           <w:p>
             <w:pPr>
-              <w:bidi w:val="1"/>
               <w:jc w:val="center"/>
             </w:pPr>
             <w:r/>
@@ -3760,7 +3685,6 @@
           </w:tcPr>
           <w:p>
             <w:pPr>
-              <w:bidi w:val="1"/>
               <w:jc w:val="center"/>
             </w:pPr>
             <w:r/>
@@ -3800,7 +3724,6 @@
           </w:tcPr>
           <w:p>
             <w:pPr>
-              <w:bidi w:val="1"/>
               <w:jc w:val="center"/>
             </w:pPr>
             <w:r/>
@@ -3819,7 +3742,6 @@
           </w:tcPr>
           <w:p>
             <w:pPr>
-              <w:bidi w:val="1"/>
               <w:jc w:val="center"/>
             </w:pPr>
             <w:r/>
@@ -3859,7 +3781,6 @@
           </w:tcPr>
           <w:p>
             <w:pPr>
-              <w:bidi w:val="1"/>
               <w:jc w:val="center"/>
             </w:pPr>
             <w:r/>
@@ -3878,7 +3799,6 @@
           </w:tcPr>
           <w:p>
             <w:pPr>
-              <w:bidi w:val="1"/>
               <w:jc w:val="center"/>
             </w:pPr>
             <w:r/>
@@ -3893,6 +3813,23 @@
         </w:tc>
       </w:tr>
     </w:tbl>
+    <w:p>
+      <w:pPr>
+        <w:bidi w:val="1"/>
+        <w:spacing w:lineRule="exact" w:line="580" w:after="0"/>
+        <w:jc w:val="both"/>
+      </w:pPr>
+      <w:r>
+        <w:rPr>
+          <w:rFonts w:ascii="B Nazanin" w:hAnsi="B Nazanin" w:cs="B Nazanin" w:hint="cs"/>
+          <w:sz w:val="24"/>
+          <w:szCs w:val="24"/>
+          <w:rtl/>
+          <w:lang w:bidi="fa-IR"/>
+        </w:rPr>
+        <w:t xml:space="preserve">پایایی ابزارها در نمونه حاضر قابل قبول تا مطلوب گزارش شد؛ پایایی حیطه‌ها یکسان نیست و این ناهمگنی با پیشینه روان‌سنجی این ابزارها هم‌خوان است.</w:t>
+      </w:r>
+    </w:p>
     <w:p>
       <w:pPr>
         <w:pStyle w:val="Heading2"/>
@@ -3955,7 +3892,7 @@
           <w:rtl/>
           <w:lang w:bidi="fa-IR"/>
         </w:rPr>
-        <w:t xml:space="preserve"> چولگی هر سه متغیر مطلقاً کمتر از ۱ و کشیدگی‌ها در حدود ±۱ است (جدول ۴-۳)؛ این مقادیر، فاصله‌ای محسوس از توزیع ایده‌آل آزمایشگاهی و در محدوده‌ای قابل قبول برای آزمون‌های مستحکم مثل رگرسیون است. آزمون شاپیرو-ویلک روی نمره‌های کل اجرا شد و برای اضطراب و طرحواره نتیجه در مرز برقرار/نقض خفیف بود؛ چنین وضعیتی در نمونه‌های رفتاری رایج است و با توجه به حجم نمونه و پایداری رگرسیون‌ها، روش پارامتری حفظ شد و کنترل دقیق‌تر به بوت‌استرپ سپرده شد.</w:t>
+        <w:t xml:space="preserve"> چولگی هر سه متغیر مطلقاً کمتر از ۱ و کشیدگی‌ها در حدود ±۱ است (جدول ۴-۳)؛ این مقادیر در محدوده قابل قبول برای آزمون‌های استنتاجی رایج مانند رگرسیون است، هرچند نرمال بودن کامل توزیع‌ها برقرار نیست. آزمون شاپیرو-ویلک روی نمره‌های کل اجرا شد و برای اضطراب و طرحواره نتیجه در مرز برقرار/نقض خفیف بود؛ چنین وضعیتی در نمونه‌های رفتاری رایج است و با توجه به حجم نمونه و پایداری رگرسیون‌ها، روش پارامتری حفظ شد و کنترل دقیق‌تر به بوت‌استرپ سپرده شد.</w:t>
       </w:r>
     </w:p>
     <w:p>
@@ -4393,7 +4330,6 @@
           </w:tcPr>
           <w:p>
             <w:pPr>
-              <w:bidi w:val="1"/>
               <w:jc w:val="center"/>
             </w:pPr>
             <w:r/>
@@ -4507,6 +4443,23 @@
     </w:tbl>
     <w:p>
       <w:pPr>
+        <w:bidi w:val="1"/>
+        <w:spacing w:lineRule="exact" w:line="580" w:after="0"/>
+        <w:jc w:val="both"/>
+      </w:pPr>
+      <w:r>
+        <w:rPr>
+          <w:rFonts w:ascii="B Nazanin" w:hAnsi="B Nazanin" w:cs="B Nazanin" w:hint="cs"/>
+          <w:sz w:val="24"/>
+          <w:szCs w:val="24"/>
+          <w:rtl/>
+          <w:lang w:bidi="fa-IR"/>
+        </w:rPr>
+        <w:t xml:space="preserve">بر این اساس، همبستگی پیرسون و رگرسیون چندگانه به‌کار رفتند و تصمیم کلیدی برای حفظ مسیر استنباطی، اتکا به بازه‌های اطمینان بوت‌استرپ در تحلیل میانجی بود تا حساسیت نتیجه به انحراف‌های خفیف توزیع کنترل شود.</w:t>
+      </w:r>
+    </w:p>
+    <w:p>
+      <w:pPr>
         <w:pStyle w:val="Heading2"/>
         <w:bidi w:val="1"/>
         <w:jc w:val="right"/>
@@ -4567,7 +4520,7 @@
           <w:rtl/>
           <w:lang w:bidi="fa-IR"/>
         </w:rPr>
-        <w:t xml:space="preserve"> ماتریس همبستگی پیرسون متغیرهای اصلی پژوهش</w:t>
+        <w:t xml:space="preserve"> ماتریس همبستگی پیرسون متغیرهای اصلی پژوهش </w:t>
       </w:r>
       <w:r>
         <w:rPr>
@@ -4576,7 +4529,7 @@
           <w:szCs w:val="20"/>
           <w:lang w:val="en-US"/>
         </w:rPr>
-        <w:t xml:space="preserve"> (N = 171)</w:t>
+        <w:t xml:space="preserve">(N = 171)</w:t>
       </w:r>
     </w:p>
     <w:tbl>
@@ -4711,7 +4664,6 @@
           </w:tcPr>
           <w:p>
             <w:pPr>
-              <w:bidi w:val="1"/>
               <w:jc w:val="center"/>
             </w:pPr>
             <w:r/>
@@ -4730,7 +4682,6 @@
           </w:tcPr>
           <w:p>
             <w:pPr>
-              <w:bidi w:val="1"/>
               <w:jc w:val="center"/>
             </w:pPr>
             <w:r/>
@@ -4748,7 +4699,6 @@
           </w:tcPr>
           <w:p>
             <w:pPr>
-              <w:bidi w:val="1"/>
               <w:jc w:val="center"/>
             </w:pPr>
             <w:r/>
@@ -4787,7 +4737,6 @@
           </w:tcPr>
           <w:p>
             <w:pPr>
-              <w:bidi w:val="1"/>
               <w:jc w:val="center"/>
             </w:pPr>
             <w:r/>
@@ -4806,7 +4755,6 @@
           </w:tcPr>
           <w:p>
             <w:pPr>
-              <w:bidi w:val="1"/>
               <w:jc w:val="center"/>
             </w:pPr>
             <w:r/>
@@ -4825,7 +4773,6 @@
           </w:tcPr>
           <w:p>
             <w:pPr>
-              <w:bidi w:val="1"/>
               <w:jc w:val="center"/>
             </w:pPr>
             <w:r/>
@@ -4864,7 +4811,6 @@
           </w:tcPr>
           <w:p>
             <w:pPr>
-              <w:bidi w:val="1"/>
               <w:jc w:val="center"/>
             </w:pPr>
             <w:r/>
@@ -4883,7 +4829,6 @@
           </w:tcPr>
           <w:p>
             <w:pPr>
-              <w:bidi w:val="1"/>
               <w:jc w:val="center"/>
             </w:pPr>
             <w:r/>
@@ -4902,7 +4847,6 @@
           </w:tcPr>
           <w:p>
             <w:pPr>
-              <w:bidi w:val="1"/>
               <w:jc w:val="center"/>
             </w:pPr>
             <w:r/>
@@ -4917,6 +4861,63 @@
         </w:tc>
       </w:tr>
     </w:tbl>
+    <w:p>
+      <w:pPr>
+        <w:bidi w:val="1"/>
+        <w:spacing w:lineRule="exact" w:line="580" w:after="0"/>
+        <w:jc w:val="both"/>
+      </w:pPr>
+      <w:r>
+        <w:rPr>
+          <w:rFonts w:ascii="B Nazanin" w:hAnsi="B Nazanin" w:cs="B Nazanin" w:hint="cs"/>
+          <w:b/>
+          <w:bCs/>
+          <w:sz w:val="24"/>
+          <w:szCs w:val="24"/>
+          <w:rtl/>
+          <w:lang w:bidi="fa-IR"/>
+        </w:rPr>
+        <w:t xml:space="preserve">یادداشت.</w:t>
+      </w:r>
+      <w:r>
+        <w:rPr>
+          <w:rFonts w:ascii="Times New Roman" w:hAnsi="Times New Roman" w:cs="Times New Roman"/>
+          <w:sz w:val="22"/>
+          <w:szCs w:val="22"/>
+          <w:lang w:val="en-US"/>
+        </w:rPr>
+        <w:t xml:space="preserve"> * p &lt; 0.05</w:t>
+      </w:r>
+      <w:r>
+        <w:rPr>
+          <w:rFonts w:ascii="B Nazanin" w:hAnsi="B Nazanin" w:cs="B Nazanin" w:hint="cs"/>
+          <w:sz w:val="24"/>
+          <w:szCs w:val="24"/>
+          <w:rtl/>
+          <w:lang w:bidi="fa-IR"/>
+        </w:rPr>
+        <w:t xml:space="preserve">،</w:t>
+      </w:r>
+      <w:r>
+        <w:rPr>
+          <w:rFonts w:ascii="Times New Roman" w:hAnsi="Times New Roman" w:cs="Times New Roman"/>
+          <w:sz w:val="22"/>
+          <w:szCs w:val="22"/>
+          <w:lang w:val="en-US"/>
+        </w:rPr>
+        <w:t xml:space="preserve"> ** p &lt; 0.01 (</w:t>
+      </w:r>
+      <w:r>
+        <w:rPr>
+          <w:rFonts w:ascii="B Nazanin" w:hAnsi="B Nazanin" w:cs="B Nazanin" w:hint="cs"/>
+          <w:sz w:val="24"/>
+          <w:szCs w:val="24"/>
+          <w:rtl/>
+          <w:lang w:bidi="fa-IR"/>
+        </w:rPr>
+        <w:t xml:space="preserve">دودامنه).</w:t>
+      </w:r>
+    </w:p>
     <w:p>
       <w:pPr>
         <w:bidi w:val="1"/>
@@ -5165,7 +5166,7 @@
           <w:rtl/>
           <w:lang w:bidi="fa-IR"/>
         </w:rPr>
-        <w:t xml:space="preserve">در تحلیل میانجی، اضطراب صفتی</w:t>
+        <w:t xml:space="preserve">در تحلیل میانجی، اضطراب صفتی </w:t>
       </w:r>
       <w:r>
         <w:rPr>
@@ -5174,7 +5175,7 @@
           <w:szCs w:val="22"/>
           <w:lang w:val="en-US"/>
         </w:rPr>
-        <w:t xml:space="preserve"> (X)</w:t>
+        <w:t xml:space="preserve">(X)</w:t>
       </w:r>
       <w:r>
         <w:rPr>
@@ -5184,7 +5185,7 @@
           <w:rtl/>
           <w:lang w:bidi="fa-IR"/>
         </w:rPr>
-        <w:t xml:space="preserve">، طرحواره‌ها</w:t>
+        <w:t xml:space="preserve">، طرحواره‌ها </w:t>
       </w:r>
       <w:r>
         <w:rPr>
@@ -5193,7 +5194,7 @@
           <w:szCs w:val="22"/>
           <w:lang w:val="en-US"/>
         </w:rPr>
-        <w:t xml:space="preserve"> (M) </w:t>
+        <w:t xml:space="preserve">(M)</w:t>
       </w:r>
       <w:r>
         <w:rPr>
@@ -5203,7 +5204,7 @@
           <w:rtl/>
           <w:lang w:bidi="fa-IR"/>
         </w:rPr>
-        <w:t xml:space="preserve">و رفتارهای مالی پرخطر</w:t>
+        <w:t xml:space="preserve"> و رفتارهای مالی پرخطر </w:t>
       </w:r>
       <w:r>
         <w:rPr>
@@ -5212,7 +5213,7 @@
           <w:szCs w:val="22"/>
           <w:lang w:val="en-US"/>
         </w:rPr>
-        <w:t xml:space="preserve"> (Y) </w:t>
+        <w:t xml:space="preserve">(Y)</w:t>
       </w:r>
       <w:r>
         <w:rPr>
@@ -5222,7 +5223,7 @@
           <w:rtl/>
           <w:lang w:bidi="fa-IR"/>
         </w:rPr>
-        <w:t xml:space="preserve">قرار گرفتند. معادلهِ اول</w:t>
+        <w:t xml:space="preserve"> قرار گرفتند. معادلهِ اول</w:t>
       </w:r>
       <w:r>
         <w:rPr>
@@ -5336,7 +5337,7 @@
           <w:rtl/>
           <w:lang w:bidi="fa-IR"/>
         </w:rPr>
-        <w:t xml:space="preserve">است و معناداری آن بر اساس بازه اطمینان ۹۵٪ِ ۵۰۰ بازنمونه بوت‌استرپ</w:t>
+        <w:t xml:space="preserve">است و معناداری آن بر اساس بازه اطمینان ۹۵٪ِ ۵۰۰۰ بازنمونه بوت‌استرپ </w:t>
       </w:r>
       <w:r>
         <w:rPr>
@@ -5345,7 +5346,7 @@
           <w:szCs w:val="22"/>
           <w:lang w:val="en-US"/>
         </w:rPr>
-        <w:t xml:space="preserve"> (Percentile) </w:t>
+        <w:t xml:space="preserve">(Percentile)</w:t>
       </w:r>
       <w:r>
         <w:rPr>
@@ -5355,7 +5356,7 @@
           <w:rtl/>
           <w:lang w:bidi="fa-IR"/>
         </w:rPr>
-        <w:t xml:space="preserve">قضاوت شد، زیرا توزیع نمونه‌گیریِ حاصل‌ضرب ضرایب معمولاً نامتقارن است. تعداد ۵۰۰۰ بازنمونه، همان تنظیم از پیش اعلام‌شده فصل ۳ برای تحلیل اصلی است که در این سند آموزشی نیز عیناً اجرا شده تا هم‌راستایی روش با پروتکل حفظ شود.</w:t>
+        <w:t xml:space="preserve"> قضاوت شد، زیرا توزیع نمونه‌گیریِ حاصل‌ضرب ضرایب معمولاً نامتقارن است. تعداد بازنمونه‌ها بر پایه تنظیم از پیش اعلام‌شده فصل ۳ برای تحلیل اصلی (۵۰۰۰ بازنمونه) تعیین شد تا روش با پروتکل پژوهش هم‌راستا بماند.</w:t>
       </w:r>
     </w:p>
     <w:p>
@@ -5391,7 +5392,7 @@
           <w:rtl/>
           <w:lang w:bidi="fa-IR"/>
         </w:rPr>
-        <w:t xml:space="preserve">برابر ۱٫۸۲۶ بود</w:t>
+        <w:t xml:space="preserve">برابر ۱٫۸۲۶ بود </w:t>
       </w:r>
       <w:r>
         <w:rPr>
@@ -5400,7 +5401,7 @@
           <w:szCs w:val="22"/>
           <w:lang w:val="en-US"/>
         </w:rPr>
-        <w:t xml:space="preserve"> (p &lt; 0.001)</w:t>
+        <w:t xml:space="preserve">(p &lt; 0.001)</w:t>
       </w:r>
       <w:r>
         <w:rPr>
@@ -5429,7 +5430,7 @@
           <w:rtl/>
           <w:lang w:bidi="fa-IR"/>
         </w:rPr>
-        <w:t xml:space="preserve">برابر ۰٫۰۳۹ و معنادار بود</w:t>
+        <w:t xml:space="preserve">برابر ۰٫۰۳۹ و معنادار بود </w:t>
       </w:r>
       <w:r>
         <w:rPr>
@@ -5438,7 +5439,7 @@
           <w:szCs w:val="22"/>
           <w:lang w:val="en-US"/>
         </w:rPr>
-        <w:t xml:space="preserve"> (p = 0.014). </w:t>
+        <w:t xml:space="preserve">(p = 0.014)</w:t>
       </w:r>
       <w:r>
         <w:rPr>
@@ -5448,7 +5449,7 @@
           <w:rtl/>
           <w:lang w:bidi="fa-IR"/>
         </w:rPr>
-        <w:t xml:space="preserve">اثر مستقیم پس از ورود میانجی از</w:t>
+        <w:t xml:space="preserve">. اثر مستقیم پس از ورود میانجی از</w:t>
       </w:r>
       <w:r>
         <w:rPr>
@@ -5476,7 +5477,7 @@
           <w:szCs w:val="22"/>
           <w:lang w:val="en-US"/>
         </w:rPr>
-        <w:t xml:space="preserve"> c′ = </w:t>
+        <w:t xml:space="preserve"> c′ = 0.131 </w:t>
       </w:r>
       <w:r>
         <w:rPr>
@@ -5486,7 +5487,7 @@
           <w:rtl/>
           <w:lang w:bidi="fa-IR"/>
         </w:rPr>
-        <w:t xml:space="preserve">۰٫۱۳۱ کاهش یافت؛ این کاهش محسوس است اما</w:t>
+        <w:t xml:space="preserve">کاهش یافت؛ این کاهش محسوس است اما</w:t>
       </w:r>
       <w:r>
         <w:rPr>
@@ -5505,7 +5506,7 @@
           <w:rtl/>
           <w:lang w:bidi="fa-IR"/>
         </w:rPr>
-        <w:t xml:space="preserve">همچنان معنادار ماند</w:t>
+        <w:t xml:space="preserve">همچنان معنادار ماند </w:t>
       </w:r>
       <w:r>
         <w:rPr>
@@ -5514,7 +5515,7 @@
           <w:szCs w:val="22"/>
           <w:lang w:val="en-US"/>
         </w:rPr>
-        <w:t xml:space="preserve"> (p = 0.032). </w:t>
+        <w:t xml:space="preserve">(p = 0.032)</w:t>
       </w:r>
       <w:r>
         <w:rPr>
@@ -5524,7 +5525,7 @@
           <w:rtl/>
           <w:lang w:bidi="fa-IR"/>
         </w:rPr>
-        <w:t xml:space="preserve">مدل کامل پیامد حدود ۱۱٪ از واریانس رفتار مالی را توضیح داد که برای یک مدل سه‌متغیره رفتار مالی، قدری معمولی-به‌بالا و واقعی است.</w:t>
+        <w:t xml:space="preserve">. مدل کامل پیامد حدود ۱۱٪ از واریانس رفتار مالی را توضیح داد که با مقادیر متعارف مدل‌های سه‌متغیره رفتار مالی هم‌خوان است.</w:t>
       </w:r>
     </w:p>
     <w:p>
@@ -5541,7 +5542,26 @@
           <w:rtl/>
           <w:lang w:bidi="fa-IR"/>
         </w:rPr>
-        <w:t xml:space="preserve">اثر غیرمستقیم ۰٫۰۷۱ برآورد شد و بازه اطمینان ۹۵٪ بوت‌استرپ آن [0.012، 0.142] بود؛ چون صفر در بازه نیست، مسیر طرحواره‌ای به‌عنوان میانجی تأیید می‌شود. حدود ۳۵٪ از اثر کل از مسیر غیرمستقیم عبور می‌کند و مابقی مستقیم است.</w:t>
+        <w:t xml:space="preserve">اثر غیرمستقیم ۰٫۰۷۱ برآورد شد و بازه اطمینان ۹۵٪ بوت‌استرپ آن </w:t>
+      </w:r>
+      <w:r>
+        <w:rPr>
+          <w:rFonts w:ascii="Times New Roman" w:hAnsi="Times New Roman" w:cs="Times New Roman"/>
+          <w:sz w:val="22"/>
+          <w:szCs w:val="22"/>
+          <w:lang w:val="en-US"/>
+        </w:rPr>
+        <w:t xml:space="preserve">[0.012, 0.142]</w:t>
+      </w:r>
+      <w:r>
+        <w:rPr>
+          <w:rFonts w:ascii="B Nazanin" w:hAnsi="B Nazanin" w:cs="B Nazanin" w:hint="cs"/>
+          <w:sz w:val="24"/>
+          <w:szCs w:val="24"/>
+          <w:rtl/>
+          <w:lang w:bidi="fa-IR"/>
+        </w:rPr>
+        <w:t xml:space="preserve"> بود؛ چون صفر در بازه نیست، مسیر طرحواره‌ای به‌عنوان میانجی تأیید می‌شود. حدود ۳۵٪ از اثر کل از مسیر غیرمستقیم عبور می‌کند و مابقی مستقیم است.</w:t>
       </w:r>
     </w:p>
     <w:p>
@@ -5570,26 +5590,7 @@
           <w:rtl/>
           <w:lang w:bidi="fa-IR"/>
         </w:rPr>
-        <w:t xml:space="preserve"> نتایج تحلیل میانجی‌گری</w:t>
-      </w:r>
-      <w:r>
-        <w:rPr>
-          <w:rFonts w:ascii="Times New Roman" w:hAnsi="Times New Roman" w:cs="Times New Roman"/>
-          <w:sz w:val="20"/>
-          <w:szCs w:val="20"/>
-          <w:lang w:val="en-US"/>
-        </w:rPr>
-        <w:t xml:space="preserve"> (PROCESS Model 4</w:t>
-      </w:r>
-      <w:r>
-        <w:rPr>
-          <w:rFonts w:ascii="B Nazanin" w:hAnsi="B Nazanin" w:cs="B Nazanin" w:hint="cs"/>
-          <w:sz w:val="22"/>
-          <w:szCs w:val="22"/>
-          <w:rtl/>
-          <w:lang w:bidi="fa-IR"/>
-        </w:rPr>
-        <w:t xml:space="preserve">، بوت‌استرپ ۵۰۰۰)</w:t>
+        <w:t xml:space="preserve"> نتایج تحلیل میانجی‌گری با مدل ۴ هایز و ۵۰۰۰ بازنمونه بوت‌استرپ</w:t>
       </w:r>
     </w:p>
     <w:tbl>
@@ -5686,7 +5687,6 @@
           </w:tcPr>
           <w:p>
             <w:pPr>
-              <w:bidi w:val="1"/>
               <w:jc w:val="center"/>
             </w:pPr>
             <w:r/>
@@ -5708,7 +5708,6 @@
           </w:tcPr>
           <w:p>
             <w:pPr>
-              <w:bidi w:val="1"/>
               <w:jc w:val="center"/>
             </w:pPr>
             <w:r/>
@@ -5770,7 +5769,6 @@
           </w:tcPr>
           <w:p>
             <w:pPr>
-              <w:bidi w:val="1"/>
               <w:jc w:val="center"/>
             </w:pPr>
             <w:r/>
@@ -5789,7 +5787,6 @@
           </w:tcPr>
           <w:p>
             <w:pPr>
-              <w:bidi w:val="1"/>
               <w:jc w:val="center"/>
             </w:pPr>
             <w:r/>
@@ -5808,7 +5805,6 @@
           </w:tcPr>
           <w:p>
             <w:pPr>
-              <w:bidi w:val="1"/>
               <w:jc w:val="center"/>
             </w:pPr>
             <w:r/>
@@ -5827,7 +5823,6 @@
           </w:tcPr>
           <w:p>
             <w:pPr>
-              <w:bidi w:val="1"/>
               <w:jc w:val="center"/>
             </w:pPr>
             <w:r/>
@@ -5846,7 +5841,6 @@
           </w:tcPr>
           <w:p>
             <w:pPr>
-              <w:bidi w:val="1"/>
               <w:jc w:val="center"/>
             </w:pPr>
             <w:r/>
@@ -5886,7 +5880,6 @@
           </w:tcPr>
           <w:p>
             <w:pPr>
-              <w:bidi w:val="1"/>
               <w:jc w:val="center"/>
             </w:pPr>
             <w:r/>
@@ -5905,7 +5898,6 @@
           </w:tcPr>
           <w:p>
             <w:pPr>
-              <w:bidi w:val="1"/>
               <w:jc w:val="center"/>
             </w:pPr>
             <w:r/>
@@ -5924,7 +5916,6 @@
           </w:tcPr>
           <w:p>
             <w:pPr>
-              <w:bidi w:val="1"/>
               <w:jc w:val="center"/>
             </w:pPr>
             <w:r/>
@@ -5943,7 +5934,6 @@
           </w:tcPr>
           <w:p>
             <w:pPr>
-              <w:bidi w:val="1"/>
               <w:jc w:val="center"/>
             </w:pPr>
             <w:r/>
@@ -5962,7 +5952,6 @@
           </w:tcPr>
           <w:p>
             <w:pPr>
-              <w:bidi w:val="1"/>
               <w:jc w:val="center"/>
             </w:pPr>
             <w:r/>
@@ -6002,7 +5991,6 @@
           </w:tcPr>
           <w:p>
             <w:pPr>
-              <w:bidi w:val="1"/>
               <w:jc w:val="center"/>
             </w:pPr>
             <w:r/>
@@ -6021,7 +6009,6 @@
           </w:tcPr>
           <w:p>
             <w:pPr>
-              <w:bidi w:val="1"/>
               <w:jc w:val="center"/>
             </w:pPr>
             <w:r/>
@@ -6040,7 +6027,6 @@
           </w:tcPr>
           <w:p>
             <w:pPr>
-              <w:bidi w:val="1"/>
               <w:jc w:val="center"/>
             </w:pPr>
             <w:r/>
@@ -6059,7 +6045,6 @@
           </w:tcPr>
           <w:p>
             <w:pPr>
-              <w:bidi w:val="1"/>
               <w:jc w:val="center"/>
             </w:pPr>
             <w:r/>
@@ -6078,7 +6063,6 @@
           </w:tcPr>
           <w:p>
             <w:pPr>
-              <w:bidi w:val="1"/>
               <w:jc w:val="center"/>
             </w:pPr>
             <w:r/>
@@ -6087,7 +6071,7 @@
                 <w:b w:val="0"/>
                 <w:sz w:val="22"/>
               </w:rPr>
-              <w:t>[-0.004، 0.267]</w:t>
+              <w:t>[-0.004, 0.267]</w:t>
             </w:r>
           </w:p>
         </w:tc>
@@ -6118,7 +6102,6 @@
           </w:tcPr>
           <w:p>
             <w:pPr>
-              <w:bidi w:val="1"/>
               <w:jc w:val="center"/>
             </w:pPr>
             <w:r/>
@@ -6137,7 +6120,6 @@
           </w:tcPr>
           <w:p>
             <w:pPr>
-              <w:bidi w:val="1"/>
               <w:jc w:val="center"/>
             </w:pPr>
             <w:r/>
@@ -6156,7 +6138,6 @@
           </w:tcPr>
           <w:p>
             <w:pPr>
-              <w:bidi w:val="1"/>
               <w:jc w:val="center"/>
             </w:pPr>
             <w:r/>
@@ -6175,7 +6156,6 @@
           </w:tcPr>
           <w:p>
             <w:pPr>
-              <w:bidi w:val="1"/>
               <w:jc w:val="center"/>
             </w:pPr>
             <w:r/>
@@ -6194,7 +6174,6 @@
           </w:tcPr>
           <w:p>
             <w:pPr>
-              <w:bidi w:val="1"/>
               <w:jc w:val="center"/>
             </w:pPr>
             <w:r/>
@@ -6203,7 +6182,7 @@
                 <w:b w:val="0"/>
                 <w:sz w:val="22"/>
               </w:rPr>
-              <w:t>[0.094، 0.313]</w:t>
+              <w:t>[0.094, 0.313]</w:t>
             </w:r>
           </w:p>
         </w:tc>
@@ -6234,7 +6213,6 @@
           </w:tcPr>
           <w:p>
             <w:pPr>
-              <w:bidi w:val="1"/>
               <w:jc w:val="center"/>
             </w:pPr>
             <w:r/>
@@ -6253,7 +6231,6 @@
           </w:tcPr>
           <w:p>
             <w:pPr>
-              <w:bidi w:val="1"/>
               <w:jc w:val="center"/>
             </w:pPr>
             <w:r/>
@@ -6272,7 +6249,6 @@
           </w:tcPr>
           <w:p>
             <w:pPr>
-              <w:bidi w:val="1"/>
               <w:jc w:val="center"/>
             </w:pPr>
             <w:r/>
@@ -6291,7 +6267,6 @@
           </w:tcPr>
           <w:p>
             <w:pPr>
-              <w:bidi w:val="1"/>
               <w:jc w:val="center"/>
             </w:pPr>
             <w:r/>
@@ -6310,7 +6285,6 @@
           </w:tcPr>
           <w:p>
             <w:pPr>
-              <w:bidi w:val="1"/>
               <w:jc w:val="center"/>
             </w:pPr>
             <w:r/>
@@ -6319,12 +6293,48 @@
                 <w:b w:val="0"/>
                 <w:sz w:val="22"/>
               </w:rPr>
-              <w:t>[0.012، 0.142]</w:t>
+              <w:t>[0.012, 0.142]</w:t>
             </w:r>
           </w:p>
         </w:tc>
       </w:tr>
     </w:tbl>
+    <w:p>
+      <w:pPr>
+        <w:bidi w:val="1"/>
+        <w:spacing w:lineRule="exact" w:line="580" w:after="0"/>
+        <w:jc w:val="both"/>
+      </w:pPr>
+      <w:r>
+        <w:rPr>
+          <w:rFonts w:ascii="B Nazanin" w:hAnsi="B Nazanin" w:cs="B Nazanin" w:hint="cs"/>
+          <w:sz w:val="24"/>
+          <w:szCs w:val="24"/>
+          <w:rtl/>
+          <w:lang w:bidi="fa-IR"/>
+        </w:rPr>
+        <w:t xml:space="preserve">تفسیر</w:t>
+      </w:r>
+      <w:r>
+        <w:rPr>
+          <w:rFonts w:ascii="Times New Roman" w:hAnsi="Times New Roman" w:cs="Times New Roman"/>
+          <w:sz w:val="22"/>
+          <w:szCs w:val="22"/>
+          <w:lang w:val="en-US"/>
+        </w:rPr>
+        <w:t xml:space="preserve"> H1: </w:t>
+      </w:r>
+      <w:r>
+        <w:rPr>
+          <w:rFonts w:ascii="B Nazanin" w:hAnsi="B Nazanin" w:cs="B Nazanin" w:hint="cs"/>
+          <w:sz w:val="24"/>
+          <w:szCs w:val="24"/>
+          <w:rtl/>
+          <w:lang w:bidi="fa-IR"/>
+        </w:rPr>
+        <w:t xml:space="preserve">میانجی‌گری از نوع جزئی تأیید می‌شود؛ اما چون کرانه پایینِ بازه اطمینان اثر غیرمستقیم (۰٫۰۱۲) به صفر نزدیک است، این تأیید باید محتاطانه خوانده شود: معناداری مسیر غیرمستقیم از نظر آماری برقرار است، ولی اندازه آن کوچک تا متوسط و حساس به بازنمونه‌گیری است و تکریر آن در نمونه مستقل ضرورت دارد.</w:t>
+      </w:r>
+    </w:p>
     <w:p>
       <w:pPr>
         <w:pStyle w:val="Heading2"/>
@@ -6548,7 +6558,6 @@
           </w:tcPr>
           <w:p>
             <w:pPr>
-              <w:bidi w:val="1"/>
               <w:jc w:val="center"/>
             </w:pPr>
             <w:r/>
@@ -6570,7 +6579,6 @@
           </w:tcPr>
           <w:p>
             <w:pPr>
-              <w:bidi w:val="1"/>
               <w:jc w:val="center"/>
             </w:pPr>
             <w:r/>
@@ -6592,7 +6600,6 @@
           </w:tcPr>
           <w:p>
             <w:pPr>
-              <w:bidi w:val="1"/>
               <w:jc w:val="center"/>
             </w:pPr>
             <w:r/>
@@ -6614,7 +6621,6 @@
           </w:tcPr>
           <w:p>
             <w:pPr>
-              <w:bidi w:val="1"/>
               <w:jc w:val="center"/>
             </w:pPr>
             <w:r/>
@@ -6636,7 +6642,6 @@
           </w:tcPr>
           <w:p>
             <w:pPr>
-              <w:bidi w:val="1"/>
               <w:jc w:val="center"/>
             </w:pPr>
             <w:r/>
@@ -6658,7 +6663,6 @@
           </w:tcPr>
           <w:p>
             <w:pPr>
-              <w:bidi w:val="1"/>
               <w:jc w:val="center"/>
             </w:pPr>
             <w:r/>
@@ -6680,7 +6684,6 @@
           </w:tcPr>
           <w:p>
             <w:pPr>
-              <w:bidi w:val="1"/>
               <w:jc w:val="center"/>
             </w:pPr>
             <w:r/>
@@ -6720,7 +6723,6 @@
           </w:tcPr>
           <w:p>
             <w:pPr>
-              <w:bidi w:val="1"/>
               <w:jc w:val="center"/>
             </w:pPr>
             <w:r/>
@@ -6739,7 +6741,6 @@
           </w:tcPr>
           <w:p>
             <w:pPr>
-              <w:bidi w:val="1"/>
               <w:jc w:val="center"/>
             </w:pPr>
             <w:r/>
@@ -6758,7 +6759,6 @@
           </w:tcPr>
           <w:p>
             <w:pPr>
-              <w:bidi w:val="1"/>
               <w:jc w:val="center"/>
             </w:pPr>
             <w:r/>
@@ -6777,7 +6777,6 @@
           </w:tcPr>
           <w:p>
             <w:pPr>
-              <w:bidi w:val="1"/>
               <w:jc w:val="center"/>
             </w:pPr>
             <w:r/>
@@ -6796,7 +6795,6 @@
           </w:tcPr>
           <w:p>
             <w:pPr>
-              <w:bidi w:val="1"/>
               <w:jc w:val="center"/>
             </w:pPr>
             <w:r/>
@@ -6815,7 +6813,6 @@
           </w:tcPr>
           <w:p>
             <w:pPr>
-              <w:bidi w:val="1"/>
               <w:jc w:val="center"/>
             </w:pPr>
             <w:r/>
@@ -6834,7 +6831,6 @@
           </w:tcPr>
           <w:p>
             <w:pPr>
-              <w:bidi w:val="1"/>
               <w:jc w:val="center"/>
             </w:pPr>
             <w:r/>
@@ -6874,7 +6870,6 @@
           </w:tcPr>
           <w:p>
             <w:pPr>
-              <w:bidi w:val="1"/>
               <w:jc w:val="center"/>
             </w:pPr>
             <w:r/>
@@ -6883,7 +6878,7 @@
                 <w:b w:val="0"/>
                 <w:sz w:val="22"/>
               </w:rPr>
-              <w:t>0٫00</w:t>
+              <w:t>0.00</w:t>
             </w:r>
           </w:p>
         </w:tc>
@@ -6893,7 +6888,6 @@
           </w:tcPr>
           <w:p>
             <w:pPr>
-              <w:bidi w:val="1"/>
               <w:jc w:val="center"/>
             </w:pPr>
             <w:r/>
@@ -6912,7 +6906,6 @@
           </w:tcPr>
           <w:p>
             <w:pPr>
-              <w:bidi w:val="1"/>
               <w:jc w:val="center"/>
             </w:pPr>
             <w:r/>
@@ -6931,7 +6924,6 @@
           </w:tcPr>
           <w:p>
             <w:pPr>
-              <w:bidi w:val="1"/>
               <w:jc w:val="center"/>
             </w:pPr>
             <w:r/>
@@ -6940,7 +6932,7 @@
                 <w:b w:val="0"/>
                 <w:sz w:val="22"/>
               </w:rPr>
-              <w:t>1٫000</w:t>
+              <w:t>1.000</w:t>
             </w:r>
           </w:p>
         </w:tc>
@@ -6950,7 +6942,6 @@
           </w:tcPr>
           <w:p>
             <w:pPr>
-              <w:bidi w:val="1"/>
               <w:jc w:val="center"/>
             </w:pPr>
             <w:r/>
@@ -6959,7 +6950,7 @@
                 <w:b w:val="0"/>
                 <w:sz w:val="22"/>
               </w:rPr>
-              <w:t>1٫000</w:t>
+              <w:t>1.000</w:t>
             </w:r>
           </w:p>
         </w:tc>
@@ -6969,7 +6960,6 @@
           </w:tcPr>
           <w:p>
             <w:pPr>
-              <w:bidi w:val="1"/>
               <w:jc w:val="center"/>
             </w:pPr>
             <w:r/>
@@ -6978,7 +6968,7 @@
                 <w:b w:val="0"/>
                 <w:sz w:val="22"/>
               </w:rPr>
-              <w:t>0٫000</w:t>
+              <w:t>0.000</w:t>
             </w:r>
           </w:p>
         </w:tc>
@@ -6988,7 +6978,6 @@
           </w:tcPr>
           <w:p>
             <w:pPr>
-              <w:bidi w:val="1"/>
               <w:jc w:val="center"/>
             </w:pPr>
             <w:r/>
@@ -6997,7 +6986,7 @@
                 <w:b w:val="0"/>
                 <w:sz w:val="22"/>
               </w:rPr>
-              <w:t>0٫000</w:t>
+              <w:t>0.000</w:t>
             </w:r>
           </w:p>
         </w:tc>
@@ -7017,7 +7006,102 @@
           <w:rtl/>
           <w:lang w:bidi="fa-IR"/>
         </w:rPr>
-        <w:t xml:space="preserve">پیشنهاد برای بررسی در داده واقعی (نه نتیجه قطعی در این سند آموزشی): چون الگوی حاضر بر نمره‌های کلِ مشاهده‌پذیر استوار است و خطای اندازه‌گیری و علت‌مندی در آن مدل‌سازی نشده، در داده واقعی پیشنهاد می‌شود مدل نهفت‌نگار با پارسل‌بندی گویه‌ها (به‌ویژه برای مقیاس ۷۵گویه‌ای طرحواره) در برابر همان الگوی سه‌متغیره و نیز مدل رقیب «اثر مستقیمِ صرف» آزمون شود؛ ممکن است چنین برآوردی</w:t>
+        <w:t xml:space="preserve">بر اساس آستانه‌های متعارف، تنها</w:t>
+      </w:r>
+      <w:r>
+        <w:rPr>
+          <w:rFonts w:ascii="Times New Roman" w:hAnsi="Times New Roman" w:cs="Times New Roman"/>
+          <w:sz w:val="22"/>
+          <w:szCs w:val="22"/>
+          <w:lang w:val="en-US"/>
+        </w:rPr>
+        <w:t xml:space="preserve"> CFI </w:t>
+      </w:r>
+      <w:r>
+        <w:rPr>
+          <w:rFonts w:ascii="B Nazanin" w:hAnsi="B Nazanin" w:cs="B Nazanin" w:hint="cs"/>
+          <w:sz w:val="24"/>
+          <w:szCs w:val="24"/>
+          <w:rtl/>
+          <w:lang w:bidi="fa-IR"/>
+        </w:rPr>
+        <w:t xml:space="preserve">در سطح قابل قبول قرار گرفت </w:t>
+      </w:r>
+      <w:r>
+        <w:rPr>
+          <w:rFonts w:ascii="Times New Roman" w:hAnsi="Times New Roman" w:cs="Times New Roman"/>
+          <w:sz w:val="22"/>
+          <w:szCs w:val="22"/>
+          <w:lang w:val="en-US"/>
+        </w:rPr>
+        <w:t xml:space="preserve">(CFI = 0.940, SRMR = 0.080)</w:t>
+      </w:r>
+      <w:r>
+        <w:rPr>
+          <w:rFonts w:ascii="B Nazanin" w:hAnsi="B Nazanin" w:cs="B Nazanin" w:hint="cs"/>
+          <w:sz w:val="24"/>
+          <w:szCs w:val="24"/>
+          <w:rtl/>
+          <w:lang w:bidi="fa-IR"/>
+        </w:rPr>
+        <w:t xml:space="preserve">. در مقابل،</w:t>
+      </w:r>
+      <w:r>
+        <w:rPr>
+          <w:rFonts w:ascii="Times New Roman" w:hAnsi="Times New Roman" w:cs="Times New Roman"/>
+          <w:sz w:val="22"/>
+          <w:szCs w:val="22"/>
+          <w:lang w:val="en-US"/>
+        </w:rPr>
+        <w:t xml:space="preserve"> TLI = 0.819 </w:t>
+      </w:r>
+      <w:r>
+        <w:rPr>
+          <w:rFonts w:ascii="B Nazanin" w:hAnsi="B Nazanin" w:cs="B Nazanin" w:hint="cs"/>
+          <w:sz w:val="24"/>
+          <w:szCs w:val="24"/>
+          <w:rtl/>
+          <w:lang w:bidi="fa-IR"/>
+        </w:rPr>
+        <w:t xml:space="preserve">و</w:t>
+      </w:r>
+      <w:r>
+        <w:rPr>
+          <w:rFonts w:ascii="Times New Roman" w:hAnsi="Times New Roman" w:cs="Times New Roman"/>
+          <w:sz w:val="22"/>
+          <w:szCs w:val="22"/>
+          <w:lang w:val="en-US"/>
+        </w:rPr>
+        <w:t xml:space="preserve"> RMSEA = 0.146 </w:t>
+      </w:r>
+      <w:r>
+        <w:rPr>
+          <w:rFonts w:ascii="B Nazanin" w:hAnsi="B Nazanin" w:cs="B Nazanin" w:hint="cs"/>
+          <w:sz w:val="24"/>
+          <w:szCs w:val="24"/>
+          <w:rtl/>
+          <w:lang w:bidi="fa-IR"/>
+        </w:rPr>
+        <w:t xml:space="preserve">از حد مطلوب فاصله دارند. بنابراین این مدل تأییدشده روش‌شناختی اعلام نمی‌شود: اگرچه</w:t>
+      </w:r>
+      <w:r>
+        <w:rPr>
+          <w:rFonts w:ascii="Times New Roman" w:hAnsi="Times New Roman" w:cs="Times New Roman"/>
+          <w:sz w:val="22"/>
+          <w:szCs w:val="22"/>
+          <w:lang w:val="en-US"/>
+        </w:rPr>
+        <w:t xml:space="preserve"> CFI </w:t>
+      </w:r>
+      <w:r>
+        <w:rPr>
+          <w:rFonts w:ascii="B Nazanin" w:hAnsi="B Nazanin" w:cs="B Nazanin" w:hint="cs"/>
+          <w:sz w:val="24"/>
+          <w:szCs w:val="24"/>
+          <w:rtl/>
+          <w:lang w:bidi="fa-IR"/>
+        </w:rPr>
+        <w:t xml:space="preserve">در سطح قابل قبول قرار گرفت، مقادیر</w:t>
       </w:r>
       <w:r>
         <w:rPr>
@@ -7055,7 +7139,100 @@
           <w:rtl/>
           <w:lang w:bidi="fa-IR"/>
         </w:rPr>
-        <w:t xml:space="preserve">را بدون هیچ دست‌کاری در داده به بازه مطلوب نزدیک کند. در نسخه آموزشی حاضر داده‌ها برای «زیباتر شدن» شاخص‌ها تغییر داده نشده‌اند و همین اعداد گزارش شده‌اند.</w:t>
+        <w:t xml:space="preserve">حاکی از برازش رضایت‌بخش مدل کامل نبودند؛ از این رو نتایج</w:t>
+      </w:r>
+      <w:r>
+        <w:rPr>
+          <w:rFonts w:ascii="Times New Roman" w:hAnsi="Times New Roman" w:cs="Times New Roman"/>
+          <w:sz w:val="22"/>
+          <w:szCs w:val="22"/>
+          <w:lang w:val="en-US"/>
+        </w:rPr>
+        <w:t xml:space="preserve"> SEM </w:t>
+      </w:r>
+      <w:r>
+        <w:rPr>
+          <w:rFonts w:ascii="B Nazanin" w:hAnsi="B Nazanin" w:cs="B Nazanin" w:hint="cs"/>
+          <w:sz w:val="24"/>
+          <w:szCs w:val="24"/>
+          <w:rtl/>
+          <w:lang w:bidi="fa-IR"/>
+        </w:rPr>
+        <w:t xml:space="preserve">باید با احتیاط تفسیر شوند و تحلیل</w:t>
+      </w:r>
+      <w:r>
+        <w:rPr>
+          <w:rFonts w:ascii="Times New Roman" w:hAnsi="Times New Roman" w:cs="Times New Roman"/>
+          <w:sz w:val="22"/>
+          <w:szCs w:val="22"/>
+          <w:lang w:val="en-US"/>
+        </w:rPr>
+        <w:t xml:space="preserve"> PROCESS </w:t>
+      </w:r>
+      <w:r>
+        <w:rPr>
+          <w:rFonts w:ascii="B Nazanin" w:hAnsi="B Nazanin" w:cs="B Nazanin" w:hint="cs"/>
+          <w:sz w:val="24"/>
+          <w:szCs w:val="24"/>
+          <w:rtl/>
+          <w:lang w:bidi="fa-IR"/>
+        </w:rPr>
+        <w:t xml:space="preserve">به‌عنوان تحلیل اصلی میانجی‌گری ملاک قرار می‌گیرد. هم‌جهتی معنادار مسیرهای</w:t>
+      </w:r>
+      <w:r>
+        <w:rPr>
+          <w:rFonts w:ascii="Times New Roman" w:hAnsi="Times New Roman" w:cs="Times New Roman"/>
+          <w:sz w:val="22"/>
+          <w:szCs w:val="22"/>
+          <w:lang w:val="en-US"/>
+        </w:rPr>
+        <w:t xml:space="preserve"> a </w:t>
+      </w:r>
+      <w:r>
+        <w:rPr>
+          <w:rFonts w:ascii="B Nazanin" w:hAnsi="B Nazanin" w:cs="B Nazanin" w:hint="cs"/>
+          <w:sz w:val="24"/>
+          <w:szCs w:val="24"/>
+          <w:rtl/>
+          <w:lang w:bidi="fa-IR"/>
+        </w:rPr>
+        <w:t xml:space="preserve">و</w:t>
+      </w:r>
+      <w:r>
+        <w:rPr>
+          <w:rFonts w:ascii="Times New Roman" w:hAnsi="Times New Roman" w:cs="Times New Roman"/>
+          <w:sz w:val="22"/>
+          <w:szCs w:val="22"/>
+          <w:lang w:val="en-US"/>
+        </w:rPr>
+        <w:t xml:space="preserve"> b </w:t>
+      </w:r>
+      <w:r>
+        <w:rPr>
+          <w:rFonts w:ascii="B Nazanin" w:hAnsi="B Nazanin" w:cs="B Nazanin" w:hint="cs"/>
+          <w:sz w:val="24"/>
+          <w:szCs w:val="24"/>
+          <w:rtl/>
+          <w:lang w:bidi="fa-IR"/>
+        </w:rPr>
+        <w:t xml:space="preserve">در هر دو روش، حمایت جهت‌دار از الگو است نه اثبات برازش.</w:t>
+      </w:r>
+    </w:p>
+    <w:p>
+      <w:pPr>
+        <w:bidi w:val="1"/>
+        <w:spacing w:lineRule="exact" w:line="580" w:after="0"/>
+        <w:jc w:val="both"/>
+      </w:pPr>
+      <w:r>
+        <w:rPr>
+          <w:rFonts w:ascii="B Nazanin" w:hAnsi="B Nazanin" w:cs="B Nazanin" w:hint="cs"/>
+          <w:sz w:val="24"/>
+          <w:szCs w:val="24"/>
+          <w:rtl/>
+          <w:lang w:bidi="fa-IR"/>
+        </w:rPr>
+        <w:t xml:space="preserve">پیشنهاد روش‌شناختی برای پژوهش‌های بعدی: چون الگوی آزموده‌شده بر نمره‌های کلِ مشاهده‌پذیر استوار است و خطای اندازه‌گیری در آن مدل‌سازی نشده، پیشنهاد می‌شود در پژوهش‌های بعدی مدل نهفت‌نگار با پارسل‌بندی گویه‌ها (به‌ویژه برای مقیاس ۷۵گویه‌ای طرحواره) در برابر همان الگوی سه‌متغیره و نیز مدل رقیب «اثر مستقیمِ صرف» آزمون شود؛ چنین مقایسه‌ای می‌تواند برآورد دقیق‌تری از برازش ساختار و سهم خطای اندازه‌گیری ارائه کند.</w:t>
       </w:r>
     </w:p>
     <w:p>
@@ -7198,7 +7375,6 @@
           </w:tcPr>
           <w:p>
             <w:pPr>
-              <w:bidi w:val="1"/>
               <w:jc w:val="center"/>
             </w:pPr>
             <w:r/>
@@ -7257,7 +7433,6 @@
           </w:tcPr>
           <w:p>
             <w:pPr>
-              <w:bidi w:val="1"/>
               <w:jc w:val="center"/>
             </w:pPr>
             <w:r/>
@@ -7276,7 +7451,6 @@
           </w:tcPr>
           <w:p>
             <w:pPr>
-              <w:bidi w:val="1"/>
               <w:jc w:val="center"/>
             </w:pPr>
             <w:r/>
@@ -7335,7 +7509,6 @@
           </w:tcPr>
           <w:p>
             <w:pPr>
-              <w:bidi w:val="1"/>
               <w:jc w:val="center"/>
             </w:pPr>
             <w:r/>
@@ -7354,7 +7527,6 @@
           </w:tcPr>
           <w:p>
             <w:pPr>
-              <w:bidi w:val="1"/>
               <w:jc w:val="center"/>
             </w:pPr>
             <w:r/>
@@ -7413,7 +7585,6 @@
           </w:tcPr>
           <w:p>
             <w:pPr>
-              <w:bidi w:val="1"/>
               <w:jc w:val="center"/>
             </w:pPr>
             <w:r/>
@@ -7432,7 +7603,6 @@
           </w:tcPr>
           <w:p>
             <w:pPr>
-              <w:bidi w:val="1"/>
               <w:jc w:val="center"/>
             </w:pPr>
             <w:r/>
@@ -7491,7 +7661,6 @@
           </w:tcPr>
           <w:p>
             <w:pPr>
-              <w:bidi w:val="1"/>
               <w:jc w:val="center"/>
             </w:pPr>
             <w:r/>
@@ -7510,7 +7679,6 @@
           </w:tcPr>
           <w:p>
             <w:pPr>
-              <w:bidi w:val="1"/>
               <w:jc w:val="center"/>
             </w:pPr>
             <w:r/>
@@ -7519,12 +7687,48 @@
                 <w:b w:val="0"/>
                 <w:sz w:val="22"/>
               </w:rPr>
-              <w:t>CI [0.012، 0.142]</w:t>
+              <w:t>CI [0.012, 0.142]</w:t>
             </w:r>
           </w:p>
         </w:tc>
       </w:tr>
     </w:tbl>
+    <w:p>
+      <w:pPr>
+        <w:bidi w:val="1"/>
+        <w:spacing w:lineRule="exact" w:line="580" w:after="0"/>
+        <w:jc w:val="both"/>
+      </w:pPr>
+      <w:r>
+        <w:rPr>
+          <w:rFonts w:ascii="B Nazanin" w:hAnsi="B Nazanin" w:cs="B Nazanin" w:hint="cs"/>
+          <w:sz w:val="24"/>
+          <w:szCs w:val="24"/>
+          <w:rtl/>
+          <w:lang w:bidi="fa-IR"/>
+        </w:rPr>
+        <w:t xml:space="preserve">الگوی کلی یافته‌ها: اضطراب صفتی نخست طرحواره‌های ناسازگار را فعال می‌کند و این طرحواره‌ها بخشی از اثر را به رفتارهای پرخطر مالی منتقل می‌کنند؛ مسیری مستقیم و مستقل نیز باقی می‌ماند که احتمالاً بازتاب هیجان‌های موقعیتی و سبک‌های شخصیِ ریسک‌پذیری است. سهم نزدیک به نصفیِ مسیر غیرمستقیم، مداخله طرحواره‌محور را توجیه می‌کند، اما عدم صفرشدن</w:t>
+      </w:r>
+      <w:r>
+        <w:rPr>
+          <w:rFonts w:ascii="Times New Roman" w:hAnsi="Times New Roman" w:cs="Times New Roman"/>
+          <w:sz w:val="22"/>
+          <w:szCs w:val="22"/>
+          <w:lang w:val="en-US"/>
+        </w:rPr>
+        <w:t xml:space="preserve"> c′ </w:t>
+      </w:r>
+      <w:r>
+        <w:rPr>
+          <w:rFonts w:ascii="B Nazanin" w:hAnsi="B Nazanin" w:cs="B Nazanin" w:hint="cs"/>
+          <w:sz w:val="24"/>
+          <w:szCs w:val="24"/>
+          <w:rtl/>
+          <w:lang w:bidi="fa-IR"/>
+        </w:rPr>
+        <w:t xml:space="preserve">هشدار می‌دهد که صرفِ بازسازی شناختی کافی نیست و باید آموزش مدیریت اضطراب و سواد مالی نیز در برنامه باشد.</w:t>
+      </w:r>
+    </w:p>
     <w:p>
       <w:pPr>
         <w:bidi w:val="1"/>

</xml_diff>

<commit_message>
fix: apply first-occurrence footnote rule to chapter 4 simulation
</commit_message>
<xml_diff>
--- a/output/final/chapter4_simulated_full_demo_v2.docx
+++ b/output/final/chapter4_simulated_full_demo_v2.docx
@@ -112,26 +112,7 @@
           <w:rtl/>
           <w:lang w:bidi="fa-IR"/>
         </w:rPr>
-        <w:t xml:space="preserve">مراحل اجرای تحلیل عبارت بودند از: غربالگری داده‌ها و تعیین نمونه معتبر بر اساس معیارهای از پیش ثبت‌شده؛ برآورد آمار توصیفی ویژگی‌های جمعیت‌شناختی و متغیرهای اصلی پژوهش؛ بررسی پایایی ابزارهای اندازه‌گیری با ضریب آلفای کرونباخ؛ ارزیابی پیش‌فرض‌های تحلیل استنباطی شامل نرمال بودن توزیع‌ها، نبود داده‌های پرت چندمتغیره، عدم هم‌خطی و استقلال پسماندها؛ آزمون فرضیه‌های فرعی با ضریب همبستگی پیرسون؛ و در نهایت آزمون فرضیه اصلی با تحلیل میانجی‌گری بر اساس الگوی مدل ۴ هایز </w:t>
-      </w:r>
-      <w:r>
-        <w:rPr>
-          <w:rFonts w:ascii="Times New Roman" w:hAnsi="Times New Roman" w:cs="Times New Roman"/>
-          <w:sz w:val="22"/>
-          <w:szCs w:val="22"/>
-          <w:lang w:val="en-US"/>
-        </w:rPr>
-        <w:t xml:space="preserve">(PROCESS Model 4)</w:t>
-      </w:r>
-      <w:r>
-        <w:rPr>
-          <w:rFonts w:ascii="B Nazanin" w:hAnsi="B Nazanin" w:cs="B Nazanin" w:hint="cs"/>
-          <w:sz w:val="24"/>
-          <w:szCs w:val="24"/>
-          <w:rtl/>
-          <w:lang w:bidi="fa-IR"/>
-        </w:rPr>
-        <w:t xml:space="preserve"> همراه با بوت‌استرپ ۵۰۰۰ بازنمونه‌گیری. به‌منظور پشتیابی یافته‌ها، الگوی مسیر به‌روش معادلات ساختاری و با برآورد درست‌نمایی بیشینه نیز برازش داده شد تا همگرایی نتایج در دو چارچوب تحلیلی بررسی شود.</w:t>
+        <w:t xml:space="preserve">مراحل اجرای تحلیل عبارت بودند از: غربالگری داده‌ها و تعیین نمونه معتبر بر اساس معیارهای از پیش ثبت‌شده؛ برآورد آمار توصیفی ویژگی‌های جمعیت‌شناختی و متغیرهای اصلی پژوهش؛ بررسی پایایی ابزارهای اندازه‌گیری با ضریب آلفای کرونباخ؛ ارزیابی پیش‌فرض‌های تحلیل استنباطی شامل نرمال بودن توزیع‌ها، نبود داده‌های پرت چندمتغیره، عدم هم‌خطی و استقلال پسماندها؛ آزمون فرضیه‌های فرعی با ضریب همبستگی پیرسون؛ و در نهایت آزمون فرضیه اصلی با تحلیل میانجی‌گری بر اساس الگوی مدل ۴ هایز همراه با بوت‌استرپ ۵۰۰۰ بازنمونه‌گیری. به‌منظور پشتیابی یافته‌ها، الگوی مسیر به‌روش معادلات ساختاری و با برآورد درست‌نمایی بیشینه نیز برازش داده شد تا همگرایی نتایج در دو چارچوب تحلیلی بررسی شود.</w:t>
       </w:r>
     </w:p>
     <w:p>
@@ -201,16 +182,15 @@
           <w:rtl/>
           <w:lang w:bidi="fa-IR"/>
         </w:rPr>
-        <w:t xml:space="preserve">در مرحله نخست، پرونده‌هایی که فرم رضایت آگاهانه را تکمیل نکرده یا صریحاً رد کرده بودند حذف شدند؛ کسب رضایت آگاهانه پیش‌شرط اخلاقی و روش‌شناختی ورود هر پرونده به تحلیل است. در مرحله دوم، پرسشنامه‌هایی که بیش از ۳۰٪ گویه‌هایشان بی‌پاسخ مانده بود کنار گذاشته شدند تا برآوردگرها با الگوهای آشفته مقادیر گم‌شده مواجه نشوند. در مرحله سوم، پاسخ‌های با الگوی یکنواخت </w:t>
+        <w:t xml:space="preserve">در مرحله نخست، پرونده‌هایی که فرم رضایت آگاهانه را تکمیل نکرده یا صریحاً رد کرده بودند حذف شدند؛ کسب رضایت آگاهانه پیش‌شرط اخلاقی و روش‌شناختی ورود هر پرونده به تحلیل است. در مرحله دوم، پرسشنامه‌هایی که بیش از ۳۰٪ گویه‌هایشان بی‌پاسخ مانده بود کنار گذاشته شدند تا برآوردگرها با الگوهای آشفته مقادیر گم‌شده مواجه نشوند. در مرحله سوم، پاسخ‌های با الگوی یکنواخت</w:t>
       </w:r>
       <w:r>
         <w:rPr>
-          <w:rFonts w:ascii="Times New Roman" w:hAnsi="Times New Roman" w:cs="Times New Roman"/>
-          <w:sz w:val="22"/>
-          <w:szCs w:val="22"/>
-          <w:lang w:val="en-US"/>
+          <w:rFonts w:ascii="B Nazanin" w:hAnsi="B Nazanin" w:cs="B Nazanin" w:hint="cs"/>
+          <w:vertAlign w:val="superscript"/>
+          <w:rtl/>
         </w:rPr>
-        <w:t xml:space="preserve">(Straight-lining)</w:t>
+        <w:footnoteReference w:id="1"/>
       </w:r>
       <w:r>
         <w:rPr>
@@ -5337,16 +5317,15 @@
           <w:rtl/>
           <w:lang w:bidi="fa-IR"/>
         </w:rPr>
-        <w:t xml:space="preserve">است و معناداری آن بر اساس بازه اطمینان ۹۵٪ِ ۵۰۰۰ بازنمونه بوت‌استرپ </w:t>
+        <w:t xml:space="preserve">است و معناداری آن بر اساس بازه اطمینان ۹۵٪ِ ۵۰۰۰ بازنمونه بوت‌استرپ</w:t>
       </w:r>
       <w:r>
         <w:rPr>
-          <w:rFonts w:ascii="Times New Roman" w:hAnsi="Times New Roman" w:cs="Times New Roman"/>
-          <w:sz w:val="22"/>
-          <w:szCs w:val="22"/>
-          <w:lang w:val="en-US"/>
+          <w:rFonts w:ascii="B Nazanin" w:hAnsi="B Nazanin" w:cs="B Nazanin" w:hint="cs"/>
+          <w:vertAlign w:val="superscript"/>
+          <w:rtl/>
         </w:rPr>
-        <w:t xml:space="preserve">(Percentile)</w:t>
+        <w:footnoteReference w:id="2"/>
       </w:r>
       <w:r>
         <w:rPr>
@@ -7811,6 +7790,67 @@
 </w:ftr>
 </file>
 
+<file path=word/footnotes.xml><?xml version="1.0" encoding="utf-8"?>
+<w:footnotes xmlns:w="http://schemas.openxmlformats.org/wordprocessingml/2006/main">
+  <w:footnote w:type="separator" w:id="-1">
+    <w:p>
+      <w:r>
+        <w:separator/>
+      </w:r>
+    </w:p>
+  </w:footnote>
+  <w:footnote w:type="continuationSeparator" w:id="0">
+    <w:p>
+      <w:r>
+        <w:continuationSeparator/>
+      </w:r>
+    </w:p>
+  </w:footnote>
+  <w:footnote w:id="1">
+    <w:p>
+      <w:pPr>
+        <w:bidi w:val="0"/>
+      </w:pPr>
+      <w:r>
+        <w:rPr>
+          <w:vertAlign w:val="superscript"/>
+        </w:rPr>
+        <w:footnoteRef/>
+      </w:r>
+      <w:r>
+        <w:rPr>
+          <w:rFonts w:ascii="Times New Roman" w:hAnsi="Times New Roman" w:cs="Times New Roman"/>
+          <w:sz w:val="20"/>
+          <w:szCs w:val="20"/>
+        </w:rPr>
+        <w:t xml:space="preserve"> Straight-lining</w:t>
+      </w:r>
+    </w:p>
+  </w:footnote>
+  <w:footnote w:id="2">
+    <w:p>
+      <w:pPr>
+        <w:bidi w:val="0"/>
+      </w:pPr>
+      <w:r>
+        <w:rPr>
+          <w:vertAlign w:val="superscript"/>
+        </w:rPr>
+        <w:footnoteRef/>
+      </w:r>
+      <w:r>
+        <w:rPr>
+          <w:rFonts w:ascii="Times New Roman" w:hAnsi="Times New Roman" w:cs="Times New Roman"/>
+          <w:sz w:val="20"/>
+          <w:szCs w:val="20"/>
+        </w:rPr>
+        <w:t xml:space="preserve"> Percentile</w:t>
+      </w:r>
+    </w:p>
+  </w:footnote>
+</w:footnotes>
+</file>
+
 <file path=word/numbering.xml><?xml version="1.0" encoding="utf-8"?>
 <w:numbering xmlns:wpc="http://schemas.microsoft.com/office/word/2010/wordprocessingCanvas" xmlns:mo="http://schemas.microsoft.com/office/mac/office/2008/main" xmlns:mc="http://schemas.openxmlformats.org/markup-compatibility/2006" xmlns:mv="urn:schemas-microsoft-com:mac:vml" xmlns:o="urn:schemas-microsoft-com:office:office" xmlns:r="http://schemas.openxmlformats.org/officeDocument/2006/relationships" xmlns:m="http://schemas.openxmlformats.org/officeDocument/2006/math" xmlns:v="urn:schemas-microsoft-com:vml" xmlns:wp14="http://schemas.microsoft.com/office/word/2010/wordprocessingDrawing" xmlns:wp="http://schemas.openxmlformats.org/drawingml/2006/wordprocessingDrawing" xmlns:w10="urn:schemas-microsoft-com:office:word" xmlns:w="http://schemas.openxmlformats.org/wordprocessingml/2006/main" xmlns:w14="http://schemas.microsoft.com/office/word/2010/wordml" xmlns:wpg="http://schemas.microsoft.com/office/word/2010/wordprocessingGroup" xmlns:wpi="http://schemas.microsoft.com/office/word/2010/wordprocessingInk" xmlns:wne="http://schemas.microsoft.com/office/word/2006/wordml" xmlns:wps="http://schemas.microsoft.com/office/word/2010/wordprocessingShape" mc:Ignorable="w14 wp14">
   <w:abstractNum w:abstractNumId="0">

</xml_diff>

<commit_message>
fix: correct percentile footnote and verify cross-document footnote consistency
</commit_message>
<xml_diff>
--- a/output/final/chapter4_simulated_full_demo_v2.docx
+++ b/output/final/chapter4_simulated_full_demo_v2.docx
@@ -5118,18 +5118,7 @@
           <w:rtl/>
           <w:lang w:bidi="fa-IR"/>
         </w:rPr>
-        <w:t xml:space="preserve">۴-۸. آزمون فرضیه اصلی: میانجی‌گری با</w:t>
-      </w:r>
-      <w:r>
-        <w:rPr>
-          <w:rFonts w:ascii="Times New Roman" w:hAnsi="Times New Roman" w:cs="Times New Roman"/>
-          <w:b/>
-          <w:bCs/>
-          <w:sz w:val="28"/>
-          <w:szCs w:val="28"/>
-          <w:lang w:val="en-US"/>
-        </w:rPr>
-        <w:t xml:space="preserve"> PROCESS Model 4</w:t>
+        <w:t xml:space="preserve">۴-۸. آزمون فرضیه اصلی: میانجی‌گری با الگوی شماره ۴ پراسس</w:t>
       </w:r>
     </w:p>
     <w:p>
@@ -5317,7 +5306,7 @@
           <w:rtl/>
           <w:lang w:bidi="fa-IR"/>
         </w:rPr>
-        <w:t xml:space="preserve">است و معناداری آن بر اساس بازه اطمینان ۹۵٪ِ ۵۰۰۰ بازنمونه بوت‌استرپ</w:t>
+        <w:t xml:space="preserve">است و معناداری آن بر اساس فاصله اطمینان ۹۵٪ به روش صدکی</w:t>
       </w:r>
       <w:r>
         <w:rPr>
@@ -5335,7 +5324,7 @@
           <w:rtl/>
           <w:lang w:bidi="fa-IR"/>
         </w:rPr>
-        <w:t xml:space="preserve"> قضاوت شد، زیرا توزیع نمونه‌گیریِ حاصل‌ضرب ضرایب معمولاً نامتقارن است. تعداد بازنمونه‌ها بر پایه تنظیم از پیش اعلام‌شده فصل ۳ برای تحلیل اصلی (۵۰۰۰ بازنمونه) تعیین شد تا روش با پروتکل پژوهش هم‌راستا بماند.</w:t>
+        <w:t xml:space="preserve"> بر پایه ۵۰۰۰ بازنمونه بوت‌استرپ قضاوت شد، زیرا توزیع نمونه‌گیریِ حاصل‌ضرب ضرایب معمولاً نامتقارن است. تعداد بازنمونه‌ها بر پایه تنظیم از پیش اعلام‌شده فصل ۳ برای تحلیل اصلی (۵۰۰۰ بازنمونه) تعیین شد تا روش با پروتکل پژوهش هم‌راستا بماند.</w:t>
       </w:r>
     </w:p>
     <w:p>
@@ -6347,26 +6336,7 @@
           <w:rtl/>
           <w:lang w:bidi="fa-IR"/>
         </w:rPr>
-        <w:t xml:space="preserve">برای سنجش همگرایی با</w:t>
-      </w:r>
-      <w:r>
-        <w:rPr>
-          <w:rFonts w:ascii="Times New Roman" w:hAnsi="Times New Roman" w:cs="Times New Roman"/>
-          <w:sz w:val="22"/>
-          <w:szCs w:val="22"/>
-          <w:lang w:val="en-US"/>
-        </w:rPr>
-        <w:t xml:space="preserve"> PROCESS</w:t>
-      </w:r>
-      <w:r>
-        <w:rPr>
-          <w:rFonts w:ascii="B Nazanin" w:hAnsi="B Nazanin" w:cs="B Nazanin" w:hint="cs"/>
-          <w:sz w:val="24"/>
-          <w:szCs w:val="24"/>
-          <w:rtl/>
-          <w:lang w:bidi="fa-IR"/>
-        </w:rPr>
-        <w:t xml:space="preserve">، دو مدل</w:t>
+        <w:t xml:space="preserve">برای سنجش همگرایی با پراسس، دو مدل</w:t>
       </w:r>
       <w:r>
         <w:rPr>
@@ -7137,26 +7107,7 @@
           <w:rtl/>
           <w:lang w:bidi="fa-IR"/>
         </w:rPr>
-        <w:t xml:space="preserve">باید با احتیاط تفسیر شوند و تحلیل</w:t>
-      </w:r>
-      <w:r>
-        <w:rPr>
-          <w:rFonts w:ascii="Times New Roman" w:hAnsi="Times New Roman" w:cs="Times New Roman"/>
-          <w:sz w:val="22"/>
-          <w:szCs w:val="22"/>
-          <w:lang w:val="en-US"/>
-        </w:rPr>
-        <w:t xml:space="preserve"> PROCESS </w:t>
-      </w:r>
-      <w:r>
-        <w:rPr>
-          <w:rFonts w:ascii="B Nazanin" w:hAnsi="B Nazanin" w:cs="B Nazanin" w:hint="cs"/>
-          <w:sz w:val="24"/>
-          <w:szCs w:val="24"/>
-          <w:rtl/>
-          <w:lang w:bidi="fa-IR"/>
-        </w:rPr>
-        <w:t xml:space="preserve">به‌عنوان تحلیل اصلی میانجی‌گری ملاک قرار می‌گیرد. هم‌جهتی معنادار مسیرهای</w:t>
+        <w:t xml:space="preserve">باید با احتیاط تفسیر شوند و تحلیل پراسس به‌عنوان تحلیل اصلی میانجی‌گری ملاک قرار می‌گیرد. هم‌جهتی معنادار مسیرهای</w:t>
       </w:r>
       <w:r>
         <w:rPr>

</xml_diff>

<commit_message>
style: vary sentence rhythm in simulated chapters 4 and 5
</commit_message>
<xml_diff>
--- a/output/final/chapter4_simulated_full_demo_v2.docx
+++ b/output/final/chapter4_simulated_full_demo_v2.docx
@@ -95,7 +95,7 @@
           <w:rtl/>
           <w:lang w:bidi="fa-IR"/>
         </w:rPr>
-        <w:t xml:space="preserve">فصل چهارم به گزارش یافته‌های حاصل از آزمون فرضیه‌های پژوهش اختصاص دارد. هدف اصلی پژوهش حاضر، بررسی رابطه اضطراب صفتی با رفتارهای مالی پرخطر در معامله‌گران بازارهای مالی و تبیین سازوکار این رابطه از طریق نقش میانجی‌گر طرحواره‌های ناسازگار اولیه است. بر این اساس، چهار فرضیه عملیاتی تدوین شد: سه فرضیه فرعی درباره روابط دوتایی متغیرها و یک فرضیه اصلی درباره الگوی میانجی‌گری؛ و در این فصل، شواهد لازم برای آزمون هر چهار فرضیه به‌ترتیب و با رعایت توالی منطقی تحلیل ارائه می‌شود.</w:t>
+        <w:t xml:space="preserve">فصل چهارم به گزارش یافته‌های حاصل از آزمون فرضیه‌های پژوهش اختصاص دارد. هدف اصلی پژوهش حاضر، بررسی رابطه اضطراب صفتی با رفتارهای مالی پرخطر در معامله‌گران بازارهای مالی و تبیین سازوکار این رابطه از طریق نقش میانجی‌گر طرحواره‌های ناسازگار اولیه است. بر این اساس چهار فرضیه تدوین شد. سه فرضیه فرعی روابط دوتایی متغیرها را می‌آزمایند و فرضیه اصلی الگوی میانجی‌گری را. شواهد لازم برای آزمون هر چهار فرضیه در ادامه همین فصل، به‌ترتیب توالی منطقی تحلیل ارائه می‌شود.</w:t>
       </w:r>
     </w:p>
     <w:p>
@@ -112,7 +112,7 @@
           <w:rtl/>
           <w:lang w:bidi="fa-IR"/>
         </w:rPr>
-        <w:t xml:space="preserve">مراحل اجرای تحلیل عبارت بودند از: غربالگری داده‌ها و تعیین نمونه معتبر بر اساس معیارهای از پیش ثبت‌شده؛ برآورد آمار توصیفی ویژگی‌های جمعیت‌شناختی و متغیرهای اصلی پژوهش؛ بررسی پایایی ابزارهای اندازه‌گیری با ضریب آلفای کرونباخ؛ ارزیابی پیش‌فرض‌های تحلیل استنباطی شامل نرمال بودن توزیع‌ها، نبود داده‌های پرت چندمتغیره، عدم هم‌خطی و استقلال پسماندها؛ آزمون فرضیه‌های فرعی با ضریب همبستگی پیرسون؛ و در نهایت آزمون فرضیه اصلی با تحلیل میانجی‌گری بر اساس الگوی مدل ۴ هایز همراه با بوت‌استرپ ۵۰۰۰ بازنمونه‌گیری. به‌منظور پشتیابی یافته‌ها، الگوی مسیر به‌روش معادلات ساختاری و با برآورد درست‌نمایی بیشینه نیز برازش داده شد تا همگرایی نتایج در دو چارچوب تحلیلی بررسی شود.</w:t>
+        <w:t xml:space="preserve">مراحل اجرای تحلیل عبارت بودند از: غربالگری داده‌ها و تعیین نمونه معتبر بر اساس معیارهای از پیش ثبت‌شده؛ برآورد آمار توصیفی ویژگی‌های جمعیت‌شناختی و متغیرهای اصلی پژوهش؛ و بررسی پایایی ابزارهای اندازه‌گیری با ضریب آلفای کرونباخ. ارزیابی پیش‌فرض‌های تحلیل استنباطی — نرمال بودن توزیع‌ها، نبود داده‌های پرت چندمتغیره، عدم هم‌خطی و استقلال پسماندها — نیز پیش از آزمون فرضیه‌ها انجام شد. سپس فرضیه‌های فرعی با ضریب همبستگی پیرسون آزمون شدند و فرضیه اصلی با تحلیل میانجی‌گری بر اساس الگوی مدل ۴ هایز همراه با بوت‌استرپ ۵۰۰۰ بازنمونه‌گیری. به‌منظور پشتیابی یافته‌ها، الگوی مسیر به‌روش معادلات ساختاری و با برآورد درست‌نمایی بیشینه نیز برازش داده شد تا همگرایی نتایج در دو چارچوب تحلیلی بررسی شود.</w:t>
       </w:r>
     </w:p>
     <w:p>
@@ -129,7 +129,7 @@
           <w:rtl/>
           <w:lang w:bidi="fa-IR"/>
         </w:rPr>
-        <w:t xml:space="preserve">نقشه راه فصل به این ترتیب است: بخش ۴-۲ به آماده‌سازی و غربالگری داده‌ها، بخش ۴-۳ به ویژگی‌های جمعیت‌شناختی نمونه، بخش ۴-۴ به شاخص‌های توصیفی متغیرهای اصلی، بخش ۴-۵ به پایایی ابزارها، بخش ۴-۶ به بررسی پیش‌فرض‌های آماری، بخش ۴-۷ به همبستگی پیرسون و آزمون فرضیه‌های فرعی، بخش ۴-۸ به آزمون فرضیه اصلی با تحلیل میانجی‌گری، بخش ۴-۹ به مدل‌سازی معادلات ساختاری و بخش ۴-۱۰ به جمع‌بندی نتایج اختصاص دارد.</w:t>
+        <w:t xml:space="preserve">نقشه راه فصل به این ترتیب است: بخش ۴-۲ به آماده‌سازی و غربالگری داده‌ها، بخش ۴-۳ به ویژگی‌های جمعیت‌شناختی نمونه، بخش ۴-۴ به شاخص‌های توصیفی متغیرهای اصلی و بخش ۴-۵ به پایایی ابزارها می‌پردازند. بخش ۴-۶ پیش‌فرض‌های آماری، بخش ۴-۷ همبستگی پیرسون و آزمون فرضیه‌های فرعی، بخش ۴-۸ آزمون فرضیه اصلی با تحلیل میانجی‌گری، بخش ۴-۹ مدل‌سازی معادلات ساختاری و بخش ۴-۱۰ جمع‌بندی نتایج را پوشش می‌دهند.</w:t>
       </w:r>
     </w:p>
     <w:p>
@@ -3185,7 +3185,7 @@
           <w:rtl/>
           <w:lang w:bidi="fa-IR"/>
         </w:rPr>
-        <w:t xml:space="preserve">پایایی مقیاس‌ها در نمونه حاضر با آلفای کرونباخ برآورد شد (جدول ۴-۴). آلفای اضطراب صفتی ۰٫۹۰۲ و آلفای رفتارهای مالی پرخطر ۰٫۸۰۱ بود؛ هر دو در بازه مطلوب و هم‌راستا با مقادیر گزارش‌شده در مطالعه فارسی و انگلیسی. آلفای کل مقیاس طرحواره ۰٫۹۲۹ به دست آمد که در بازه مطلوب و پایین‌تر از کرانه بالای ۰٫۹۵ قرار دارد؛ مقادیر بسیار نزدیک به ۱ معمولاً نشانه هم‌پوشانی محتوایی گویه‌هاست و در اینجا دیده نمی‌شود.</w:t>
+        <w:t xml:space="preserve">پایایی مقیاس‌ها در نمونه حاضر با آلفای کرونباخ برآورد شد (جدول ۴-۴). آلفای اضطراب صفتی ۰٫۹۰۲ و آلفای رفتارهای مالی پرخطر ۰٫۸۰۱ بود؛ هر دو در بازه مطلوب و هم‌راستا با مقادیر گزارش‌شده در مطالعه فارسی و انگلیسی. آلفای کل مقیاس طرحواره ۰٫۹۲۹ به دست آمد. مقداری مطلوب و پایین‌تر از کرانه ۰٫۹۵. مقادیر بسیار نزدیک به ۱ معمولاً نشانه هم‌پوشانی محتوایی گویه‌هاست و در اینجا دیده نمی‌شود.</w:t>
       </w:r>
     </w:p>
     <w:p>
@@ -3843,7 +3843,7 @@
           <w:rtl/>
           <w:lang w:bidi="fa-IR"/>
         </w:rPr>
-        <w:t xml:space="preserve">اعتبار تحلیل‌های استنباطی به برقراری پیش‌فرض‌های نرمال بودن، نبود داده‌های پرت، عدم هم‌خطی و استقلال پسماندها وابسته است و هر چهار مورد پیش از آزمون فرضیه‌ها ارزیابی شد.</w:t>
+        <w:t xml:space="preserve">اعتبار تحلیل‌های استنباطی به برقراری چهار پیش‌فرض وابسته است: نرمال بودن، نبود داده‌های پرت، عدم هم‌خطی و استقلال پسماندها. هر چهار مورد پیش از آزمون فرضیه‌ها ارزیابی شد.</w:t>
       </w:r>
     </w:p>
     <w:p>
@@ -3901,7 +3901,7 @@
           <w:rtl/>
           <w:lang w:bidi="fa-IR"/>
         </w:rPr>
-        <w:t xml:space="preserve"> فاصله ماهالانوبیس برای هر مشاهده بر مبنای سه متغیر اصلی محاسبه شد. هیچ موردی از آستانه کای‌دو (۳ درجه آزادی، ۰٫۰۰۱ = ۱۶٫۲۷) فراتر نرفت، اما ۱ مورد در منطقه هشدار (بالای ۱۲) بودند و نزدیک‌ترین مقدار بیشینه ۱۴٫۸۸ بود؛ با معاینه موارد مرزی، پاسخ‌هایشان منسجم و محتوایی تشخیص داده شد و بر اساس اصل حذف حداقلی، در نمونه حفظ شدند.</w:t>
+        <w:t xml:space="preserve"> فاصله ماهالانوبیس برای هر مشاهده بر مبنای سه متغیر اصلی محاسبه شد. هیچ موردی از آستانه کای‌دو (۳ درجه آزادی، ۰٫۰۰۱ = ۱۶٫۲۷) فراتر نرفت، اما ۱ مورد در منطقه هشدار (بالای ۱۲) بودند و نزدیک‌ترین مقدار بیشینه ۱۴٫۸۸ بود. با معاینه موارد مرزی، پاسخ‌هایشان منسجم و محتوایی تشخیص داده شد و بر اساس اصل حذف حداقلی، در نمونه حفظ شدند.</w:t>
       </w:r>
     </w:p>
     <w:p>
@@ -7637,7 +7637,7 @@
           <w:rtl/>
           <w:lang w:bidi="fa-IR"/>
         </w:rPr>
-        <w:t xml:space="preserve">الگوی کلی یافته‌ها: اضطراب صفتی نخست طرحواره‌های ناسازگار را فعال می‌کند و این طرحواره‌ها بخشی از اثر را به رفتارهای پرخطر مالی منتقل می‌کنند؛ مسیری مستقیم و مستقل نیز باقی می‌ماند که احتمالاً بازتاب هیجان‌های موقعیتی و سبک‌های شخصیِ ریسک‌پذیری است. سهم نزدیک به نصفیِ مسیر غیرمستقیم، مداخله طرحواره‌محور را توجیه می‌کند، اما عدم صفرشدن</w:t>
+        <w:t xml:space="preserve">الگوی کلی یافته‌ها: اضطراب صفتی نخست طرحواره‌های ناسازگار را فعال می‌کند و این طرحواره‌ها بخشی از اثر را به رفتارهای پرخطر مالی منتقل می‌کنند. مسیری مستقیم و مستقل نیز باقی می‌ماند که احتمالاً بازتاب هیجان‌های موقعیتی و سبک‌های شخصیِ ریسک‌پذیری است. سهم نزدیک به نصفیِ مسیر غیرمستقیم، مداخله طرحواره‌محور را توجیه می‌کند. با این حال، عدم صفرشدن</w:t>
       </w:r>
       <w:r>
         <w:rPr>
@@ -7656,7 +7656,7 @@
           <w:rtl/>
           <w:lang w:bidi="fa-IR"/>
         </w:rPr>
-        <w:t xml:space="preserve">هشدار می‌دهد که صرفِ بازسازی شناختی کافی نیست و باید آموزش مدیریت اضطراب و سواد مالی نیز در برنامه باشد.</w:t>
+        <w:t xml:space="preserve">هشدار می‌دهد که صرفِ بازسازی شناختی کافی نیست؛ آموزش مدیریت اضطراب و سواد مالی نیز باید در برنامه باشد.</w:t>
       </w:r>
     </w:p>
     <w:p>

</xml_diff>

<commit_message>
fix: correct chapter 4 simulation statistics, claims, terminology and table formatting
</commit_message>
<xml_diff>
--- a/output/final/chapter4_simulated_full_demo_v2.docx
+++ b/output/final/chapter4_simulated_full_demo_v2.docx
@@ -95,7 +95,7 @@
           <w:rtl/>
           <w:lang w:bidi="fa-IR"/>
         </w:rPr>
-        <w:t xml:space="preserve">فصل چهارم به گزارش یافته‌های حاصل از آزمون فرضیه‌های پژوهش اختصاص دارد. هدف اصلی پژوهش حاضر، بررسی رابطه اضطراب صفتی با رفتارهای مالی پرخطر در معامله‌گران بازارهای مالی و تبیین سازوکار این رابطه از طریق نقش میانجی‌گر طرحواره‌های ناسازگار اولیه است. بر این اساس چهار فرضیه تدوین شد. سه فرضیه فرعی روابط دوتایی متغیرها را می‌آزمایند و فرضیه اصلی الگوی میانجی‌گری را. شواهد لازم برای آزمون هر چهار فرضیه در ادامه همین فصل، به‌ترتیب توالی منطقی تحلیل ارائه می‌شود.</w:t>
+        <w:t xml:space="preserve">فصل چهارم به گزارش یافته‌های حاصل از آزمون فرضیه‌های پژوهش اختصاص دارد. هدف اصلی پژوهش حاضر، بررسی رابطه اضطراب صفتی با رفتارهای مالی پرخطر در معامله‌گران بازارهای مالی و تبیین سازوکار این رابطه از طریق نقش میانجی‌گر طرحواره‌های ناسازگار اولیه است. بر این اساس چهار فرضیه تدوین شد. سه فرضیه فرعی روابط دوتایی متغیرها را می‌آزمایند و فرضیه اصلی الگوی میانجی‌گری را. شواهد لازم برای آزمون هر چهار فرضیه در همین فصل، به‌ترتیب توالی منطقی تحلیل ارائه می‌شود.</w:t>
       </w:r>
     </w:p>
     <w:p>
@@ -112,7 +112,7 @@
           <w:rtl/>
           <w:lang w:bidi="fa-IR"/>
         </w:rPr>
-        <w:t xml:space="preserve">مراحل اجرای تحلیل عبارت بودند از: غربالگری داده‌ها و تعیین نمونه معتبر بر اساس معیارهای از پیش ثبت‌شده؛ برآورد آمار توصیفی ویژگی‌های جمعیت‌شناختی و متغیرهای اصلی پژوهش؛ و بررسی پایایی ابزارهای اندازه‌گیری با ضریب آلفای کرونباخ. ارزیابی پیش‌فرض‌های تحلیل استنباطی — نرمال بودن توزیع‌ها، نبود داده‌های پرت چندمتغیره، عدم هم‌خطی و استقلال پسماندها — نیز پیش از آزمون فرضیه‌ها انجام شد. سپس فرضیه‌های فرعی با ضریب همبستگی پیرسون آزمون شدند و فرضیه اصلی با تحلیل میانجی‌گری بر اساس الگوی مدل ۴ هایز همراه با بوت‌استرپ ۵۰۰۰ بازنمونه‌گیری. به‌منظور پشتیابی یافته‌ها، الگوی مسیر به‌روش معادلات ساختاری و با برآورد درست‌نمایی بیشینه نیز برازش داده شد تا همگرایی نتایج در دو چارچوب تحلیلی بررسی شود.</w:t>
+        <w:t xml:space="preserve">مراحل اجرای تحلیل عبارت بودند از: غربالگری داده‌ها و تعیین نمونه معتبر بر اساس معیارهای از پیش ثبت‌شده؛ برآورد آمار توصیفی ویژگی‌های جمعیت‌شناختی و متغیرهای اصلی پژوهش؛ و بررسی پایایی ابزارهای اندازه‌گیری با ضریب آلفای کرونباخ. ارزیابی پیش‌فرض‌های تحلیل استنباطی — نرمال بودن توزیع‌ها، نبود داده‌های پرت چندمتغیره، عدم هم‌خطی و استقلال پسماندها — نیز پیش از آزمون فرضیه‌ها انجام شد. سپس فرضیه‌های فرعی با ضریب همبستگی پیرسون آزمون شدند و فرضیه اصلی با تحلیل میانجی‌گری بر اساس الگوی مدل ۴ هایز همراه با بوت‌استرپ ۵۰۰۰ بازنمونه‌گیری. به‌منظور پشتیبانی یافته‌ها، الگوی مسیر به‌روش معادلات ساختاری و با برآورد درست‌نمایی بیشینه نیز برازش داده شد تا همگرایی نتایج در دو چارچوب تحلیلی بررسی شود.</w:t>
       </w:r>
     </w:p>
     <w:p>
@@ -745,7 +745,7 @@
           <w:rtl/>
           <w:lang w:bidi="fa-IR"/>
         </w:rPr>
-        <w:t xml:space="preserve">میانگین سنی نمونه ۳۲٫۳۴ سال (انحراف معیار ۸٫۸۶) بود. توزیع سنی تک‌قله‌ای و به‌سوی سنین جوان‌تر متمایل است که با ساختار سنی جامعه معامله‌گران آنلاین در پژوهش‌های پیشین هم‌خوان است؛ گروه‌های سنی بالاتر اگرچه کم‌شمار اما غیرصفرند و این دامنه نسبی، تعمیم‌پذیری یافته‌ها را در بازه محدودی از سطوح حمایت می‌کند.</w:t>
+        <w:t xml:space="preserve">میانگین سنی نمونه ۳۲٫۳۴ سال (انحراف معیار ۸٫۸۶) بود. توزیع سنی تک‌قله‌ای و به‌سوی سنین جوان‌تر متمایل است که توصیف نمونه حاضر است و نیازمند داده‌های مرجع جداگانه برای مقایسه است؛ گروه‌های سنی بالاتر اگرچه کم‌شمار اما غیرصفرند و این دامنه نسبی، تعمیم‌پذیری یافته‌ها را در بازه محدودی از سطوح حمایت می‌کند.</w:t>
       </w:r>
     </w:p>
     <w:p>
@@ -762,7 +762,7 @@
           <w:rtl/>
           <w:lang w:bidi="fa-IR"/>
         </w:rPr>
-        <w:t xml:space="preserve">از نظر جنسیت، ۶۶٫۰۸٪ از پاسخ‌دهندگان مرد و ۳۳٫۹۲٪ زن بودند. این برآیند مردانه با شکاف جنسیتی گزارش‌شده در مشارکت بازارهای پرریسک سازگار است؛ با این حال، به‌دلیل غلبه مردان، تعمیم دقیق نتایج به زنان معامله‌گر با احتیاط امکان‌پذیر است و این نامتوازنی در محدودیت‌های فصل پنجم نیز یادآوری خواهد شد.</w:t>
+        <w:t xml:space="preserve">از نظر جنسیت، ۶۶٫۰۸٪ از پاسخ‌دهندگان مرد و ۳۳٫۹۲٪ زن بودند. این برآیند مردانه صرفاً ترکیب نمونه حاضر را توصیف می‌کند؛ با این حال، به‌دلیل غلبه مردان، تعمیم دقیق نتایج به زنان معامله‌گر با احتیاط امکان‌پذیر است و این نامتوازنی در محدودیت‌های فصل پنجم نیز یادآوری خواهد شد.</w:t>
       </w:r>
     </w:p>
     <w:p>
@@ -779,7 +779,7 @@
           <w:rtl/>
           <w:lang w:bidi="fa-IR"/>
         </w:rPr>
-        <w:t xml:space="preserve">در سطح تحصیلات، کارشناسی با ۵۰٫۸۸٪ و کارشناسی ارشد با ۲۵٫۱۵٪ بیشترین سهم را داشتند و دیپلم ۱۷٫۵۴٪ بود؛ این ترکیب، توان شناختی لازم برای درک گویه‌های مالی و روان‌شناختی را تأمین می‌کند و احتمال پاسخ‌دهی نابه‌جا را کاهش می‌دهد.</w:t>
+        <w:t xml:space="preserve">در سطح تحصیلات، کارشناسی با ۵۰٫۸۸٪ و کارشناسی ارشد با ۲۵٫۱۵٪ بیشترین سهم را داشتند و دیپلم ۱۷٫۵۴٪ بود.</w:t>
       </w:r>
     </w:p>
     <w:p>
@@ -815,7 +815,7 @@
           <w:rtl/>
           <w:lang w:bidi="fa-IR"/>
         </w:rPr>
-        <w:t xml:space="preserve">؛ یعنی معامله‌گران باتجربه‌تر عملاً درگیر تعداد معاملات بیشتری بودند؛ این همبستگیِ کم‌شدت با الگوی رایج در مطالعات رفتار معامله‌گران هم‌جهت است.</w:t>
+        <w:t xml:space="preserve">؛ یعنی معامله‌گران باتجربه‌تر عملاً درگیر تعداد معاملات بیشتری بودند.</w:t>
       </w:r>
     </w:p>
     <w:p>
@@ -3132,7 +3132,7 @@
           <w:rtl/>
           <w:lang w:bidi="fa-IR"/>
         </w:rPr>
-        <w:t xml:space="preserve">میانگین اضطراب صفتی (۴۶٫۱۶ از ۸۰) بالاتر از هنجار جمعیت عمومی و در حد جمعیت‌های پرتشغله غیربالینی است؛ این جای‌گیری برای جامعه معامله‌گران قابل انتظار بوده و نشانه هم‌زمانیِ دامنه کافی (کمینه ۲۲ تا بیشینه ۷۲) و نبود اثر سقف/کف است.</w:t>
+        <w:t xml:space="preserve">میانگین اضطراب صفتی (۴۶٫۱۶ از ۸۰) در این نمونه به دست آمد و مقایسه آن با هنجارها نیازمند داده‌های مرجع جداگانه است؛ این جای‌گیری برای جامعه معامله‌گران قابل انتظار بوده و نشانه هم‌زمانیِ دامنه کافی (کمینه ۲۲ تا بیشینه ۷۲) و نبود اثر سقف/کف است.</w:t>
       </w:r>
     </w:p>
     <w:p>
@@ -3149,7 +3149,7 @@
           <w:rtl/>
           <w:lang w:bidi="fa-IR"/>
         </w:rPr>
-        <w:t xml:space="preserve">میانگین طرحواره ناسازگار ۲۲۳٫۳۱ از ۴۵ و میانگین رفتار مالی پرخطر ۲۹٫۷۹ از ۶۵ در بازه میانی-بالاتر قرار دارند. رفتار مالی چولگی مثبت ملایمی (۰٫۴۳) نشان می‌دهد؛ این نامتقارنی با ماهیت مقیاس‌های ریسک‌پذیری هم‌خوان است که شمار اندکی افراد با ریسک بسیار بالا دنباله راست را کشیده‌اند و از همین رو، تفسیرهای بعدی با روش مقاوم (بوت‌استرپ) نیز کنترل خواهند شد. کشیدگی‌های کوچک منفی نیز بیانگر دامنه بازتر از نرمال ایده‌آل است و نه چیزی که نیاز به تبدیل داشته باشد.</w:t>
+        <w:t xml:space="preserve">میانگین طرحواره ناسازگار ۲۲۳٫۳۱ از ۴۵۰ و میانگین رفتار مالی پرخطر ۲۹٫۷۹ از ۶۵ است؛ هر دو پایین‌تر از نقطه میانی بازه نظری مقیاس خود قرار دارند. رفتار مالی چولگی مثبت ملایمی (۰٫۴۳) نشان می‌دهد؛ این نامتقارنی با ماهیت مقیاس‌های ریسک‌پذیری هم‌خوان است که شمار اندکی افراد با ریسک بسیار بالا دنباله راست را کشیده‌اند و از همین رو، تفسیرهای بعدی با روش مقاوم (بوت‌استرپ) نیز کنترل خواهند شد. کشیدگی‌های کوچک منفی نیز بیانگر دامنه بازتر از نرمال ایده‌آل است و نه چیزی که نیاز به تبدیل داشته باشد.</w:t>
       </w:r>
     </w:p>
     <w:p>
@@ -3185,43 +3185,7 @@
           <w:rtl/>
           <w:lang w:bidi="fa-IR"/>
         </w:rPr>
-        <w:t xml:space="preserve">پایایی مقیاس‌ها در نمونه حاضر با آلفای کرونباخ برآورد شد (جدول ۴-۴). آلفای اضطراب صفتی ۰٫۹۰۲ و آلفای رفتارهای مالی پرخطر ۰٫۸۰۱ بود؛ هر دو در بازه مطلوب و هم‌راستا با مقادیر گزارش‌شده در مطالعه فارسی و انگلیسی. آلفای کل مقیاس طرحواره ۰٫۹۲۹ به دست آمد. مقداری مطلوب و پایین‌تر از کرانه ۰٫۹۵. مقادیر بسیار نزدیک به ۱ معمولاً نشانه هم‌پوشانی محتوایی گویه‌هاست و در اینجا دیده نمی‌شود.</w:t>
-      </w:r>
-    </w:p>
-    <w:p>
-      <w:pPr>
-        <w:bidi w:val="1"/>
-        <w:spacing w:lineRule="exact" w:line="580" w:after="0"/>
-        <w:jc w:val="both"/>
-      </w:pPr>
-      <w:r>
-        <w:rPr>
-          <w:rFonts w:ascii="B Nazanin" w:hAnsi="B Nazanin" w:cs="B Nazanin" w:hint="cs"/>
-          <w:sz w:val="24"/>
-          <w:szCs w:val="24"/>
-          <w:rtl/>
-          <w:lang w:bidi="fa-IR"/>
-        </w:rPr>
-        <w:t xml:space="preserve">بررسی حیطه‌های پنج‌گانه نشان داد پایایی حیطه‌ها یکسان نیست؛ از ۰٫۷۰۴ تا ۰٫۸۴۰ متغیر است. پایین‌ترین مقدار به حیطه «فراهدشیاری و بازداری هیجانی» تعلق دارد که در پژوهش‌های پیشین نیز اغلب سست‌ترین حیطه</w:t>
-      </w:r>
-      <w:r>
-        <w:rPr>
-          <w:rFonts w:ascii="Times New Roman" w:hAnsi="Times New Roman" w:cs="Times New Roman"/>
-          <w:sz w:val="22"/>
-          <w:szCs w:val="22"/>
-          <w:lang w:val="en-US"/>
-        </w:rPr>
-        <w:t xml:space="preserve"> YSQ-SF </w:t>
-      </w:r>
-      <w:r>
-        <w:rPr>
-          <w:rFonts w:ascii="B Nazanin" w:hAnsi="B Nazanin" w:cs="B Nazanin" w:hint="cs"/>
-          <w:sz w:val="24"/>
-          <w:szCs w:val="24"/>
-          <w:rtl/>
-          <w:lang w:bidi="fa-IR"/>
-        </w:rPr>
-        <w:t xml:space="preserve">گزارش شده است؛ مقدار آن در مرز قابل قبول قرار دارد و استفاده از نمره کل حیطه را مجاز می‌شمارد، هرچند تفسیرهای سطح حیطه با احتیاط انجام می‌گیرد.</w:t>
+        <w:t xml:space="preserve">پایایی مقیاس‌ها در نمونه حاضر با آلفای کرونباخ برآورد شد (جدول ۴-۴). آلفای اضطراب صفتی ۰٫۹۰۲ و آلفای رفتارهای مالی پرخطر ۰٫۸۰۱ بود؛ هر دو در بازه مطلوب قرار گرفتند. آلفای کل مقیاس طرحواره ۰٫۹۲۹ به دست آمد. مقداری مطلوب و پایین‌تر از کرانه ۰٫۹۵. مقادیر بسیار نزدیک به ۱ معمولاً نشانه هم‌پوشانی محتوایی گویه‌هاست و در اینجا دیده نمی‌شود.</w:t>
       </w:r>
     </w:p>
     <w:p>
@@ -3250,7 +3214,7 @@
           <w:rtl/>
           <w:lang w:bidi="fa-IR"/>
         </w:rPr>
-        <w:t xml:space="preserve"> ضرایب آلفای کرونباخ مقیاس‌ها و حیطه‌های طرحواره در نمونه پژوهش</w:t>
+        <w:t xml:space="preserve"> ضرایب آلفای کرونباخ مقیاس‌ها در نمونه پژوهش</w:t>
       </w:r>
     </w:p>
     <w:tbl>
@@ -3287,7 +3251,7 @@
                 <w:b/>
                 <w:sz w:val="22"/>
               </w:rPr>
-              <w:t>مقیاس/حیطه</w:t>
+              <w:t>مقیاس</w:t>
             </w:r>
           </w:p>
         </w:tc>
@@ -3466,291 +3430,6 @@
                 <w:b w:val="0"/>
                 <w:sz w:val="22"/>
               </w:rPr>
-              <w:t>حیطۀ برش از دیگران</w:t>
-            </w:r>
-          </w:p>
-        </w:tc>
-        <w:tc>
-          <w:tcPr>
-            <w:tcW w:type="dxa" w:w="2740"/>
-          </w:tcPr>
-          <w:p>
-            <w:pPr>
-              <w:jc w:val="center"/>
-            </w:pPr>
-            <w:r/>
-            <w:r>
-              <w:rPr>
-                <w:b w:val="0"/>
-                <w:sz w:val="22"/>
-              </w:rPr>
-              <w:t>15</w:t>
-            </w:r>
-          </w:p>
-        </w:tc>
-        <w:tc>
-          <w:tcPr>
-            <w:tcW w:type="dxa" w:w="2740"/>
-          </w:tcPr>
-          <w:p>
-            <w:pPr>
-              <w:jc w:val="center"/>
-            </w:pPr>
-            <w:r/>
-            <w:r>
-              <w:rPr>
-                <w:b w:val="0"/>
-                <w:sz w:val="22"/>
-              </w:rPr>
-              <w:t>0.840</w:t>
-            </w:r>
-          </w:p>
-        </w:tc>
-      </w:tr>
-      <w:tr>
-        <w:tc>
-          <w:tcPr>
-            <w:tcW w:type="dxa" w:w="2740"/>
-          </w:tcPr>
-          <w:p>
-            <w:pPr>
-              <w:bidi w:val="1"/>
-              <w:jc w:val="center"/>
-            </w:pPr>
-            <w:r/>
-            <w:r>
-              <w:rPr>
-                <w:b w:val="0"/>
-                <w:sz w:val="22"/>
-              </w:rPr>
-              <w:t>حیطۀ خودمختاری و عملکرد ناسازگار</w:t>
-            </w:r>
-          </w:p>
-        </w:tc>
-        <w:tc>
-          <w:tcPr>
-            <w:tcW w:type="dxa" w:w="2740"/>
-          </w:tcPr>
-          <w:p>
-            <w:pPr>
-              <w:jc w:val="center"/>
-            </w:pPr>
-            <w:r/>
-            <w:r>
-              <w:rPr>
-                <w:b w:val="0"/>
-                <w:sz w:val="22"/>
-              </w:rPr>
-              <w:t>15</w:t>
-            </w:r>
-          </w:p>
-        </w:tc>
-        <w:tc>
-          <w:tcPr>
-            <w:tcW w:type="dxa" w:w="2740"/>
-          </w:tcPr>
-          <w:p>
-            <w:pPr>
-              <w:jc w:val="center"/>
-            </w:pPr>
-            <w:r/>
-            <w:r>
-              <w:rPr>
-                <w:b w:val="0"/>
-                <w:sz w:val="22"/>
-              </w:rPr>
-              <w:t>0.834</w:t>
-            </w:r>
-          </w:p>
-        </w:tc>
-      </w:tr>
-      <w:tr>
-        <w:tc>
-          <w:tcPr>
-            <w:tcW w:type="dxa" w:w="2740"/>
-          </w:tcPr>
-          <w:p>
-            <w:pPr>
-              <w:bidi w:val="1"/>
-              <w:jc w:val="center"/>
-            </w:pPr>
-            <w:r/>
-            <w:r>
-              <w:rPr>
-                <w:b w:val="0"/>
-                <w:sz w:val="22"/>
-              </w:rPr>
-              <w:t>حیطۀ حدود و مرزهای مختل</w:t>
-            </w:r>
-          </w:p>
-        </w:tc>
-        <w:tc>
-          <w:tcPr>
-            <w:tcW w:type="dxa" w:w="2740"/>
-          </w:tcPr>
-          <w:p>
-            <w:pPr>
-              <w:jc w:val="center"/>
-            </w:pPr>
-            <w:r/>
-            <w:r>
-              <w:rPr>
-                <w:b w:val="0"/>
-                <w:sz w:val="22"/>
-              </w:rPr>
-              <w:t>15</w:t>
-            </w:r>
-          </w:p>
-        </w:tc>
-        <w:tc>
-          <w:tcPr>
-            <w:tcW w:type="dxa" w:w="2740"/>
-          </w:tcPr>
-          <w:p>
-            <w:pPr>
-              <w:jc w:val="center"/>
-            </w:pPr>
-            <w:r/>
-            <w:r>
-              <w:rPr>
-                <w:b w:val="0"/>
-                <w:sz w:val="22"/>
-              </w:rPr>
-              <w:t>0.795</w:t>
-            </w:r>
-          </w:p>
-        </w:tc>
-      </w:tr>
-      <w:tr>
-        <w:tc>
-          <w:tcPr>
-            <w:tcW w:type="dxa" w:w="2740"/>
-          </w:tcPr>
-          <w:p>
-            <w:pPr>
-              <w:bidi w:val="1"/>
-              <w:jc w:val="center"/>
-            </w:pPr>
-            <w:r/>
-            <w:r>
-              <w:rPr>
-                <w:b w:val="0"/>
-                <w:sz w:val="22"/>
-              </w:rPr>
-              <w:t>حیطۀ دیگران‌مداری</w:t>
-            </w:r>
-          </w:p>
-        </w:tc>
-        <w:tc>
-          <w:tcPr>
-            <w:tcW w:type="dxa" w:w="2740"/>
-          </w:tcPr>
-          <w:p>
-            <w:pPr>
-              <w:jc w:val="center"/>
-            </w:pPr>
-            <w:r/>
-            <w:r>
-              <w:rPr>
-                <w:b w:val="0"/>
-                <w:sz w:val="22"/>
-              </w:rPr>
-              <w:t>15</w:t>
-            </w:r>
-          </w:p>
-        </w:tc>
-        <w:tc>
-          <w:tcPr>
-            <w:tcW w:type="dxa" w:w="2740"/>
-          </w:tcPr>
-          <w:p>
-            <w:pPr>
-              <w:jc w:val="center"/>
-            </w:pPr>
-            <w:r/>
-            <w:r>
-              <w:rPr>
-                <w:b w:val="0"/>
-                <w:sz w:val="22"/>
-              </w:rPr>
-              <w:t>0.798</w:t>
-            </w:r>
-          </w:p>
-        </w:tc>
-      </w:tr>
-      <w:tr>
-        <w:tc>
-          <w:tcPr>
-            <w:tcW w:type="dxa" w:w="2740"/>
-          </w:tcPr>
-          <w:p>
-            <w:pPr>
-              <w:bidi w:val="1"/>
-              <w:jc w:val="center"/>
-            </w:pPr>
-            <w:r/>
-            <w:r>
-              <w:rPr>
-                <w:b w:val="0"/>
-                <w:sz w:val="22"/>
-              </w:rPr>
-              <w:t>حیطۀ فراهدشیاری و بازداری هیجانی</w:t>
-            </w:r>
-          </w:p>
-        </w:tc>
-        <w:tc>
-          <w:tcPr>
-            <w:tcW w:type="dxa" w:w="2740"/>
-          </w:tcPr>
-          <w:p>
-            <w:pPr>
-              <w:jc w:val="center"/>
-            </w:pPr>
-            <w:r/>
-            <w:r>
-              <w:rPr>
-                <w:b w:val="0"/>
-                <w:sz w:val="22"/>
-              </w:rPr>
-              <w:t>15</w:t>
-            </w:r>
-          </w:p>
-        </w:tc>
-        <w:tc>
-          <w:tcPr>
-            <w:tcW w:type="dxa" w:w="2740"/>
-          </w:tcPr>
-          <w:p>
-            <w:pPr>
-              <w:jc w:val="center"/>
-            </w:pPr>
-            <w:r/>
-            <w:r>
-              <w:rPr>
-                <w:b w:val="0"/>
-                <w:sz w:val="22"/>
-              </w:rPr>
-              <w:t>0.704</w:t>
-            </w:r>
-          </w:p>
-        </w:tc>
-      </w:tr>
-      <w:tr>
-        <w:tc>
-          <w:tcPr>
-            <w:tcW w:type="dxa" w:w="2740"/>
-          </w:tcPr>
-          <w:p>
-            <w:pPr>
-              <w:bidi w:val="1"/>
-              <w:jc w:val="center"/>
-            </w:pPr>
-            <w:r/>
-            <w:r>
-              <w:rPr>
-                <w:b w:val="0"/>
-                <w:sz w:val="22"/>
-              </w:rPr>
               <w:t>رفتارهای مالی پرخطر (Grable &amp; Lytton)</w:t>
             </w:r>
           </w:p>
@@ -3793,23 +3472,6 @@
         </w:tc>
       </w:tr>
     </w:tbl>
-    <w:p>
-      <w:pPr>
-        <w:bidi w:val="1"/>
-        <w:spacing w:lineRule="exact" w:line="580" w:after="0"/>
-        <w:jc w:val="both"/>
-      </w:pPr>
-      <w:r>
-        <w:rPr>
-          <w:rFonts w:ascii="B Nazanin" w:hAnsi="B Nazanin" w:cs="B Nazanin" w:hint="cs"/>
-          <w:sz w:val="24"/>
-          <w:szCs w:val="24"/>
-          <w:rtl/>
-          <w:lang w:bidi="fa-IR"/>
-        </w:rPr>
-        <w:t xml:space="preserve">پایایی ابزارها در نمونه حاضر قابل قبول تا مطلوب گزارش شد؛ پایایی حیطه‌ها یکسان نیست و این ناهمگنی با پیشینه روان‌سنجی این ابزارها هم‌خوان است.</w:t>
-      </w:r>
-    </w:p>
     <w:p>
       <w:pPr>
         <w:pStyle w:val="Heading2"/>
@@ -3872,7 +3534,7 @@
           <w:rtl/>
           <w:lang w:bidi="fa-IR"/>
         </w:rPr>
-        <w:t xml:space="preserve"> چولگی هر سه متغیر مطلقاً کمتر از ۱ و کشیدگی‌ها در حدود ±۱ است (جدول ۴-۳)؛ این مقادیر در محدوده قابل قبول برای آزمون‌های استنتاجی رایج مانند رگرسیون است، هرچند نرمال بودن کامل توزیع‌ها برقرار نیست. آزمون شاپیرو-ویلک روی نمره‌های کل اجرا شد و برای اضطراب و طرحواره نتیجه در مرز برقرار/نقض خفیف بود؛ چنین وضعیتی در نمونه‌های رفتاری رایج است و با توجه به حجم نمونه و پایداری رگرسیون‌ها، روش پارامتری حفظ شد و کنترل دقیق‌تر به بوت‌استرپ سپرده شد.</w:t>
+        <w:t xml:space="preserve"> چولگی هر سه متغیر مطلقاً کمتر از ۱ و کشیدگی‌ها در حدود ±۱ است (جدول ۴-۳)؛ این مقادیر در محدوده قابل قبول برای آزمون‌های استنتاجی رایج مانند رگرسیون است، هرچند نرمال بودن کامل توزیع‌ها برقرار نیست. با توجه به حجم نمونه و پایداری رگرسیون‌ها، روش پارامتری حفظ شد و کنترل دقیق‌تر به بوت‌استرپ سپرده شد.</w:t>
       </w:r>
     </w:p>
     <w:p>
@@ -3901,7 +3563,7 @@
           <w:rtl/>
           <w:lang w:bidi="fa-IR"/>
         </w:rPr>
-        <w:t xml:space="preserve"> فاصله ماهالانوبیس برای هر مشاهده بر مبنای سه متغیر اصلی محاسبه شد. هیچ موردی از آستانه کای‌دو (۳ درجه آزادی، ۰٫۰۰۱ = ۱۶٫۲۷) فراتر نرفت، اما ۱ مورد در منطقه هشدار (بالای ۱۲) بودند و نزدیک‌ترین مقدار بیشینه ۱۴٫۸۸ بود. با معاینه موارد مرزی، پاسخ‌هایشان منسجم و محتوایی تشخیص داده شد و بر اساس اصل حذف حداقلی، در نمونه حفظ شدند.</w:t>
+        <w:t xml:space="preserve"> فاصله ماهالانوبیس برای هر مشاهده بر مبنای سه متغیر اصلی محاسبه شد. هیچ موردی از آستانه کای‌دو (۳ درجه آزادی، ۰٫۰۰۱ = ۱۶٫۲۷) فراتر نرفت، اما ۱ مورد در منطقه هشدار (بالای ۱۲) بود و نزدیک‌ترین مقدار بیشینه ۱۴٫۸۸ بود. با معاینه موارد مرزی، پاسخ‌هایشان منسجم و محتوایی تشخیص داده شد و بر اساس اصل حذف حداقلی، در نمونه حفظ شدند.</w:t>
       </w:r>
     </w:p>
     <w:p>
@@ -3949,7 +3611,7 @@
           <w:rtl/>
           <w:lang w:bidi="fa-IR"/>
         </w:rPr>
-        <w:t xml:space="preserve">برابر ۱٫۲۹ و تلورانس ۰٫۷۷ بود که نشانه‌ی هم‌خطی آزاردهنده نیست. </w:t>
+        <w:t xml:space="preserve">برابر ۱٫۲۹ و تلورانس ۰٫۷۷ بود که نشانه هم‌خطی آزاردهنده نیست. </w:t>
       </w:r>
       <w:r>
         <w:rPr>
@@ -3971,7 +3633,7 @@
           <w:rtl/>
           <w:lang w:bidi="fa-IR"/>
         </w:rPr>
-        <w:t xml:space="preserve"> دوربین-واتسون در مدل میانجی ۱٫۸۵ و در مدل پیامد ۱٫۸۳ بود؛ مقدار دوم اندکی از ۲ دورتر است که در داده‌های مقطعِ پرشمار بی‌دقتی خودگزارشی نیز می‌تواند آن را توضیح دهد و در حدی است که ابطال نتایج را ایجاب نکند.</w:t>
+        <w:t xml:space="preserve"> دوربین-واتسون در مدل میانجی ۱٫۸۵ و در مدل پیامد ۱٫۸۳ بود؛ هر دو به ۲ نزدیک‌اند و پیش‌فرض استقلال پسماندها برقرار ارزیابی شد.</w:t>
       </w:r>
     </w:p>
     <w:p>
@@ -4163,7 +3825,7 @@
                 <w:b w:val="0"/>
                 <w:sz w:val="22"/>
               </w:rPr>
-              <w:t>حداکثر ۱±</w:t>
+              <w:t>حداکثر ±۱</w:t>
             </w:r>
           </w:p>
         </w:tc>
@@ -4415,7 +4077,7 @@
                 <w:b w:val="0"/>
                 <w:sz w:val="22"/>
               </w:rPr>
-              <w:t>برقرار (با ملاحظه)</w:t>
+              <w:t>برقرار</w:t>
             </w:r>
           </w:p>
         </w:tc>
@@ -4725,7 +4387,7 @@
                 <w:b w:val="0"/>
                 <w:sz w:val="22"/>
               </w:rPr>
-              <w:t>0.48**</w:t>
+              <w:t>0.48***</w:t>
             </w:r>
           </w:p>
         </w:tc>
@@ -4799,7 +4461,7 @@
                 <w:b w:val="0"/>
                 <w:sz w:val="22"/>
               </w:rPr>
-              <w:t>0.28*</w:t>
+              <w:t>0.28***</w:t>
             </w:r>
           </w:p>
         </w:tc>
@@ -4817,7 +4479,7 @@
                 <w:b w:val="0"/>
                 <w:sz w:val="22"/>
               </w:rPr>
-              <w:t>0.29**</w:t>
+              <w:t>0.29***</w:t>
             </w:r>
           </w:p>
         </w:tc>
@@ -4866,26 +4528,7 @@
           <w:szCs w:val="22"/>
           <w:lang w:val="en-US"/>
         </w:rPr>
-        <w:t xml:space="preserve"> * p &lt; 0.05</w:t>
-      </w:r>
-      <w:r>
-        <w:rPr>
-          <w:rFonts w:ascii="B Nazanin" w:hAnsi="B Nazanin" w:cs="B Nazanin" w:hint="cs"/>
-          <w:sz w:val="24"/>
-          <w:szCs w:val="24"/>
-          <w:rtl/>
-          <w:lang w:bidi="fa-IR"/>
-        </w:rPr>
-        <w:t xml:space="preserve">،</w:t>
-      </w:r>
-      <w:r>
-        <w:rPr>
-          <w:rFonts w:ascii="Times New Roman" w:hAnsi="Times New Roman" w:cs="Times New Roman"/>
-          <w:sz w:val="22"/>
-          <w:szCs w:val="22"/>
-          <w:lang w:val="en-US"/>
-        </w:rPr>
-        <w:t xml:space="preserve"> ** p &lt; 0.01 (</w:t>
+        <w:t xml:space="preserve"> *** p &lt; 0.001 (</w:t>
       </w:r>
       <w:r>
         <w:rPr>
@@ -4963,7 +4606,7 @@
           <w:rtl/>
           <w:lang w:bidi="fa-IR"/>
         </w:rPr>
-        <w:t xml:space="preserve">؛ در جهت فرضیه اما در کرانه پایینِ اثر متوسط و نزدیک به مرز معناداری. این الگو را باید صادقانه گزارش کرد: پیوند اضطراب با رفتار پرخطر وجود دارد، ولی قدرتمند نیست و بخشی از آن می‌تواند از مسیرهای میانی توضیح داده شود. پیش‌بینی می‌شود در تحلیل میانجی، اندازه این رابطه پس از لحاظ‌کردن طرحواره‌ها کوچک‌تر شود.</w:t>
+        <w:t xml:space="preserve">؛ در جهت فرضیه اما در کرانه پایینِ اثر متوسط. این الگو را باید صادقانه گزارش کرد: پیوند اضطراب با رفتار پرخطر وجود دارد، ولی قدرتمند نیست و بخشی از آن می‌تواند از مسیرهای میانی توضیح داده شود. پیش‌بینی می‌شود در تحلیل میانجی، اندازه این رابطه پس از لحاظ‌کردن طرحواره‌ها کوچک‌تر شود.</w:t>
       </w:r>
     </w:p>
     <w:p>
@@ -5099,7 +4742,7 @@
           <w:rtl/>
           <w:lang w:bidi="fa-IR"/>
         </w:rPr>
-        <w:t xml:space="preserve">؛ متوسط ولی صریح. اهمیت عملی آن بالاتر از اندازه‌ی عددی‌اش است، زیرا همان مسیری است که در مداخله‌های بازسازی طرحواره هدف قرار می‌گیرد.</w:t>
+        <w:t xml:space="preserve">؛ متوسط ولی صریح. اهمیت عملی آن بالاتر از اندازه عددی‌اش است، زیرا همان مسیری است که در مداخله‌های بازسازی طرحواره هدف قرار می‌گیرد.</w:t>
       </w:r>
     </w:p>
     <w:p>
@@ -5493,7 +5136,7 @@
           <w:rtl/>
           <w:lang w:bidi="fa-IR"/>
         </w:rPr>
-        <w:t xml:space="preserve">. مدل کامل پیامد حدود ۱۱٪ از واریانس رفتار مالی را توضیح داد که با مقادیر متعارف مدل‌های سه‌متغیره رفتار مالی هم‌خوان است.</w:t>
+        <w:t xml:space="preserve">. مدل کامل پیامد حدود ۱۱٪ از واریانس رفتار مالی را توضیح داد.</w:t>
       </w:r>
     </w:p>
     <w:p>
@@ -5697,7 +5340,6 @@
           </w:tcPr>
           <w:p>
             <w:pPr>
-              <w:bidi w:val="1"/>
               <w:jc w:val="center"/>
             </w:pPr>
             <w:r/>
@@ -5706,7 +5348,7 @@
                 <w:b/>
                 <w:sz w:val="22"/>
               </w:rPr>
-              <w:t>CI95% بوت‌استرپ</w:t>
+              <w:t>CI95%</w:t>
             </w:r>
           </w:p>
         </w:tc>
@@ -5817,7 +5459,7 @@
                 <w:b w:val="0"/>
                 <w:sz w:val="22"/>
               </w:rPr>
-              <w:t>—</w:t>
+              <w:t>[1.314, 2.338]</w:t>
             </w:r>
           </w:p>
         </w:tc>
@@ -5928,7 +5570,7 @@
                 <w:b w:val="0"/>
                 <w:sz w:val="22"/>
               </w:rPr>
-              <w:t>—</w:t>
+              <w:t>[0.008, 0.070]</w:t>
             </w:r>
           </w:p>
         </w:tc>
@@ -6031,6 +5673,7 @@
           </w:tcPr>
           <w:p>
             <w:pPr>
+              <w:bidi w:val="1"/>
               <w:jc w:val="center"/>
             </w:pPr>
             <w:r/>
@@ -6039,7 +5682,7 @@
                 <w:b w:val="0"/>
                 <w:sz w:val="22"/>
               </w:rPr>
-              <w:t>[-0.004, 0.267]</w:t>
+              <w:t>بوت‌استرپ [-0.004, 0.267]؛ تحلیلی [0.011, 0.250]</w:t>
             </w:r>
           </w:p>
         </w:tc>
@@ -6150,7 +5793,7 @@
                 <w:b w:val="0"/>
                 <w:sz w:val="22"/>
               </w:rPr>
-              <w:t>[0.094, 0.313]</w:t>
+              <w:t>[0.095, 0.309]</w:t>
             </w:r>
           </w:p>
         </w:tc>
@@ -6276,6 +5919,149 @@
       <w:r>
         <w:rPr>
           <w:rFonts w:ascii="B Nazanin" w:hAnsi="B Nazanin" w:cs="B Nazanin" w:hint="cs"/>
+          <w:b/>
+          <w:bCs/>
+          <w:sz w:val="24"/>
+          <w:szCs w:val="24"/>
+          <w:rtl/>
+          <w:lang w:bidi="fa-IR"/>
+        </w:rPr>
+        <w:t xml:space="preserve">یادداشت.</w:t>
+      </w:r>
+      <w:r>
+        <w:rPr>
+          <w:rFonts w:ascii="B Nazanin" w:hAnsi="B Nazanin" w:cs="B Nazanin" w:hint="cs"/>
+          <w:sz w:val="24"/>
+          <w:szCs w:val="24"/>
+          <w:rtl/>
+          <w:lang w:bidi="fa-IR"/>
+        </w:rPr>
+        <w:t xml:space="preserve"> بازه‌های سطرهای</w:t>
+      </w:r>
+      <w:r>
+        <w:rPr>
+          <w:rFonts w:ascii="Times New Roman" w:hAnsi="Times New Roman" w:cs="Times New Roman"/>
+          <w:sz w:val="22"/>
+          <w:szCs w:val="22"/>
+          <w:lang w:val="en-US"/>
+        </w:rPr>
+        <w:t xml:space="preserve"> a </w:t>
+      </w:r>
+      <w:r>
+        <w:rPr>
+          <w:rFonts w:ascii="B Nazanin" w:hAnsi="B Nazanin" w:cs="B Nazanin" w:hint="cs"/>
+          <w:sz w:val="24"/>
+          <w:szCs w:val="24"/>
+          <w:rtl/>
+          <w:lang w:bidi="fa-IR"/>
+        </w:rPr>
+        <w:t xml:space="preserve">و</w:t>
+      </w:r>
+      <w:r>
+        <w:rPr>
+          <w:rFonts w:ascii="Times New Roman" w:hAnsi="Times New Roman" w:cs="Times New Roman"/>
+          <w:sz w:val="22"/>
+          <w:szCs w:val="22"/>
+          <w:lang w:val="en-US"/>
+        </w:rPr>
+        <w:t xml:space="preserve"> b </w:t>
+      </w:r>
+      <w:r>
+        <w:rPr>
+          <w:rFonts w:ascii="B Nazanin" w:hAnsi="B Nazanin" w:cs="B Nazanin" w:hint="cs"/>
+          <w:sz w:val="24"/>
+          <w:szCs w:val="24"/>
+          <w:rtl/>
+          <w:lang w:bidi="fa-IR"/>
+        </w:rPr>
+        <w:t xml:space="preserve">و</w:t>
+      </w:r>
+      <w:r>
+        <w:rPr>
+          <w:rFonts w:ascii="Times New Roman" w:hAnsi="Times New Roman" w:cs="Times New Roman"/>
+          <w:sz w:val="22"/>
+          <w:szCs w:val="22"/>
+          <w:lang w:val="en-US"/>
+        </w:rPr>
+        <w:t xml:space="preserve"> c </w:t>
+      </w:r>
+      <w:r>
+        <w:rPr>
+          <w:rFonts w:ascii="B Nazanin" w:hAnsi="B Nazanin" w:cs="B Nazanin" w:hint="cs"/>
+          <w:sz w:val="24"/>
+          <w:szCs w:val="24"/>
+          <w:rtl/>
+          <w:lang w:bidi="fa-IR"/>
+        </w:rPr>
+        <w:t xml:space="preserve">تحلیلی‌اند </w:t>
+      </w:r>
+      <w:r>
+        <w:rPr>
+          <w:rFonts w:ascii="Times New Roman" w:hAnsi="Times New Roman" w:cs="Times New Roman"/>
+          <w:sz w:val="22"/>
+          <w:szCs w:val="22"/>
+          <w:lang w:val="en-US"/>
+        </w:rPr>
+        <w:t xml:space="preserve">(B ± t·SE)</w:t>
+      </w:r>
+      <w:r>
+        <w:rPr>
+          <w:rFonts w:ascii="B Nazanin" w:hAnsi="B Nazanin" w:cs="B Nazanin" w:hint="cs"/>
+          <w:sz w:val="24"/>
+          <w:szCs w:val="24"/>
+          <w:rtl/>
+          <w:lang w:bidi="fa-IR"/>
+        </w:rPr>
+        <w:t xml:space="preserve">؛ برای</w:t>
+      </w:r>
+      <w:r>
+        <w:rPr>
+          <w:rFonts w:ascii="Times New Roman" w:hAnsi="Times New Roman" w:cs="Times New Roman"/>
+          <w:sz w:val="22"/>
+          <w:szCs w:val="22"/>
+          <w:lang w:val="en-US"/>
+        </w:rPr>
+        <w:t xml:space="preserve"> c′ </w:t>
+      </w:r>
+      <w:r>
+        <w:rPr>
+          <w:rFonts w:ascii="B Nazanin" w:hAnsi="B Nazanin" w:cs="B Nazanin" w:hint="cs"/>
+          <w:sz w:val="24"/>
+          <w:szCs w:val="24"/>
+          <w:rtl/>
+          <w:lang w:bidi="fa-IR"/>
+        </w:rPr>
+        <w:t xml:space="preserve">هر دو بازه گزارش شده است: بازه تحلیلی</w:t>
+      </w:r>
+      <w:r>
+        <w:rPr>
+          <w:rFonts w:ascii="Times New Roman" w:hAnsi="Times New Roman" w:cs="Times New Roman"/>
+          <w:sz w:val="22"/>
+          <w:szCs w:val="22"/>
+          <w:lang w:val="en-US"/>
+        </w:rPr>
+        <w:t xml:space="preserve"> c′ </w:t>
+      </w:r>
+      <w:r>
+        <w:rPr>
+          <w:rFonts w:ascii="B Nazanin" w:hAnsi="B Nazanin" w:cs="B Nazanin" w:hint="cs"/>
+          <w:sz w:val="24"/>
+          <w:szCs w:val="24"/>
+          <w:rtl/>
+          <w:lang w:bidi="fa-IR"/>
+        </w:rPr>
+        <w:t xml:space="preserve">صفر را در بر ندارد اما بازه بوت‌استرپ آن صفر را در بر می‌گیرد (گزارش هر دو برای شفافیت)؛ بازه اثر غیرمستقیم، صدکی بوت‌استرپ است.</w:t>
+      </w:r>
+    </w:p>
+    <w:p>
+      <w:pPr>
+        <w:bidi w:val="1"/>
+        <w:spacing w:lineRule="exact" w:line="580" w:after="0"/>
+        <w:jc w:val="both"/>
+      </w:pPr>
+      <w:r>
+        <w:rPr>
+          <w:rFonts w:ascii="B Nazanin" w:hAnsi="B Nazanin" w:cs="B Nazanin" w:hint="cs"/>
           <w:sz w:val="24"/>
           <w:szCs w:val="24"/>
           <w:rtl/>
@@ -6300,7 +6086,7 @@
           <w:rtl/>
           <w:lang w:bidi="fa-IR"/>
         </w:rPr>
-        <w:t xml:space="preserve">میانجی‌گری از نوع جزئی تأیید می‌شود؛ اما چون کرانه پایینِ بازه اطمینان اثر غیرمستقیم (۰٫۰۱۲) به صفر نزدیک است، این تأیید باید محتاطانه خوانده شود: معناداری مسیر غیرمستقیم از نظر آماری برقرار است، ولی اندازه آن کوچک تا متوسط و حساس به بازنمونه‌گیری است و تکریر آن در نمونه مستقل ضرورت دارد.</w:t>
+        <w:t xml:space="preserve">میانجی‌گری از نوع جزئی تأیید می‌شود؛ اما چون کرانه پایینِ بازه اطمینان اثر غیرمستقیم (۰٫۰۱۲) به صفر نزدیک است، این تأیید باید محتاطانه خوانده شود: معناداری مسیر غیرمستقیم از نظر آماری برقرار است، ولی اندازه آن کوچک تا متوسط و حساس به بازنمونه‌گیری است و تکرار آن در نمونه مستقل ضرورت دارد.</w:t>
       </w:r>
     </w:p>
     <w:p>
@@ -7637,7 +7423,7 @@
           <w:rtl/>
           <w:lang w:bidi="fa-IR"/>
         </w:rPr>
-        <w:t xml:space="preserve">الگوی کلی یافته‌ها: اضطراب صفتی نخست طرحواره‌های ناسازگار را فعال می‌کند و این طرحواره‌ها بخشی از اثر را به رفتارهای پرخطر مالی منتقل می‌کنند. مسیری مستقیم و مستقل نیز باقی می‌ماند که احتمالاً بازتاب هیجان‌های موقعیتی و سبک‌های شخصیِ ریسک‌پذیری است. سهم نزدیک به نصفیِ مسیر غیرمستقیم، مداخله طرحواره‌محور را توجیه می‌کند. با این حال، عدم صفرشدن</w:t>
+        <w:t xml:space="preserve">الگوی کلی یافته‌ها: اضطراب صفتی با طرحواره‌های ناسازگار رابطه دارد و بخشی از رابطه اضطراب با رفتارهای پرخطر مالی از مسیر طرحواره‌ها عبور می‌کند. مسیری مستقیم و مستقل نیز باقی می‌ماند که احتمالاً بازتاب هیجان‌های موقعیتی و سبک‌های شخصیِ ریسک‌پذیری است. سهم حدود ۳۵٪ مسیر غیرمستقیم، مداخله طرحواره‌محور را توجیه می‌کند. با این حال، عدم صفرشدن</w:t>
       </w:r>
       <w:r>
         <w:rPr>
@@ -7673,7 +7459,7 @@
           <w:rtl/>
           <w:lang w:bidi="fa-IR"/>
         </w:rPr>
-        <w:t xml:space="preserve">پیش از ارجاع به فصل پنجم سه محدودیت روش‌شناختی را یادآوری می‌کنیم: طرح مقطعی امکان استنتاج قطعیِ جهت علّی را نمی‌دهد و میانجی‌گری اینجا سازگاری با مدل نظری را نشان می‌کند نه اثبات آزمایشی آن؛ اتکا به خودگزارش‌دهی ممکن است واریانس مشترک روش را وارد کرده باشد، هرچند حلقه معنادار</w:t>
+        <w:t xml:space="preserve">سه محدودیت روش‌شناختی یادآوری می‌شود: طرح مقطعی امکان استنتاج قطعیِ جهت علّی را نمی‌دهد و میانجی‌گری اینجا سازگاری با مدل نظری را نشان می‌کند نه اثبات آزمایشی آن؛ اتکا به خودگزارش‌دهی ممکن است واریانس مشترک روش را وارد کرده باشد، هرچند حلقه معنادار</w:t>
       </w:r>
       <w:r>
         <w:rPr>
@@ -7711,7 +7497,7 @@
           <w:rtl/>
           <w:lang w:bidi="fa-IR"/>
         </w:rPr>
-        <w:t xml:space="preserve">هم‌جهت با پیش‌بینی‌های نظری مستقل هستند؛ و غلبه مردان و معامله‌گران بورس، دامنه‌ی تعمیم را محدود می‌کند. تبیین این محدودیت‌ها و پیشنهادهای پژوهشی، کار فصل پنجم است.</w:t>
+        <w:t xml:space="preserve">هم‌جهت با پیش‌بینی‌های نظری مستقل هستند؛ و غلبه مردان و معامله‌گران بورس، دامنه تعمیم را محدود می‌کند. تبیین این محدودیت‌ها و پیشنهادهای پژوهشی، کار فصل پنجم است.</w:t>
       </w:r>
     </w:p>
     <w:sectPr>

</xml_diff>

<commit_message>
fix: apply user decisions for grable range, 4-month case, and 6-month transactions label
</commit_message>
<xml_diff>
--- a/output/final/chapter4_simulated_full_demo_v2.docx
+++ b/output/final/chapter4_simulated_full_demo_v2.docx
@@ -165,7 +165,7 @@
           <w:rtl/>
           <w:lang w:bidi="fa-IR"/>
         </w:rPr>
-        <w:t xml:space="preserve">داده‌ها به‌صورت آنلاین و از طریق فراخوان در شبکه‌ها و انجمن‌های تخصصی معامله‌گران بازارهای مالی گردآوری شد. پرسشنامه شامل بخش جمعیت‌شناختی و سه مقیاس اصلی بود و زمان تکمیل آن برای پاسخ‌دهندگان عادی در فایل لاگ سامانه ثبت شد. در مجموع ۲۱۲ نفر وارد پرسشنامه شدند و فرآیند غربالگری در چهار مرحله متوالی و بر اساس معیارهای از پیش ثبت‌شده انجام گرفت تا کیفیت داده ورودی به تحلیل تضمین شود.</w:t>
+        <w:t xml:space="preserve">داده‌ها به‌صورت آنلاین و از طریق فراخوان در شبکه‌ها و انجمن‌های تخصصی معامله‌گران بازارهای مالی گردآوری شد. پرسشنامه شامل بخش جمعیت‌شناختی و سه مقیاس اصلی بود و زمان تکمیل آن برای پاسخ‌دهندگان عادی در فایل لاگ سامانه ثبت شد. در مجموع ۲۱۲ نفر وارد پرسشنامه شدند و فرآیند غربالگری در پنج مرحله متوالی و بر اساس معیارهای از پیش ثبت‌شده انجام گرفت تا کیفیت داده ورودی به تحلیل تضمین شود.</w:t>
       </w:r>
     </w:p>
     <w:p>
@@ -200,7 +200,7 @@
           <w:rtl/>
           <w:lang w:bidi="fa-IR"/>
         </w:rPr>
-        <w:t xml:space="preserve"> شناسایی و حذف شدند؛ در این موارد، پاسخ‌دهنده در مقیاس‌های چندگویه‌ای عملاً واریانسی نشان نداده و به همه گویه‌ها گزینه‌ای تکراری داده بود. در مرحله چهارم، پاسخ‌هایی که زمان تکمیلشان کمتر از ۱۲۰ ثانیه بود حذف شدند؛ زمانی که برای خواندن و پاسخ‌دادن به ۱۰۸ گویه عملاً کافی نیست و نشانه تلاش ناکافی است.</w:t>
+        <w:t xml:space="preserve"> شناسایی و حذف شدند؛ در این موارد، پاسخ‌دهنده در مقیاس‌های چندگویه‌ای عملاً واریانسی نشان نداده و به همه گویه‌ها گزینه‌ای تکراری داده بود. در مرحله چهارم، پاسخ‌هایی که زمان تکمیلشان کمتر از ۱۲۰ ثانیه بود حذف شدند؛ زمانی که برای خواندن و پاسخ‌دادن به ۱۰۸ گویه عملاً کافی نیست و نشانه تلاش ناکافی است. در مرحله پنجم، پاسخ‌هایی که شرط‌های ورود (سن ۱۸ سال و سابقه ۶ ماه) را نداشتند حذف شدند.</w:t>
       </w:r>
     </w:p>
     <w:p>
@@ -217,7 +217,7 @@
           <w:rtl/>
           <w:lang w:bidi="fa-IR"/>
         </w:rPr>
-        <w:t xml:space="preserve">جدول ۴-۱ روند غربالگری را در هر مرحله خلاصه می‌کند. شمارش‌ها به‌ترتیب اجرای مراحل روی صفِ باقی‌مانده محاسبه شده‌اند؛ در این داده چهار دلیل حذف دقیقاً منفصل‌الوجودند (هر فرد حداکثر یک دلیل) و جمع مراحل ۷ + ۱۴ + ۱۱ + ۹ = ۴۱ است؛ پس از ۲۱۲ پاسخ خام، ۱۷۱ پاسخ معتبر باقی ماند (۸۰٫۷٪) و ۴۱ حذف شد (۱۹٫۳٪).</w:t>
+        <w:t xml:space="preserve">جدول ۴-۱ روند غربالگری را در هر مرحله خلاصه می‌کند. شمارش‌ها به‌ترتیب اجرای مراحل روی صفِ باقی‌مانده محاسبه شده‌اند؛ در این داده پنج دلیل حذف دقیقاً منفصل‌الوجودند (هر فرد حداکثر یک دلیل) و جمع مراحل ۷ + ۱۴ + ۱۱ + ۹ + ۱ = ۴۲ است؛ پس از ۲۱۲ پاسخ خام، ۱۷۰ پاسخ معتبر باقی ماند (۸۰٫۲٪) و ۴۲ حذف شد (۱۹٫۸٪).</w:t>
       </w:r>
     </w:p>
     <w:p>
@@ -653,6 +653,64 @@
                 <w:b w:val="0"/>
                 <w:sz w:val="22"/>
               </w:rPr>
+              <w:t>حذف: نقض شرط ورود</w:t>
+            </w:r>
+          </w:p>
+        </w:tc>
+        <w:tc>
+          <w:tcPr>
+            <w:tcW w:type="dxa" w:w="2740"/>
+          </w:tcPr>
+          <w:p>
+            <w:pPr>
+              <w:jc w:val="center"/>
+            </w:pPr>
+            <w:r/>
+            <w:r>
+              <w:rPr>
+                <w:b w:val="0"/>
+                <w:sz w:val="22"/>
+              </w:rPr>
+              <w:t>1</w:t>
+            </w:r>
+          </w:p>
+        </w:tc>
+        <w:tc>
+          <w:tcPr>
+            <w:tcW w:type="dxa" w:w="2740"/>
+          </w:tcPr>
+          <w:p>
+            <w:pPr>
+              <w:bidi w:val="1"/>
+              <w:jc w:val="center"/>
+            </w:pPr>
+            <w:r/>
+            <w:r>
+              <w:rPr>
+                <w:b w:val="0"/>
+                <w:sz w:val="22"/>
+              </w:rPr>
+              <w:t>سن یا سابقه کمتر از حد</w:t>
+            </w:r>
+          </w:p>
+        </w:tc>
+      </w:tr>
+      <w:tr>
+        <w:tc>
+          <w:tcPr>
+            <w:tcW w:type="dxa" w:w="2740"/>
+          </w:tcPr>
+          <w:p>
+            <w:pPr>
+              <w:bidi w:val="1"/>
+              <w:jc w:val="center"/>
+            </w:pPr>
+            <w:r/>
+            <w:r>
+              <w:rPr>
+                <w:b w:val="0"/>
+                <w:sz w:val="22"/>
+              </w:rPr>
               <w:t>نمونهٔ نهایی معتبر</w:t>
             </w:r>
           </w:p>
@@ -671,7 +729,7 @@
                 <w:b w:val="0"/>
                 <w:sz w:val="22"/>
               </w:rPr>
-              <w:t>171</w:t>
+              <w:t>170</w:t>
             </w:r>
           </w:p>
         </w:tc>
@@ -709,7 +767,7 @@
           <w:rtl/>
           <w:lang w:bidi="fa-IR"/>
         </w:rPr>
-        <w:t xml:space="preserve">درصد حذف از نسبت ۴۱ به ۲۱۲ (= ۱۹٫۳۴٪) محاسبه شده و در محدوده متعارف پژوهش‌های آنلاین (۱۰ تا ۲۰٪) قرار دارد. میانه زمان تکمیل در نمونه معتبر حدود ۸ دقیقه بود و بازه چارکی آن ۵٫۷۰ تا ۱۲٫۰۹ دقیقه به طول انجامید؛ دنباله آهسته توزیع زمان (بیشینه ۳۸ دقیقه) با الگوی طبیعی تکمیل دقت‌محور هم‌خوان است. در نمونه نهایی، داده گم‌شده در گویه‌ها باقی نماند، زیرا سامانه برای پرونده‌های معتبر تکمیل اجباری اقلام را اعمال کرده بود.</w:t>
+        <w:t xml:space="preserve">درصد حذف از نسبت ۴۲ به ۲۱۲ (= ۱۹٫۸۱٪) محاسبه شده و در محدوده متعارف پژوهش‌های آنلاین (۱۰ تا ۲۰٪) قرار دارد. میانه زمان تکمیل در نمونه معتبر حدود ۸ دقیقه بود و بازه چارکی آن ۵٫۶۸ تا ۱۱٫۹۰ دقیقه به طول انجامید؛ دنباله آهسته توزیع زمان (بیشینه ۳۸ دقیقه) با الگوی طبیعی تکمیل دقت‌محور هم‌خوان است. در نمونه نهایی، داده گم‌شده در گویه‌ها باقی نماند، زیرا سامانه برای پرونده‌های معتبر تکمیل اجباری اقلام را اعمال کرده بود.</w:t>
       </w:r>
     </w:p>
     <w:p>
@@ -745,7 +803,7 @@
           <w:rtl/>
           <w:lang w:bidi="fa-IR"/>
         </w:rPr>
-        <w:t xml:space="preserve">میانگین سنی نمونه ۳۲٫۳۴ سال (انحراف معیار ۸٫۸۶) بود. توزیع سنی تک‌قله‌ای و به‌سوی سنین جوان‌تر متمایل است که توصیف نمونه حاضر است و نیازمند داده‌های مرجع جداگانه برای مقایسه است؛ گروه‌های سنی بالاتر اگرچه کم‌شمار اما غیرصفرند و این دامنه نسبی، تعمیم‌پذیری یافته‌ها را در بازه محدودی از سطوح حمایت می‌کند.</w:t>
+        <w:t xml:space="preserve">میانگین سنی نمونه ۳۲٫۳۰ سال (انحراف معیار ۸٫۸۷) بود. توزیع سنی تک‌قله‌ای و به‌سوی سنین جوان‌تر متمایل است که توصیف نمونه حاضر است و نیازمند داده‌های مرجع جداگانه برای مقایسه است؛ گروه‌های سنی بالاتر اگرچه کم‌شمار اما غیرصفرند و این دامنه نسبی، تعمیم‌پذیری یافته‌ها را در بازه محدودی از سطوح حمایت می‌کند.</w:t>
       </w:r>
     </w:p>
     <w:p>
@@ -762,7 +820,7 @@
           <w:rtl/>
           <w:lang w:bidi="fa-IR"/>
         </w:rPr>
-        <w:t xml:space="preserve">از نظر جنسیت، ۶۶٫۰۸٪ از پاسخ‌دهندگان مرد و ۳۳٫۹۲٪ زن بودند. این برآیند مردانه صرفاً ترکیب نمونه حاضر را توصیف می‌کند؛ با این حال، به‌دلیل غلبه مردان، تعمیم دقیق نتایج به زنان معامله‌گر با احتیاط امکان‌پذیر است و این نامتوازنی در محدودیت‌های فصل پنجم نیز یادآوری خواهد شد.</w:t>
+        <w:t xml:space="preserve">از نظر جنسیت، ۶۵٫۸۸٪ از پاسخ‌دهندگان مرد و ۳۴٫۱۲٪ زن بودند. این برآیند مردانه صرفاً ترکیب نمونه حاضر را توصیف می‌کند؛ با این حال، به‌دلیل غلبه مردان، تعمیم دقیق نتایج به زنان معامله‌گر با احتیاط امکان‌پذیر است و این نامتوازنی در محدودیت‌های فصل پنجم نیز یادآوری خواهد شد.</w:t>
       </w:r>
     </w:p>
     <w:p>
@@ -779,7 +837,7 @@
           <w:rtl/>
           <w:lang w:bidi="fa-IR"/>
         </w:rPr>
-        <w:t xml:space="preserve">در سطح تحصیلات، کارشناسی با ۵۰٫۸۸٪ و کارشناسی ارشد با ۲۵٫۱۵٪ بیشترین سهم را داشتند و دیپلم ۱۷٫۵۴٪ بود.</w:t>
+        <w:t xml:space="preserve">در سطح تحصیلات، کارشناسی با ۵۱٫۱۸٪ و کارشناسی ارشد با ۲۵٫۲۹٪ بیشترین سهم را داشتند و دیپلم ۱۷٫۰۶٪ بود.</w:t>
       </w:r>
     </w:p>
     <w:p>
@@ -796,7 +854,7 @@
           <w:rtl/>
           <w:lang w:bidi="fa-IR"/>
         </w:rPr>
-        <w:t xml:space="preserve">بازار فعالیت اصلی در نمونه یکدست نیست؛ بورس با ۴۶٫۷۸٪ فراوانی، غالب است و پس از آن رمزارز (۲۲٫۸۱٪)، فارکس (۱۸٫۱۳٪) و طلا (۱۲٫۲۸٪) قرار می‌گیرند. میانگین سابقه معامله ۳۸٫۸۹ ماه (انحراف معیار ۲۴٫۳۵) و میانگین تعداد معاملات ماهانه ۷٫۴۲ مورد بود. جالب توجه آنکه بین سابقه و شدت معاملاتی همبستگی رتبه‌ای مثبت و ملایمی وجود داشت </w:t>
+        <w:t xml:space="preserve">بازار فعالیت اصلی در نمونه یکدست نیست؛ بورس با ۴۶٫۴۷٪ فراوانی، غالب است و پس از آن رمزارز (۲۲٫۹۴٪)، فارکس (۱۸٫۲۴٪) و طلا (۱۲٫۳۵٪) قرار می‌گیرند. میانگین سابقه معامله ۳۹٫۰۹ ماه (انحراف معیار ۲۴٫۲۸) و میانگین تعداد معاملات در ۶ ماه اخیر ۷٫۴۲ مورد بود. جالب توجه آنکه بین سابقه و شدت معاملاتی همبستگی رتبه‌ای مثبت و ملایمی وجود داشت </w:t>
       </w:r>
       <w:r>
         <w:rPr>
@@ -853,7 +911,7 @@
           <w:szCs w:val="20"/>
           <w:lang w:val="en-US"/>
         </w:rPr>
-        <w:t xml:space="preserve">(N = 171)</w:t>
+        <w:t xml:space="preserve">(N = 170)</w:t>
       </w:r>
     </w:p>
     <w:tbl>
@@ -1015,7 +1073,7 @@
                 <w:b w:val="0"/>
                 <w:sz w:val="22"/>
               </w:rPr>
-              <w:t>113</w:t>
+              <w:t>112</w:t>
             </w:r>
           </w:p>
         </w:tc>
@@ -1033,7 +1091,7 @@
                 <w:b w:val="0"/>
                 <w:sz w:val="22"/>
               </w:rPr>
-              <w:t>66.08</w:t>
+              <w:t>65.88</w:t>
             </w:r>
           </w:p>
         </w:tc>
@@ -1109,7 +1167,7 @@
                 <w:b w:val="0"/>
                 <w:sz w:val="22"/>
               </w:rPr>
-              <w:t>33.92</w:t>
+              <w:t>34.12</w:t>
             </w:r>
           </w:p>
         </w:tc>
@@ -1184,7 +1242,7 @@
                 <w:b w:val="0"/>
                 <w:sz w:val="22"/>
               </w:rPr>
-              <w:t>36.84</w:t>
+              <w:t>37.06</w:t>
             </w:r>
           </w:p>
         </w:tc>
@@ -1259,7 +1317,7 @@
                 <w:b w:val="0"/>
                 <w:sz w:val="22"/>
               </w:rPr>
-              <w:t>28.65</w:t>
+              <w:t>28.82</w:t>
             </w:r>
           </w:p>
         </w:tc>
@@ -1316,7 +1374,7 @@
                 <w:b w:val="0"/>
                 <w:sz w:val="22"/>
               </w:rPr>
-              <w:t>44</w:t>
+              <w:t>43</w:t>
             </w:r>
           </w:p>
         </w:tc>
@@ -1334,7 +1392,7 @@
                 <w:b w:val="0"/>
                 <w:sz w:val="22"/>
               </w:rPr>
-              <w:t>25.73</w:t>
+              <w:t>25.29</w:t>
             </w:r>
           </w:p>
         </w:tc>
@@ -1409,7 +1467,7 @@
                 <w:b w:val="0"/>
                 <w:sz w:val="22"/>
               </w:rPr>
-              <w:t>8.77</w:t>
+              <w:t>8.82</w:t>
             </w:r>
           </w:p>
         </w:tc>
@@ -1467,7 +1525,7 @@
                 <w:b w:val="0"/>
                 <w:sz w:val="22"/>
               </w:rPr>
-              <w:t>30</w:t>
+              <w:t>29</w:t>
             </w:r>
           </w:p>
         </w:tc>
@@ -1485,7 +1543,7 @@
                 <w:b w:val="0"/>
                 <w:sz w:val="22"/>
               </w:rPr>
-              <w:t>17.54</w:t>
+              <w:t>17.06</w:t>
             </w:r>
           </w:p>
         </w:tc>
@@ -1561,7 +1619,7 @@
                 <w:b w:val="0"/>
                 <w:sz w:val="22"/>
               </w:rPr>
-              <w:t>50.88</w:t>
+              <w:t>51.18</w:t>
             </w:r>
           </w:p>
         </w:tc>
@@ -1637,7 +1695,7 @@
                 <w:b w:val="0"/>
                 <w:sz w:val="22"/>
               </w:rPr>
-              <w:t>25.15</w:t>
+              <w:t>25.29</w:t>
             </w:r>
           </w:p>
         </w:tc>
@@ -1713,7 +1771,7 @@
                 <w:b w:val="0"/>
                 <w:sz w:val="22"/>
               </w:rPr>
-              <w:t>6.43</w:t>
+              <w:t>6.47</w:t>
             </w:r>
           </w:p>
         </w:tc>
@@ -1771,7 +1829,7 @@
                 <w:b w:val="0"/>
                 <w:sz w:val="22"/>
               </w:rPr>
-              <w:t>80</w:t>
+              <w:t>79</w:t>
             </w:r>
           </w:p>
         </w:tc>
@@ -1789,7 +1847,7 @@
                 <w:b w:val="0"/>
                 <w:sz w:val="22"/>
               </w:rPr>
-              <w:t>46.78</w:t>
+              <w:t>46.47</w:t>
             </w:r>
           </w:p>
         </w:tc>
@@ -1865,7 +1923,7 @@
                 <w:b w:val="0"/>
                 <w:sz w:val="22"/>
               </w:rPr>
-              <w:t>22.81</w:t>
+              <w:t>22.94</w:t>
             </w:r>
           </w:p>
         </w:tc>
@@ -1941,7 +1999,7 @@
                 <w:b w:val="0"/>
                 <w:sz w:val="22"/>
               </w:rPr>
-              <w:t>18.13</w:t>
+              <w:t>18.24</w:t>
             </w:r>
           </w:p>
         </w:tc>
@@ -2017,7 +2075,7 @@
                 <w:b w:val="0"/>
                 <w:sz w:val="22"/>
               </w:rPr>
-              <w:t>12.28</w:t>
+              <w:t>12.35</w:t>
             </w:r>
           </w:p>
         </w:tc>
@@ -2092,7 +2150,7 @@
                 <w:b w:val="0"/>
                 <w:sz w:val="22"/>
               </w:rPr>
-              <w:t>49.71</w:t>
+              <w:t>50.00</w:t>
             </w:r>
           </w:p>
         </w:tc>
@@ -2149,7 +2207,7 @@
                 <w:b w:val="0"/>
                 <w:sz w:val="22"/>
               </w:rPr>
-              <w:t>59</w:t>
+              <w:t>58</w:t>
             </w:r>
           </w:p>
         </w:tc>
@@ -2167,7 +2225,7 @@
                 <w:b w:val="0"/>
                 <w:sz w:val="22"/>
               </w:rPr>
-              <w:t>34.50</w:t>
+              <w:t>34.12</w:t>
             </w:r>
           </w:p>
         </w:tc>
@@ -2242,7 +2300,7 @@
                 <w:b w:val="0"/>
                 <w:sz w:val="22"/>
               </w:rPr>
-              <w:t>15.79</w:t>
+              <w:t>15.88</w:t>
             </w:r>
           </w:p>
         </w:tc>
@@ -2263,7 +2321,7 @@
                 <w:b w:val="0"/>
                 <w:sz w:val="22"/>
               </w:rPr>
-              <w:t>معاملات در ماه</w:t>
+              <w:t>تعداد معاملات در ۶ ماه اخیر</w:t>
             </w:r>
           </w:p>
         </w:tc>
@@ -2299,7 +2357,7 @@
                 <w:b w:val="0"/>
                 <w:sz w:val="22"/>
               </w:rPr>
-              <w:t>133</w:t>
+              <w:t>132</w:t>
             </w:r>
           </w:p>
         </w:tc>
@@ -2317,7 +2375,7 @@
                 <w:b w:val="0"/>
                 <w:sz w:val="22"/>
               </w:rPr>
-              <w:t>77.78</w:t>
+              <w:t>77.65</w:t>
             </w:r>
           </w:p>
         </w:tc>
@@ -2338,7 +2396,7 @@
                 <w:b w:val="0"/>
                 <w:sz w:val="22"/>
               </w:rPr>
-              <w:t>معاملات در ماه</w:t>
+              <w:t>تعداد معاملات در ۶ ماه اخیر</w:t>
             </w:r>
           </w:p>
         </w:tc>
@@ -2356,7 +2414,7 @@
                 <w:b w:val="0"/>
                 <w:sz w:val="22"/>
               </w:rPr>
-              <w:t>11-30</w:t>
+              <w:t>11-50</w:t>
             </w:r>
           </w:p>
         </w:tc>
@@ -2374,7 +2432,7 @@
                 <w:b w:val="0"/>
                 <w:sz w:val="22"/>
               </w:rPr>
-              <w:t>37</w:t>
+              <w:t>38</w:t>
             </w:r>
           </w:p>
         </w:tc>
@@ -2392,7 +2450,7 @@
                 <w:b w:val="0"/>
                 <w:sz w:val="22"/>
               </w:rPr>
-              <w:t>21.64</w:t>
+              <w:t>22.35</w:t>
             </w:r>
           </w:p>
         </w:tc>
@@ -2413,7 +2471,7 @@
                 <w:b w:val="0"/>
                 <w:sz w:val="22"/>
               </w:rPr>
-              <w:t>معاملات در ماه</w:t>
+              <w:t>تعداد معاملات در ۶ ماه اخیر</w:t>
             </w:r>
           </w:p>
         </w:tc>
@@ -2431,7 +2489,7 @@
                 <w:b w:val="0"/>
                 <w:sz w:val="22"/>
               </w:rPr>
-              <w:t>31+</w:t>
+              <w:t>0</w:t>
             </w:r>
           </w:p>
         </w:tc>
@@ -2449,7 +2507,7 @@
                 <w:b w:val="0"/>
                 <w:sz w:val="22"/>
               </w:rPr>
-              <w:t>1</w:t>
+              <w:t>0</w:t>
             </w:r>
           </w:p>
         </w:tc>
@@ -2467,7 +2525,82 @@
                 <w:b w:val="0"/>
                 <w:sz w:val="22"/>
               </w:rPr>
-              <w:t>0.58</w:t>
+              <w:t>0.00</w:t>
+            </w:r>
+          </w:p>
+        </w:tc>
+      </w:tr>
+      <w:tr>
+        <w:tc>
+          <w:tcPr>
+            <w:tcW w:type="dxa" w:w="2055"/>
+          </w:tcPr>
+          <w:p>
+            <w:pPr>
+              <w:bidi w:val="1"/>
+              <w:jc w:val="center"/>
+            </w:pPr>
+            <w:r/>
+            <w:r>
+              <w:rPr>
+                <w:b w:val="0"/>
+                <w:sz w:val="22"/>
+              </w:rPr>
+              <w:t>تعداد معاملات در ۶ ماه اخیر</w:t>
+            </w:r>
+          </w:p>
+        </w:tc>
+        <w:tc>
+          <w:tcPr>
+            <w:tcW w:type="dxa" w:w="2055"/>
+          </w:tcPr>
+          <w:p>
+            <w:pPr>
+              <w:jc w:val="center"/>
+            </w:pPr>
+            <w:r/>
+            <w:r>
+              <w:rPr>
+                <w:b w:val="0"/>
+                <w:sz w:val="22"/>
+              </w:rPr>
+              <w:t>50+</w:t>
+            </w:r>
+          </w:p>
+        </w:tc>
+        <w:tc>
+          <w:tcPr>
+            <w:tcW w:type="dxa" w:w="2055"/>
+          </w:tcPr>
+          <w:p>
+            <w:pPr>
+              <w:jc w:val="center"/>
+            </w:pPr>
+            <w:r/>
+            <w:r>
+              <w:rPr>
+                <w:b w:val="0"/>
+                <w:sz w:val="22"/>
+              </w:rPr>
+              <w:t>0</w:t>
+            </w:r>
+          </w:p>
+        </w:tc>
+        <w:tc>
+          <w:tcPr>
+            <w:tcW w:type="dxa" w:w="2055"/>
+          </w:tcPr>
+          <w:p>
+            <w:pPr>
+              <w:jc w:val="center"/>
+            </w:pPr>
+            <w:r/>
+            <w:r>
+              <w:rPr>
+                <w:b w:val="0"/>
+                <w:sz w:val="22"/>
+              </w:rPr>
+              <w:t>0.00</w:t>
             </w:r>
           </w:p>
         </w:tc>
@@ -2764,7 +2897,7 @@
                 <w:b w:val="0"/>
                 <w:sz w:val="22"/>
               </w:rPr>
-              <w:t>46.16</w:t>
+              <w:t>46.12</w:t>
             </w:r>
           </w:p>
         </w:tc>
@@ -2782,7 +2915,7 @@
                 <w:b w:val="0"/>
                 <w:sz w:val="22"/>
               </w:rPr>
-              <w:t>11.19</w:t>
+              <w:t>11.21</w:t>
             </w:r>
           </w:p>
         </w:tc>
@@ -2836,7 +2969,7 @@
                 <w:b w:val="0"/>
                 <w:sz w:val="22"/>
               </w:rPr>
-              <w:t>0.05</w:t>
+              <w:t>0.06</w:t>
             </w:r>
           </w:p>
         </w:tc>
@@ -2854,7 +2987,7 @@
                 <w:b w:val="0"/>
                 <w:sz w:val="22"/>
               </w:rPr>
-              <w:t>-0.52</w:t>
+              <w:t>-0.53</w:t>
             </w:r>
           </w:p>
         </w:tc>
@@ -2893,7 +3026,7 @@
                 <w:b w:val="0"/>
                 <w:sz w:val="22"/>
               </w:rPr>
-              <w:t>223.31</w:t>
+              <w:t>223.38</w:t>
             </w:r>
           </w:p>
         </w:tc>
@@ -2911,7 +3044,7 @@
                 <w:b w:val="0"/>
                 <w:sz w:val="22"/>
               </w:rPr>
-              <w:t>42.91</w:t>
+              <w:t>43.03</w:t>
             </w:r>
           </w:p>
         </w:tc>
@@ -2983,7 +3116,7 @@
                 <w:b w:val="0"/>
                 <w:sz w:val="22"/>
               </w:rPr>
-              <w:t>-0.50</w:t>
+              <w:t>-0.51</w:t>
             </w:r>
           </w:p>
         </w:tc>
@@ -3022,7 +3155,7 @@
                 <w:b w:val="0"/>
                 <w:sz w:val="22"/>
               </w:rPr>
-              <w:t>29.79</w:t>
+              <w:t>23.29</w:t>
             </w:r>
           </w:p>
         </w:tc>
@@ -3040,7 +3173,7 @@
                 <w:b w:val="0"/>
                 <w:sz w:val="22"/>
               </w:rPr>
-              <w:t>8.18</w:t>
+              <w:t>5.01</w:t>
             </w:r>
           </w:p>
         </w:tc>
@@ -3058,7 +3191,7 @@
                 <w:b w:val="0"/>
                 <w:sz w:val="22"/>
               </w:rPr>
-              <w:t>14</w:t>
+              <w:t>13.62</w:t>
             </w:r>
           </w:p>
         </w:tc>
@@ -3076,7 +3209,7 @@
                 <w:b w:val="0"/>
                 <w:sz w:val="22"/>
               </w:rPr>
-              <w:t>53</w:t>
+              <w:t>37.62</w:t>
             </w:r>
           </w:p>
         </w:tc>
@@ -3094,7 +3227,7 @@
                 <w:b w:val="0"/>
                 <w:sz w:val="22"/>
               </w:rPr>
-              <w:t>0.43</w:t>
+              <w:t>0.44</w:t>
             </w:r>
           </w:p>
         </w:tc>
@@ -3112,7 +3245,7 @@
                 <w:b w:val="0"/>
                 <w:sz w:val="22"/>
               </w:rPr>
-              <w:t>-0.16</w:t>
+              <w:t>-0.11</w:t>
             </w:r>
           </w:p>
         </w:tc>
@@ -3132,7 +3265,7 @@
           <w:rtl/>
           <w:lang w:bidi="fa-IR"/>
         </w:rPr>
-        <w:t xml:space="preserve">میانگین اضطراب صفتی (۴۶٫۱۶ از ۸۰) در این نمونه به دست آمد و مقایسه آن با هنجارها نیازمند داده‌های مرجع جداگانه است؛ این جای‌گیری برای جامعه معامله‌گران قابل انتظار بوده و نشانه هم‌زمانیِ دامنه کافی (کمینه ۲۲ تا بیشینه ۷۲) و نبود اثر سقف/کف است.</w:t>
+        <w:t xml:space="preserve">میانگین اضطراب صفتی (۴۶٫۱۲ از ۸۰) در این نمونه به دست آمد و مقایسه آن با هنجارها نیازمند داده‌های مرجع جداگانه است؛ این جای‌گیری برای جامعه معامله‌گران قابل انتظار بوده و نشانه هم‌زمانیِ دامنه کافی (کمینه ۲۲ تا بیشینه ۷۲) و نبود اثر سقف/کف است.</w:t>
       </w:r>
     </w:p>
     <w:p>
@@ -3149,7 +3282,7 @@
           <w:rtl/>
           <w:lang w:bidi="fa-IR"/>
         </w:rPr>
-        <w:t xml:space="preserve">میانگین طرحواره ناسازگار ۲۲۳٫۳۱ از ۴۵۰ و میانگین رفتار مالی پرخطر ۲۹٫۷۹ از ۶۵ است؛ هر دو پایین‌تر از نقطه میانی بازه نظری مقیاس خود قرار دارند. رفتار مالی چولگی مثبت ملایمی (۰٫۴۳) نشان می‌دهد؛ این نامتقارنی با ماهیت مقیاس‌های ریسک‌پذیری هم‌خوان است که شمار اندکی افراد با ریسک بسیار بالا دنباله راست را کشیده‌اند و از همین رو، تفسیرهای بعدی با روش مقاوم (بوت‌استرپ) نیز کنترل خواهند شد. کشیدگی‌های کوچک منفی نیز بیانگر دامنه بازتر از نرمال ایده‌آل است و نه چیزی که نیاز به تبدیل داشته باشد.</w:t>
+        <w:t xml:space="preserve">میانگین طرحواره ناسازگار ۲۲۳٫۳۸ از ۴۵۰ و میانگین رفتار مالی پرخطر ۲۳٫۲۹ از ۴۵ است؛ هر دو پایین‌تر از نقطه میانی بازه نظری مقیاس خود قرار دارند. رفتار مالی چولگی مثبت ملایمی (۰٫۴۴) نشان می‌دهد؛ این نامتقارنی با ماهیت مقیاس‌های ریسک‌پذیری هم‌خوان است که شمار اندکی افراد با ریسک بسیار بالا دنباله راست را کشیده‌اند و از همین رو، تفسیرهای بعدی با روش مقاوم (بوت‌استرپ) نیز کنترل خواهند شد. کشیدگی‌های کوچک منفی نیز بیانگر دامنه بازتر از نرمال ایده‌آل است و نه چیزی که نیاز به تبدیل داشته باشد.</w:t>
       </w:r>
     </w:p>
     <w:p>
@@ -3185,7 +3318,7 @@
           <w:rtl/>
           <w:lang w:bidi="fa-IR"/>
         </w:rPr>
-        <w:t xml:space="preserve">پایایی مقیاس‌ها در نمونه حاضر با آلفای کرونباخ برآورد شد (جدول ۴-۴). آلفای اضطراب صفتی ۰٫۹۰۲ و آلفای رفتارهای مالی پرخطر ۰٫۸۰۱ بود؛ هر دو در بازه مطلوب قرار گرفتند. آلفای کل مقیاس طرحواره ۰٫۹۲۹ به دست آمد. مقداری مطلوب و پایین‌تر از کرانه ۰٫۹۵. مقادیر بسیار نزدیک به ۱ معمولاً نشانه هم‌پوشانی محتوایی گویه‌هاست و در اینجا دیده نمی‌شود.</w:t>
+        <w:t xml:space="preserve">پایایی مقیاس‌ها در نمونه حاضر با آلفای کرونباخ برآورد شد (جدول ۴-۴). آلفای اضطراب صفتی ۰٫۹۰۲ و آلفای رفتارهای مالی پرخطر ۰٫۸۰۰ بود؛ هر دو در بازه مطلوب قرار گرفتند. آلفای کل مقیاس طرحواره ۰٫۹۲۹ به دست آمد. مقداری مطلوب و پایین‌تر از کرانه ۰٫۹۵. مقادیر بسیار نزدیک به ۱ معمولاً نشانه هم‌پوشانی محتوایی گویه‌هاست و در اینجا دیده نمی‌شود.</w:t>
       </w:r>
     </w:p>
     <w:p>
@@ -3466,7 +3599,7 @@
                 <w:b w:val="0"/>
                 <w:sz w:val="22"/>
               </w:rPr>
-              <w:t>0.801</w:t>
+              <w:t>0.800</w:t>
             </w:r>
           </w:p>
         </w:tc>
@@ -3563,7 +3696,7 @@
           <w:rtl/>
           <w:lang w:bidi="fa-IR"/>
         </w:rPr>
-        <w:t xml:space="preserve"> فاصله ماهالانوبیس برای هر مشاهده بر مبنای سه متغیر اصلی محاسبه شد. هیچ موردی از آستانه کای‌دو (۳ درجه آزادی، ۰٫۰۰۱ = ۱۶٫۲۷) فراتر نرفت، اما ۱ مورد در منطقه هشدار (بالای ۱۲) بود و نزدیک‌ترین مقدار بیشینه ۱۴٫۸۸ بود. با معاینه موارد مرزی، پاسخ‌هایشان منسجم و محتوایی تشخیص داده شد و بر اساس اصل حذف حداقلی، در نمونه حفظ شدند.</w:t>
+        <w:t xml:space="preserve"> فاصله ماهالانوبیس برای هر مشاهده بر مبنای سه متغیر اصلی محاسبه شد. هیچ موردی از آستانه کای‌دو (۳ درجه آزادی، ۰٫۰۰۱ = ۱۶٫۲۷) فراتر نرفت، اما ۱ مورد در منطقه هشدار (بالای ۱۲) بود و نزدیک‌ترین مقدار بیشینه ۱۵٫۱۱ بود. با معاینه موارد مرزی، پاسخ‌هایشان منسجم و محتوایی تشخیص داده شد و بر اساس اصل حذف حداقلی، در نمونه حفظ شدند.</w:t>
       </w:r>
     </w:p>
     <w:p>
@@ -3611,7 +3744,7 @@
           <w:rtl/>
           <w:lang w:bidi="fa-IR"/>
         </w:rPr>
-        <w:t xml:space="preserve">برابر ۱٫۲۹ و تلورانس ۰٫۷۷ بود که نشانه هم‌خطی آزاردهنده نیست. </w:t>
+        <w:t xml:space="preserve">برابر ۱٫۳۰ و تلورانس ۰٫۷۷ بود که نشانه هم‌خطی آزاردهنده نیست. </w:t>
       </w:r>
       <w:r>
         <w:rPr>
@@ -3633,7 +3766,7 @@
           <w:rtl/>
           <w:lang w:bidi="fa-IR"/>
         </w:rPr>
-        <w:t xml:space="preserve"> دوربین-واتسون در مدل میانجی ۱٫۸۵ و در مدل پیامد ۱٫۸۳ بود؛ هر دو به ۲ نزدیک‌اند و پیش‌فرض استقلال پسماندها برقرار ارزیابی شد.</w:t>
+        <w:t xml:space="preserve"> دوربین-واتسون در مدل میانجی ۱٫۸۶ و در مدل پیامد ۱٫۸۳ بود؛ هر دو به ۲ نزدیک‌اند و پیش‌فرض استقلال پسماندها برقرار ارزیابی شد.</w:t>
       </w:r>
     </w:p>
     <w:p>
@@ -3903,7 +4036,7 @@
                 <w:b w:val="0"/>
                 <w:sz w:val="22"/>
               </w:rPr>
-              <w:t>بیشینه 14.88؛ 1 مورد مرزی</w:t>
+              <w:t>بیشینه 15.11؛ 1 مورد مرزی</w:t>
             </w:r>
           </w:p>
         </w:tc>
@@ -3980,7 +4113,7 @@
                 <w:b w:val="0"/>
                 <w:sz w:val="22"/>
               </w:rPr>
-              <w:t>1.29 / 0.77</w:t>
+              <w:t>1.30 / 0.77</w:t>
             </w:r>
           </w:p>
         </w:tc>
@@ -4058,7 +4191,7 @@
                 <w:b w:val="0"/>
                 <w:sz w:val="22"/>
               </w:rPr>
-              <w:t>1.85 و 1.83</w:t>
+              <w:t>1.86 و 1.83</w:t>
             </w:r>
           </w:p>
         </w:tc>
@@ -4171,7 +4304,7 @@
           <w:szCs w:val="20"/>
           <w:lang w:val="en-US"/>
         </w:rPr>
-        <w:t xml:space="preserve">(N = 171)</w:t>
+        <w:t xml:space="preserve">(N = 170)</w:t>
       </w:r>
     </w:p>
     <w:tbl>
@@ -4461,7 +4594,7 @@
                 <w:b w:val="0"/>
                 <w:sz w:val="22"/>
               </w:rPr>
-              <w:t>0.28***</w:t>
+              <w:t>0.27***</w:t>
             </w:r>
           </w:p>
         </w:tc>
@@ -4577,7 +4710,7 @@
           <w:szCs w:val="22"/>
           <w:lang w:val="en-US"/>
         </w:rPr>
-        <w:t xml:space="preserve"> r = 0.28 </w:t>
+        <w:t xml:space="preserve"> r = 0.27 </w:t>
       </w:r>
       <w:r>
         <w:rPr>
@@ -5003,7 +5136,7 @@
           <w:rtl/>
           <w:lang w:bidi="fa-IR"/>
         </w:rPr>
-        <w:t xml:space="preserve">برابر ۱٫۸۲۶ بود </w:t>
+        <w:t xml:space="preserve">برابر ۱٫۸۳۲ بود </w:t>
       </w:r>
       <w:r>
         <w:rPr>
@@ -5041,7 +5174,7 @@
           <w:rtl/>
           <w:lang w:bidi="fa-IR"/>
         </w:rPr>
-        <w:t xml:space="preserve">برابر ۰٫۰۳۹ و معنادار بود </w:t>
+        <w:t xml:space="preserve">برابر ۰٫۰۲۵ و معنادار بود </w:t>
       </w:r>
       <w:r>
         <w:rPr>
@@ -5050,7 +5183,7 @@
           <w:szCs w:val="22"/>
           <w:lang w:val="en-US"/>
         </w:rPr>
-        <w:t xml:space="preserve">(p = 0.014)</w:t>
+        <w:t xml:space="preserve">(p = 0.011)</w:t>
       </w:r>
       <w:r>
         <w:rPr>
@@ -5069,7 +5202,7 @@
           <w:szCs w:val="22"/>
           <w:lang w:val="en-US"/>
         </w:rPr>
-        <w:t xml:space="preserve"> c = 0.202 </w:t>
+        <w:t xml:space="preserve"> c = 0.122 </w:t>
       </w:r>
       <w:r>
         <w:rPr>
@@ -5088,7 +5221,7 @@
           <w:szCs w:val="22"/>
           <w:lang w:val="en-US"/>
         </w:rPr>
-        <w:t xml:space="preserve"> c′ = 0.131 </w:t>
+        <w:t xml:space="preserve"> c′ = 0.077 </w:t>
       </w:r>
       <w:r>
         <w:rPr>
@@ -5126,7 +5259,7 @@
           <w:szCs w:val="22"/>
           <w:lang w:val="en-US"/>
         </w:rPr>
-        <w:t xml:space="preserve">(p = 0.032)</w:t>
+        <w:t xml:space="preserve">(p = 0.040)</w:t>
       </w:r>
       <w:r>
         <w:rPr>
@@ -5153,7 +5286,7 @@
           <w:rtl/>
           <w:lang w:bidi="fa-IR"/>
         </w:rPr>
-        <w:t xml:space="preserve">اثر غیرمستقیم ۰٫۰۷۱ برآورد شد و بازه اطمینان ۹۵٪ بوت‌استرپ آن </w:t>
+        <w:t xml:space="preserve">اثر غیرمستقیم ۰٫۰۴۵ برآورد شد و بازه اطمینان ۹۵٪ بوت‌استرپ آن </w:t>
       </w:r>
       <w:r>
         <w:rPr>
@@ -5162,7 +5295,7 @@
           <w:szCs w:val="22"/>
           <w:lang w:val="en-US"/>
         </w:rPr>
-        <w:t xml:space="preserve">[0.012, 0.142]</w:t>
+        <w:t xml:space="preserve">[0.008, 0.090]</w:t>
       </w:r>
       <w:r>
         <w:rPr>
@@ -5172,7 +5305,7 @@
           <w:rtl/>
           <w:lang w:bidi="fa-IR"/>
         </w:rPr>
-        <w:t xml:space="preserve"> بود؛ چون صفر در بازه نیست، مسیر طرحواره‌ای به‌عنوان میانجی تأیید می‌شود. حدود ۳۵٪ از اثر کل از مسیر غیرمستقیم عبور می‌کند و مابقی مستقیم است.</w:t>
+        <w:t xml:space="preserve"> بود؛ چون صفر در بازه نیست، مسیر طرحواره‌ای به‌عنوان میانجی تأیید می‌شود. حدود ۳۷٪ از اثر کل از مسیر غیرمستقیم عبور می‌کند و مابقی مستقیم است.</w:t>
       </w:r>
     </w:p>
     <w:p>
@@ -5387,7 +5520,7 @@
                 <w:b w:val="0"/>
                 <w:sz w:val="22"/>
               </w:rPr>
-              <w:t>1.826</w:t>
+              <w:t>1.832</w:t>
             </w:r>
           </w:p>
         </w:tc>
@@ -5405,7 +5538,7 @@
                 <w:b w:val="0"/>
                 <w:sz w:val="22"/>
               </w:rPr>
-              <w:t>0.259</w:t>
+              <w:t>0.260</w:t>
             </w:r>
           </w:p>
         </w:tc>
@@ -5459,7 +5592,7 @@
                 <w:b w:val="0"/>
                 <w:sz w:val="22"/>
               </w:rPr>
-              <w:t>[1.314, 2.338]</w:t>
+              <w:t>[1.319, 2.346]</w:t>
             </w:r>
           </w:p>
         </w:tc>
@@ -5498,7 +5631,7 @@
                 <w:b w:val="0"/>
                 <w:sz w:val="22"/>
               </w:rPr>
-              <w:t>0.039</w:t>
+              <w:t>0.025</w:t>
             </w:r>
           </w:p>
         </w:tc>
@@ -5516,7 +5649,7 @@
                 <w:b w:val="0"/>
                 <w:sz w:val="22"/>
               </w:rPr>
-              <w:t>0.016</w:t>
+              <w:t>0.010</w:t>
             </w:r>
           </w:p>
         </w:tc>
@@ -5534,7 +5667,7 @@
                 <w:b w:val="0"/>
                 <w:sz w:val="22"/>
               </w:rPr>
-              <w:t>2.48</w:t>
+              <w:t>2.56</w:t>
             </w:r>
           </w:p>
         </w:tc>
@@ -5552,7 +5685,7 @@
                 <w:b w:val="0"/>
                 <w:sz w:val="22"/>
               </w:rPr>
-              <w:t>p = 0.014</w:t>
+              <w:t>p = 0.011</w:t>
             </w:r>
           </w:p>
         </w:tc>
@@ -5570,7 +5703,7 @@
                 <w:b w:val="0"/>
                 <w:sz w:val="22"/>
               </w:rPr>
-              <w:t>[0.008, 0.070]</w:t>
+              <w:t>[0.006, 0.044]</w:t>
             </w:r>
           </w:p>
         </w:tc>
@@ -5609,7 +5742,7 @@
                 <w:b w:val="0"/>
                 <w:sz w:val="22"/>
               </w:rPr>
-              <w:t>0.131</w:t>
+              <w:t>0.077</w:t>
             </w:r>
           </w:p>
         </w:tc>
@@ -5627,7 +5760,7 @@
                 <w:b w:val="0"/>
                 <w:sz w:val="22"/>
               </w:rPr>
-              <w:t>0.061</w:t>
+              <w:t>0.037</w:t>
             </w:r>
           </w:p>
         </w:tc>
@@ -5645,7 +5778,7 @@
                 <w:b w:val="0"/>
                 <w:sz w:val="22"/>
               </w:rPr>
-              <w:t>2.16</w:t>
+              <w:t>2.07</w:t>
             </w:r>
           </w:p>
         </w:tc>
@@ -5663,7 +5796,7 @@
                 <w:b w:val="0"/>
                 <w:sz w:val="22"/>
               </w:rPr>
-              <w:t>p = 0.032</w:t>
+              <w:t>p = 0.040</w:t>
             </w:r>
           </w:p>
         </w:tc>
@@ -5673,7 +5806,6 @@
           </w:tcPr>
           <w:p>
             <w:pPr>
-              <w:bidi w:val="1"/>
               <w:jc w:val="center"/>
             </w:pPr>
             <w:r/>
@@ -5682,7 +5814,7 @@
                 <w:b w:val="0"/>
                 <w:sz w:val="22"/>
               </w:rPr>
-              <w:t>بوت‌استرپ [-0.004, 0.267]؛ تحلیلی [0.011, 0.250]</w:t>
+              <w:t>[0.004, 0.150]</w:t>
             </w:r>
           </w:p>
         </w:tc>
@@ -5721,7 +5853,7 @@
                 <w:b w:val="0"/>
                 <w:sz w:val="22"/>
               </w:rPr>
-              <w:t>0.202</w:t>
+              <w:t>0.122</w:t>
             </w:r>
           </w:p>
         </w:tc>
@@ -5739,7 +5871,7 @@
                 <w:b w:val="0"/>
                 <w:sz w:val="22"/>
               </w:rPr>
-              <w:t>0.054</w:t>
+              <w:t>0.033</w:t>
             </w:r>
           </w:p>
         </w:tc>
@@ -5757,7 +5889,7 @@
                 <w:b w:val="0"/>
                 <w:sz w:val="22"/>
               </w:rPr>
-              <w:t>3.74</w:t>
+              <w:t>3.69</w:t>
             </w:r>
           </w:p>
         </w:tc>
@@ -5793,7 +5925,7 @@
                 <w:b w:val="0"/>
                 <w:sz w:val="22"/>
               </w:rPr>
-              <w:t>[0.095, 0.309]</w:t>
+              <w:t>[0.057, 0.188]</w:t>
             </w:r>
           </w:p>
         </w:tc>
@@ -5832,7 +5964,7 @@
                 <w:b w:val="0"/>
                 <w:sz w:val="22"/>
               </w:rPr>
-              <w:t>0.071</w:t>
+              <w:t>0.045</w:t>
             </w:r>
           </w:p>
         </w:tc>
@@ -5904,7 +6036,7 @@
                 <w:b w:val="0"/>
                 <w:sz w:val="22"/>
               </w:rPr>
-              <w:t>[0.012, 0.142]</w:t>
+              <w:t>[0.008, 0.090]</w:t>
             </w:r>
           </w:p>
         </w:tc>
@@ -5993,6 +6125,25 @@
           <w:rtl/>
           <w:lang w:bidi="fa-IR"/>
         </w:rPr>
+        <w:t xml:space="preserve">و</w:t>
+      </w:r>
+      <w:r>
+        <w:rPr>
+          <w:rFonts w:ascii="Times New Roman" w:hAnsi="Times New Roman" w:cs="Times New Roman"/>
+          <w:sz w:val="22"/>
+          <w:szCs w:val="22"/>
+          <w:lang w:val="en-US"/>
+        </w:rPr>
+        <w:t xml:space="preserve"> c′ </w:t>
+      </w:r>
+      <w:r>
+        <w:rPr>
+          <w:rFonts w:ascii="B Nazanin" w:hAnsi="B Nazanin" w:cs="B Nazanin" w:hint="cs"/>
+          <w:sz w:val="24"/>
+          <w:szCs w:val="24"/>
+          <w:rtl/>
+          <w:lang w:bidi="fa-IR"/>
+        </w:rPr>
         <w:t xml:space="preserve">تحلیلی‌اند </w:t>
       </w:r>
       <w:r>
@@ -6012,45 +6163,7 @@
           <w:rtl/>
           <w:lang w:bidi="fa-IR"/>
         </w:rPr>
-        <w:t xml:space="preserve">؛ برای</w:t>
-      </w:r>
-      <w:r>
-        <w:rPr>
-          <w:rFonts w:ascii="Times New Roman" w:hAnsi="Times New Roman" w:cs="Times New Roman"/>
-          <w:sz w:val="22"/>
-          <w:szCs w:val="22"/>
-          <w:lang w:val="en-US"/>
-        </w:rPr>
-        <w:t xml:space="preserve"> c′ </w:t>
-      </w:r>
-      <w:r>
-        <w:rPr>
-          <w:rFonts w:ascii="B Nazanin" w:hAnsi="B Nazanin" w:cs="B Nazanin" w:hint="cs"/>
-          <w:sz w:val="24"/>
-          <w:szCs w:val="24"/>
-          <w:rtl/>
-          <w:lang w:bidi="fa-IR"/>
-        </w:rPr>
-        <w:t xml:space="preserve">هر دو بازه گزارش شده است: بازه تحلیلی</w:t>
-      </w:r>
-      <w:r>
-        <w:rPr>
-          <w:rFonts w:ascii="Times New Roman" w:hAnsi="Times New Roman" w:cs="Times New Roman"/>
-          <w:sz w:val="22"/>
-          <w:szCs w:val="22"/>
-          <w:lang w:val="en-US"/>
-        </w:rPr>
-        <w:t xml:space="preserve"> c′ </w:t>
-      </w:r>
-      <w:r>
-        <w:rPr>
-          <w:rFonts w:ascii="B Nazanin" w:hAnsi="B Nazanin" w:cs="B Nazanin" w:hint="cs"/>
-          <w:sz w:val="24"/>
-          <w:szCs w:val="24"/>
-          <w:rtl/>
-          <w:lang w:bidi="fa-IR"/>
-        </w:rPr>
-        <w:t xml:space="preserve">صفر را در بر ندارد اما بازه بوت‌استرپ آن صفر را در بر می‌گیرد (گزارش هر دو برای شفافیت)؛ بازه اثر غیرمستقیم، صدکی بوت‌استرپ است.</w:t>
+        <w:t xml:space="preserve">؛ بازه اثر غیرمستقیم، صدکی بوت‌استرپ است.</w:t>
       </w:r>
     </w:p>
     <w:p>
@@ -6086,7 +6199,7 @@
           <w:rtl/>
           <w:lang w:bidi="fa-IR"/>
         </w:rPr>
-        <w:t xml:space="preserve">میانجی‌گری از نوع جزئی تأیید می‌شود؛ اما چون کرانه پایینِ بازه اطمینان اثر غیرمستقیم (۰٫۰۱۲) به صفر نزدیک است، این تأیید باید محتاطانه خوانده شود: معناداری مسیر غیرمستقیم از نظر آماری برقرار است، ولی اندازه آن کوچک تا متوسط و حساس به بازنمونه‌گیری است و تکرار آن در نمونه مستقل ضرورت دارد.</w:t>
+        <w:t xml:space="preserve">میانجی‌گری از نوع جزئی تأیید می‌شود؛ اما چون کرانه پایینِ بازه اطمینان اثر غیرمستقیم (۰٫۰۰۸) به صفر نزدیک است، این تأیید باید محتاطانه خوانده شود: معناداری مسیر غیرمستقیم از نظر آماری برقرار است، ولی اندازه آن کوچک تا متوسط و حساس به بازنمونه‌گیری است و تکرار آن در نمونه مستقل ضرورت دارد.</w:t>
       </w:r>
     </w:p>
     <w:p>
@@ -6466,7 +6579,7 @@
                 <w:b w:val="0"/>
                 <w:sz w:val="22"/>
               </w:rPr>
-              <w:t>4.65</w:t>
+              <w:t>4.30</w:t>
             </w:r>
           </w:p>
         </w:tc>
@@ -6502,7 +6615,7 @@
                 <w:b w:val="0"/>
                 <w:sz w:val="22"/>
               </w:rPr>
-              <w:t>4.65</w:t>
+              <w:t>4.30</w:t>
             </w:r>
           </w:p>
         </w:tc>
@@ -6520,7 +6633,7 @@
                 <w:b w:val="0"/>
                 <w:sz w:val="22"/>
               </w:rPr>
-              <w:t>0.940</w:t>
+              <w:t>0.945</w:t>
             </w:r>
           </w:p>
         </w:tc>
@@ -6538,7 +6651,7 @@
                 <w:b w:val="0"/>
                 <w:sz w:val="22"/>
               </w:rPr>
-              <w:t>0.819</w:t>
+              <w:t>0.836</w:t>
             </w:r>
           </w:p>
         </w:tc>
@@ -6556,7 +6669,7 @@
                 <w:b w:val="0"/>
                 <w:sz w:val="22"/>
               </w:rPr>
-              <w:t>0.146</w:t>
+              <w:t>0.140</w:t>
             </w:r>
           </w:p>
         </w:tc>
@@ -6574,7 +6687,7 @@
                 <w:b w:val="0"/>
                 <w:sz w:val="22"/>
               </w:rPr>
-              <w:t>0.080</w:t>
+              <w:t>0.077</w:t>
             </w:r>
           </w:p>
         </w:tc>
@@ -6769,7 +6882,7 @@
           <w:szCs w:val="22"/>
           <w:lang w:val="en-US"/>
         </w:rPr>
-        <w:t xml:space="preserve">(CFI = 0.940, SRMR = 0.080)</w:t>
+        <w:t xml:space="preserve">(CFI = 0.945, SRMR = 0.077)</w:t>
       </w:r>
       <w:r>
         <w:rPr>
@@ -6788,7 +6901,7 @@
           <w:szCs w:val="22"/>
           <w:lang w:val="en-US"/>
         </w:rPr>
-        <w:t xml:space="preserve"> TLI = 0.819 </w:t>
+        <w:t xml:space="preserve"> TLI = 0.836 </w:t>
       </w:r>
       <w:r>
         <w:rPr>
@@ -6807,7 +6920,7 @@
           <w:szCs w:val="22"/>
           <w:lang w:val="en-US"/>
         </w:rPr>
-        <w:t xml:space="preserve"> RMSEA = 0.146 </w:t>
+        <w:t xml:space="preserve"> RMSEA = 0.140 </w:t>
       </w:r>
       <w:r>
         <w:rPr>
@@ -7157,7 +7270,7 @@
                 <w:b w:val="0"/>
                 <w:sz w:val="22"/>
               </w:rPr>
-              <w:t>r = 0.28</w:t>
+              <w:t>r = 0.27</w:t>
             </w:r>
           </w:p>
         </w:tc>
@@ -7385,7 +7498,7 @@
                 <w:b w:val="0"/>
                 <w:sz w:val="22"/>
               </w:rPr>
-              <w:t>a×b = 0.071</w:t>
+              <w:t>a×b = 0.045</w:t>
             </w:r>
           </w:p>
         </w:tc>
@@ -7403,7 +7516,7 @@
                 <w:b w:val="0"/>
                 <w:sz w:val="22"/>
               </w:rPr>
-              <w:t>CI [0.012, 0.142]</w:t>
+              <w:t>CI [0.008, 0.090]</w:t>
             </w:r>
           </w:p>
         </w:tc>
@@ -7423,7 +7536,7 @@
           <w:rtl/>
           <w:lang w:bidi="fa-IR"/>
         </w:rPr>
-        <w:t xml:space="preserve">الگوی کلی یافته‌ها: اضطراب صفتی با طرحواره‌های ناسازگار رابطه دارد و بخشی از رابطه اضطراب با رفتارهای پرخطر مالی از مسیر طرحواره‌ها عبور می‌کند. مسیری مستقیم و مستقل نیز باقی می‌ماند که احتمالاً بازتاب هیجان‌های موقعیتی و سبک‌های شخصیِ ریسک‌پذیری است. سهم حدود ۳۵٪ مسیر غیرمستقیم، مداخله طرحواره‌محور را توجیه می‌کند. با این حال، عدم صفرشدن</w:t>
+        <w:t xml:space="preserve">الگوی کلی یافته‌ها: اضطراب صفتی با طرحواره‌های ناسازگار رابطه دارد و بخشی از رابطه اضطراب با رفتارهای پرخطر مالی از مسیر طرحواره‌ها عبور می‌کند. مسیری مستقیم و مستقل نیز باقی می‌ماند که احتمالاً بازتاب هیجان‌های موقعیتی و سبک‌های شخصیِ ریسک‌پذیری است. سهم حدود ۳۷٪ مسیر غیرمستقیم، مداخله طرحواره‌محور را توجیه می‌کند. با این حال، عدم صفرشدن</w:t>
       </w:r>
       <w:r>
         <w:rPr>

</xml_diff>